<commit_message>
Revise PT-BR translation for natural São Paulo phrasing and flow
Co-Authored-By: Claude Opus 5.5 <noreply@anthropic.com>
Claude-Session: https://claude.ai/code/session_0174ZwgJ6hzgJCKLC6cWrHSh
</commit_message>
<xml_diff>
--- a/Os_Ultimos_Dias_de_Tudo_PT-BR.docx
+++ b/Os_Ultimos_Dias_de_Tudo_PT-BR.docx
@@ -97,7 +97,7 @@
         <w:ind w:firstLine="720"/>
       </w:pPr>
       <w:r>
-        <w:t xml:space="preserve">Doze anos de talk show noturno tinham ensinado Tom Maya a ler uma plateia nos últimos segundos antes de entrar no ar. Naquela noite, a leitura deu errado, e ele não saberia dizer por quê. A plateia se acomodou na deixa. A banda o chamou. Mas o homem que esperava na coxia não tinha guardado o celular, e em doze anos ninguém jamais havia pisado no palco de Tom ainda com um na mão.</w:t>
+        <w:t xml:space="preserve">Doze anos de talk show noturno tinham ensinado Tom Maya a ler uma plateia nos últimos segundos antes de entrar no ar. Naquela noite, a leitura deu errado, e ele não saberia dizer por quê. A plateia se acomodou na deixa. A banda tocou a vinheta de entrada. Mas o homem que esperava na coxia não tinha guardado o celular, e em doze anos ninguém jamais havia pisado no palco de Tom ainda com um na mão.</w:t>
       </w:r>
     </w:p>
     <w:p>
@@ -146,7 +146,7 @@
         <w:ind w:firstLine="720"/>
       </w:pPr>
       <w:r>
-        <w:t xml:space="preserve">— Porque ele já fez isso antes. — Richter cruzou as mãos no colo. — Em 1815. A maior erupção que temos registrada. Lançou enxofre suficiente na estratosfera para escurecer o planeta inteiro. O ano seguinte até hoje é chamado de Ano Sem Verão. Neve na Nova Inglaterra em junho. Colheitas perdidas no continente europeu inteiro. Quase dois graus a menos no mundo todo, por causa de uma montanha só.</w:t>
+        <w:t xml:space="preserve">— Porque ele já fez isso antes. — Richter cruzou as mãos no colo. — Em 1815. A maior erupção que temos registrada. Lançou enxofre suficiente na estratosfera para escurecer o planeta inteiro. O ano seguinte até hoje é chamado de Ano Sem Verão. Neve na Nova Inglaterra em junho. Colheitas perdidas em toda a Europa. Quase dois graus a menos no mundo todo, por causa de uma montanha só.</w:t>
       </w:r>
     </w:p>
     <w:p>
@@ -246,7 +246,7 @@
         <w:ind w:firstLine="720"/>
       </w:pPr>
       <w:r>
-        <w:t xml:space="preserve">— Tudo bem. Preciso te perguntar uma coisa, e sei como vai soar. — Ergueu os olhos. — Ontem à noite eu caí num buraco. Fóruns. Gente de clima espacial, preparacionistas. Alguns são claramente malucos. Outros, não. E tem uma discussão circulando que eu não consigo tirar da cabeça.</w:t>
+        <w:t xml:space="preserve">— Tudo bem. Preciso te perguntar uma coisa, e sei como vai soar. — Ergueu os olhos. — Ontem à noite eu me perdi na internet. Fóruns. Gente de clima espacial, sobrevivencialistas. Alguns são claramente malucos. Outros, não. E tem uma discussão circulando que eu não consigo tirar da cabeça.</w:t>
       </w:r>
     </w:p>
     <w:p>
@@ -286,7 +286,7 @@
         <w:ind w:firstLine="720"/>
       </w:pPr>
       <w:r>
-        <w:t xml:space="preserve">Uma risada de verdade, arrancada dele pela surpresa. A plateia a pegou e saiu correndo com ela, grata pela permissão. Alguém na terceira fileira chegou a aplaudir.</w:t>
+        <w:t xml:space="preserve">Uma risada de verdade, arrancada dele pela surpresa. A plateia se agarrou a ela, grata pela permissão. Alguém na terceira fileira chegou a aplaudir.</w:t>
       </w:r>
     </w:p>
     <w:p>
@@ -536,7 +536,7 @@
         <w:ind w:firstLine="720"/>
       </w:pPr>
       <w:r>
-        <w:t xml:space="preserve">— O impacto. — Richter revirou a palavra, como quem testa uma corda antes de pôr o próprio peso nela. — Sr. Maya. Impacto é palavra para coisas das quais a gente se recupera. Terremotos têm impacto. Guerras têm impacto. Isso não é isso. — Ele olhou para as mãos e depois ergueu os olhos. — Estaríamos vivendo os últimos dias.</w:t>
+        <w:t xml:space="preserve">— O impacto. — Richter revirou a palavra, como quem testa uma corda antes de pôr o próprio peso nela. — Sr. Maya. Impacto é palavra para coisas das quais a gente se recupera. Terremotos têm impacto. Guerras têm impacto. Isto é outra coisa. — Ele olhou para as mãos e depois ergueu os olhos. — Estaríamos vivendo os últimos dias.</w:t>
       </w:r>
     </w:p>
     <w:p>
@@ -642,7 +642,7 @@
         <w:ind w:firstLine="720"/>
       </w:pPr>
       <w:r>
-        <w:t xml:space="preserve">Uma das mãos no passador.</w:t>
+        <w:t xml:space="preserve">Uma das mãos no controle.</w:t>
       </w:r>
     </w:p>
     <w:p>
@@ -822,7 +822,7 @@
         <w:ind w:firstLine="720"/>
       </w:pPr>
       <w:r>
-        <w:t xml:space="preserve">A câmera recuou. A luz vermelha se apagou. Kate baixou o passador e sentiu a pequena meia-lua que a borda do aparelho tinha marcado na palma da mão. Atrás dela, o âncora já falava da venda de bolos.</w:t>
+        <w:t xml:space="preserve">A câmera recuou. A luz vermelha se apagou. Kate baixou o controle e sentiu a pequena meia-lua que a borda do aparelho tinha marcado na palma da mão. Atrás dela, o âncora já falava da venda de bolos.</w:t>
       </w:r>
     </w:p>
     <w:p>
@@ -885,7 +885,7 @@
         <w:ind w:firstLine="720"/>
       </w:pPr>
       <w:r>
-        <w:t xml:space="preserve">Perto do prédio da administração, diminuiu o passo. A bandeira no mastro se mexia, o que em si não tinha nada de estranho. Estranha era a direção. Àquela hora, o vento devia estar vindo do mar, de leste-sudeste, a brisa marítima chegando como sempre chegava. Ela não morava na Flórida havia muito tempo, mas isso ela sabia. Em vez disso, a bandeira apontava para oés-noroeste, rumo ao interior. Rumo a ela. Algo frio deslizou pela sua nuca, liso como uma lâmina saindo da bainha. Por trás. Por cima. Ela não se virou para conferir. Fechou o zíper do moletom e seguiu em frente. O prédio de Física esperava no canto nordeste do núcleo do campus: três andares de concreto armado e vidro simples, por volta de 1981.</w:t>
+        <w:t xml:space="preserve">Perto do prédio da administração, diminuiu o passo. A bandeira no mastro se mexia, o que em si não tinha nada de estranho. Estranha era a direção. Àquela hora, o vento devia estar vindo do mar, de leste-sudeste, a brisa marítima chegando como sempre chegava. Ela não morava na Flórida havia muito tempo, mas isso ela sabia. Em vez disso, a bandeira apontava para oeste-noroeste, rumo ao interior. Rumo a ela. Algo frio deslizou pela sua nuca, liso como uma lâmina saindo da bainha. Por trás. Por cima. Ela não se virou para conferir. Fechou o zíper do moletom e seguiu em frente. O prédio de Física esperava no canto nordeste do núcleo do campus: três andares de concreto armado e vidro simples, dos anos 1980.</w:t>
       </w:r>
     </w:p>
     <w:p>
@@ -935,7 +935,7 @@
         <w:ind w:firstLine="720"/>
       </w:pPr>
       <w:r>
-        <w:t xml:space="preserve">Não podia dizer a ninguém a hora exata de uma erupção, nem se o material atingiria a Terra. Sophie tinha desistido de tentar enxergar através do Sol. Passara a escutá-lo. O Sol mantinha uma oscilação acústica contínua: ondas de pressão que se propagavam pelo interior, carregando informação sobre tudo o que atravessavam, inclusive concentrações de campo magnético na face oculta. A heliossismologia era a disciplina que convertia esses dados de ondas em mapas do subsolo solar.</w:t>
+        <w:t xml:space="preserve">Não podia dizer a ninguém a hora exata de uma erupção, nem se o material atingiria a Terra. Sophie tinha desistido de tentar enxergar através do Sol. Passara a escutá-lo. O Sol mantinha uma oscilação acústica contínua: ondas de pressão que se propagavam pelo interior, carregando informação sobre tudo o que atravessavam, inclusive concentrações de campo magnético na face oculta. A heliossismologia era a disciplina que convertia esses dados de ondas em mapas do interior do Sol.</w:t>
       </w:r>
     </w:p>
     <w:p>
@@ -1325,7 +1325,7 @@
         <w:ind w:firstLine="720"/>
       </w:pPr>
       <w:r>
-        <w:t xml:space="preserve">O peito dela se apertou. Não porque as palavras ferissem, mas porque ela já as tinha ouvido antes, dele, dela mesma às três da manhã, e elas nunca chegavam de fato ao destino. Crença não era dado. Crença era aquilo a que se recorria quando os dados deixavam de bastar, e ela nunca se sentira à vontade recorrendo a isso.</w:t>
+        <w:t xml:space="preserve">O peito dela se apertou. Não porque as palavras ferissem, mas porque ela já as tinha ouvido antes, dele, dela mesma às três da manhã, e elas nunca surtiam efeito de verdade. Crença não era dado. Crença era aquilo a que se recorria quando os dados deixavam de bastar, e ela nunca se sentira à vontade recorrendo a isso.</w:t>
       </w:r>
     </w:p>
     <w:p>
@@ -1405,7 +1405,7 @@
         <w:ind w:firstLine="720"/>
       </w:pPr>
       <w:r>
-        <w:t xml:space="preserve">— O SOMA não serve só para bater com a NOAA depois do fato. Serve para tornar a análise solar subsuperficial mais barata, mais acessível, mais útil. Uma ferramenta capaz de ver o que acontece na face oculta do Sol, ou em regiões que mal conseguimos enxergar, sem os instrumentos mais caros do mundo. Se funcionar, pode dar um alerta mais antecipado de grandes erupções e ejeções de massa coronal.</w:t>
+        <w:t xml:space="preserve">— O SOMA não serve só para concordar com a NOAA depois que tudo já aconteceu. Serve para tornar a análise solar subsuperficial mais barata, mais acessível, mais útil. Uma ferramenta capaz de ver o que acontece na face oculta do Sol, ou em regiões que mal conseguimos enxergar, sem os instrumentos mais caros do mundo. Se funcionar, pode dar alertas com mais antecedência sobre grandes erupções e ejeções de massa coronal.</w:t>
       </w:r>
     </w:p>
     <w:p>
@@ -1535,7 +1535,7 @@
         <w:ind w:firstLine="720"/>
       </w:pPr>
       <w:r>
-        <w:t xml:space="preserve">O olhar de Sophie voltou para a tela. Regiões do limbo. Assinaturas acústicas. Instabilidade crescente. Confirmação óptica à medida que o Sol girasse. Se funcionasse, não mostraria só que o SOMA era preciso. Mostraria que ele tinha dentes.</w:t>
+        <w:t xml:space="preserve">O olhar de Sophie voltou para a tela. Regiões do limbo. Assinaturas acústicas. Instabilidade crescente. Confirmação óptica à medida que o Sol girasse. Se funcionasse, não mostraria só que o SOMA era preciso. Mostraria que ele tinha poder de fogo.</w:t>
       </w:r>
     </w:p>
     <w:p>
@@ -1595,17 +1595,17 @@
         <w:ind w:firstLine="720"/>
       </w:pPr>
       <w:r>
-        <w:t xml:space="preserve">Vance sumiu de volta na sala dele. A porta não chegou a fechar. Ficou uma fresta, como ele sempre deixava, como se fechar de vez fosse um compromisso que ele não estava disposto a assumir. Sophie se voltou para o teclado. Então parou. A mente dela já tinha começado a trabalhar no problema antes mesmo de as mãos pousarem nas teclas. E, com isso, veio a mesma velha discussão que vinha travando consigo mesma desde que tudo dera errado na sua vida: se ela era boa o bastante para aquilo, se o instrumento ia aguentar.</w:t>
-      </w:r>
-    </w:p>
-    <w:p>
-      <w:pPr>
-        <w:pStyle w:val="Normal"/>
-        <w:spacing w:line="240" w:lineRule="auto"/>
-        <w:ind w:firstLine="720"/>
-      </w:pPr>
-      <w:r>
-        <w:t xml:space="preserve">Nunca tinha chegado a uma conclusão. Balançou a cabeça. Seguiu em frente mesmo assim. Sempre seguia em frente mesmo assim. Abriu uma aba no navegador. Depois outra. Não eram feeds de dados. Era algo que fazia antes de o trabalho de verdade começar, do jeito que algumas pessoas checam a previsão do tempo. r/heliophysics. Doze mil membros, a maioria alunos de pós e cientistas de instrumentação, de vez em quando um pesquisador-chefe postando sob pseudônimo. Ela espreitava ali desde o primeiro ano da faculdade. Nunca tinha postado. Só lia. O tópico mais votado tinha a etiqueta Evento Tambora.</w:t>
+        <w:t xml:space="preserve">Vance voltou para a sala dele. A porta não chegou a fechar. Ficou uma fresta, como ele sempre deixava, como se fechar de vez fosse um compromisso que ele não estava disposto a assumir. Sophie se voltou para o teclado. Então parou. A mente dela já tinha começado a trabalhar no problema antes mesmo de as mãos pousarem nas teclas. E, com isso, veio a mesma velha discussão que vinha travando consigo mesma desde que tudo dera errado na sua vida: se ela era boa o bastante para aquilo, se o instrumento ia aguentar.</w:t>
+      </w:r>
+    </w:p>
+    <w:p>
+      <w:pPr>
+        <w:pStyle w:val="Normal"/>
+        <w:spacing w:line="240" w:lineRule="auto"/>
+        <w:ind w:firstLine="720"/>
+      </w:pPr>
+      <w:r>
+        <w:t xml:space="preserve">Nunca tinha chegado a uma conclusão. Balançou a cabeça. Seguiu em frente mesmo assim. Sempre seguia em frente mesmo assim. Abriu uma aba no navegador. Depois outra. Não eram feeds de dados. Era algo que fazia antes de o trabalho de verdade começar, do jeito que algumas pessoas checam a previsão do tempo. r/heliophysics. Doze mil membros, a maioria alunos de pós e cientistas de instrumentação, de vez em quando um pesquisador-chefe postando sob pseudônimo. Ela acompanhava o fórum desde o primeiro ano da faculdade. Nunca tinha postado. Só lia. O tópico mais votado tinha a etiqueta Evento Tambora.</w:t>
       </w:r>
     </w:p>
     <w:p>
@@ -1698,7 +1698,7 @@
         <w:ind w:firstLine="720"/>
       </w:pPr>
       <w:r>
-        <w:t xml:space="preserve">Ethan conhecia aquela cara. Via-a desde que Victoria tinha terminado com ele. Noah carregava a dor de cotovelo como carregava todo o resto: em silêncio, com teimosia, como um componente que não conseguia diagnosticar nem consertar direito.</w:t>
+        <w:t xml:space="preserve">Ethan conhecia aquela cara. Vinha vendo aquilo desde que Victoria terminara com ele. Noah carregava a dor de cotovelo como carregava todo o resto: em silêncio, com teimosia, como um componente que não conseguia diagnosticar nem consertar direito.</w:t>
       </w:r>
     </w:p>
     <w:p>
@@ -1828,7 +1828,7 @@
         <w:ind w:firstLine="720"/>
       </w:pPr>
       <w:r>
-        <w:t xml:space="preserve">— Assim. — Ethan fez um gesto na direção dele. — Esse número do engenheiro trágico. Já faz três semanas.</w:t>
+        <w:t xml:space="preserve">— Assim. — Ethan fez um gesto na direção dele. — Esse drama de engenheiro trágico. Já faz três semanas.</w:t>
       </w:r>
     </w:p>
     <w:p>
@@ -1988,7 +1988,7 @@
         <w:ind w:firstLine="720"/>
       </w:pPr>
       <w:r>
-        <w:t xml:space="preserve">Um mapa de satélite do Sudeste Asiático, aquela mancha vermelha e cinza-chumbo se espalhando e dominando todos os noticiários desde sábado. O som estava baixo, logo abaixo do burburinho das conversas. Um climatologista de Yale estava no meio de uma explicação, a voz calma, tranquilizadora.</w:t>
+        <w:t xml:space="preserve">Um mapa de satélite do Sudeste Asiático, aquela mancha vermelha e cinza-chumbo se espalhando e dominando todos os noticiários desde sábado. O som estava baixo, quase abafado pelo burburinho das conversas. Um climatologista de Yale estava no meio de uma explicação, a voz calma, tranquilizadora.</w:t>
       </w:r>
     </w:p>
     <w:p>
@@ -2248,17 +2248,17 @@
         <w:ind w:firstLine="720"/>
       </w:pPr>
       <w:r>
-        <w:t xml:space="preserve">— Bom, isso esclarece tudo. — Pegou o latte de novo. — Dá uma olhada nela mais tarde. Vê se ela comeu. Ela esquece quando está correndo contra um prazo.</w:t>
-      </w:r>
-    </w:p>
-    <w:p>
-      <w:pPr>
-        <w:pStyle w:val="Normal"/>
-        <w:spacing w:line="240" w:lineRule="auto"/>
-        <w:ind w:firstLine="720"/>
-      </w:pPr>
-      <w:r>
-        <w:t xml:space="preserve">— Eu sempre dou. — Ethan fez uma pausa. — Mas por que eu?</w:t>
+        <w:t xml:space="preserve">— Bom, isso esclarece tudo. — Pegou o latte de novo. — Passa lá mais tarde para ver como ela está. Vê se ela comeu. Ela esquece quando está correndo contra um prazo.</w:t>
+      </w:r>
+    </w:p>
+    <w:p>
+      <w:pPr>
+        <w:pStyle w:val="Normal"/>
+        <w:spacing w:line="240" w:lineRule="auto"/>
+        <w:ind w:firstLine="720"/>
+      </w:pPr>
+      <w:r>
+        <w:t xml:space="preserve">— Eu sempre passo. — Ethan fez uma pausa. — Mas por que eu?</w:t>
       </w:r>
     </w:p>
     <w:p>
@@ -2638,7 +2638,7 @@
         <w:ind w:firstLine="720"/>
       </w:pPr>
       <w:r>
-        <w:t xml:space="preserve">Uma rajada levantou a barra da camisa de Ethan. Noah finalmente escolheu uma direção e manteve as mangas abaixadas.</w:t>
+        <w:t xml:space="preserve">Uma rajada levantou a barra da camisa de Ethan. Noah enfim escolheu uma direção, as mangas bem abaixadas.</w:t>
       </w:r>
     </w:p>
     <w:p>
@@ -2841,7 +2841,7 @@
         <w:ind w:firstLine="720"/>
       </w:pPr>
       <w:r>
-        <w:t xml:space="preserve">— Quer um resgate?</w:t>
+        <w:t xml:space="preserve">— Quer um café novo?</w:t>
       </w:r>
     </w:p>
     <w:p>
@@ -3551,7 +3551,7 @@
         <w:ind w:firstLine="720"/>
       </w:pPr>
       <w:r>
-        <w:t xml:space="preserve">— Esse é o espírito otimista.</w:t>
+        <w:t xml:space="preserve">— Isso é que é otimismo.</w:t>
       </w:r>
     </w:p>
     <w:p>
@@ -3977,7 +3977,7 @@
         <w:ind w:firstLine="720"/>
       </w:pPr>
       <w:r>
-        <w:t xml:space="preserve">Os relatórios de radiossondagem das 12Z chegaram pouco depois das nove, e foi aí que o dia deixou de ser o tipo de dia que deveria ser. Kate já tinha as impressões na fila antes de a tinta secar: três estações, três balões lançados na escuridão antes do amanhecer, enquanto o resto do estado dormia. Cada um levava um pacotinho de instrumentos não maior que um maço de Marlboro, subindo pela atmosfera numa coluna de hélio e transmitindo de volta a palavra sagrada: temperatura, umidade, velocidade e direção do vento.</w:t>
+        <w:t xml:space="preserve">Os relatórios de radiossondagem das 12Z chegaram pouco depois das nove, e foi aí que o dia deixou de ser o tipo de dia que deveria ser. Kate mandou imprimir tudo assim que os dados chegaram: três estações, três balões lançados na escuridão antes do amanhecer, enquanto o resto do estado dormia. Cada um levava um pacotinho de instrumentos não maior que um maço de Marlboro, subindo pela atmosfera numa coluna de hélio e transmitindo de volta o que importava: temperatura, umidade, velocidade e direção do vento.</w:t>
       </w:r>
     </w:p>
     <w:p>
@@ -4007,7 +4007,7 @@
         <w:ind w:firstLine="720"/>
       </w:pPr>
       <w:r>
-        <w:t xml:space="preserve">E o vento estava errado. Não tinha mudado. Não estava variável. Estava errado. Soprando de uma direção que as rodadas noturnas dos modelos não tinham captado, o tipo de erro que dá início a um zumbido baixo e frio atrás do esterno e não para. Ela espalhou as três impressões sobre a mesa e as encarou como um médico encara um raio-X que não quer ler.</w:t>
+        <w:t xml:space="preserve">E o vento estava errado. Não tinha mudado. Não estava variável. Estava errado. Soprando de uma direção que as rodadas noturnas dos modelos não tinham captado, o tipo de erro que acende um zumbido frio no peito e não para mais. Ela espalhou as três impressões sobre a mesa e as encarou como um médico encara um raio-X que não quer ler.</w:t>
       </w:r>
     </w:p>
     <w:p>
@@ -4087,7 +4087,7 @@
         <w:ind w:firstLine="720"/>
       </w:pPr>
       <w:r>
-        <w:t xml:space="preserve">— Você é coerente.</w:t>
+        <w:t xml:space="preserve">— Você é previsível.</w:t>
       </w:r>
     </w:p>
     <w:p>
@@ -4167,7 +4167,7 @@
         <w:ind w:firstLine="720"/>
       </w:pPr>
       <w:r>
-        <w:t xml:space="preserve">Ele colocou uma carta ao lado da sondagem.</w:t>
+        <w:t xml:space="preserve">Ele pôs um mapa ao lado da sondagem.</w:t>
       </w:r>
     </w:p>
     <w:p>
@@ -4247,7 +4247,7 @@
         <w:ind w:firstLine="720"/>
       </w:pPr>
       <w:r>
-        <w:t xml:space="preserve">Ele olhou. Ela lhe deu tempo. Essa era a questão com Marcus: ele conseguia ficar em silêncio sem precisar preenchê-lo, sem se remexer, sem fazer aquele barulhinho nervoso no fundo da garganta que a maioria das pessoas faz quando o ar de uma sala fica pesado. A maioria das pessoas da idade dele não conseguia fazer isso. A maioria das pessoas de qualquer idade não conseguia. O silêncio assusta. As pessoas acham que alguma coisa vai sair dele.</w:t>
+        <w:t xml:space="preserve">Ele olhou. Ela lhe deu tempo. Essa era a qualidade de Marcus: ele conseguia ficar em silêncio sem precisar preenchê-lo, sem se remexer, sem fazer aquele barulhinho nervoso no fundo da garganta que a maioria das pessoas faz quando o ar de uma sala fica pesado. A maioria das pessoas da idade dele não conseguia fazer isso. A maioria das pessoas de qualquer idade não conseguia. O silêncio assusta. As pessoas acham que alguma coisa vai sair dele.</w:t>
       </w:r>
     </w:p>
     <w:p>
@@ -4397,7 +4397,7 @@
         <w:ind w:firstLine="720"/>
       </w:pPr>
       <w:r>
-        <w:t xml:space="preserve">Uma névoa pálida cobria o céu. A luz do sol que a atravessava tinha um tom amarelo baço, e um anel acobreado e tênue borrava as bordas do sol. Não subia tremulação nenhuma do asfalto do estacionamento.</w:t>
+        <w:t xml:space="preserve">Uma névoa pálida cobria o céu. A luz do sol que a atravessava tinha um tom amarelo baço, e um anel acobreado e tênue borrava as bordas do sol. Nenhum calor tremulava sobre o asfalto do estacionamento.</w:t>
       </w:r>
     </w:p>
     <w:p>
@@ -4427,7 +4427,7 @@
         <w:ind w:firstLine="720"/>
       </w:pPr>
       <w:r>
-        <w:t xml:space="preserve">A janela vibrou de leve. Do outro lado do vidro, as folhas mais altas das palmeiras continuavam puxando para uma direção, enquanto tudo perto do chão permanecia imóvel.</w:t>
+        <w:t xml:space="preserve">A janela vibrou de leve. Do outro lado do vidro, as folhas mais altas das palmeiras continuavam inclinadas numa só direção, enquanto tudo perto do chão permanecia imóvel.</w:t>
       </w:r>
     </w:p>
     <w:p>
@@ -4860,17 +4860,17 @@
         <w:ind w:firstLine="720"/>
       </w:pPr>
       <w:r>
-        <w:t xml:space="preserve">Nenhuma ressalva. Nenhum amortecimento. Um fato atrás do outro, estendidos na mesa.</w:t>
-      </w:r>
-    </w:p>
-    <w:p>
-      <w:pPr>
-        <w:pStyle w:val="Normal"/>
-        <w:spacing w:line="240" w:lineRule="auto"/>
-        <w:ind w:firstLine="720"/>
-      </w:pPr>
-      <w:r>
-        <w:t xml:space="preserve">— As pessoas ouvem “erupção” e pensam em lava — disse ele. — Aquela coisa vermelha descendo a encosta. Não imaginam a atmosfera mudando em cima da cabeça delas durante dois anos enquanto tentam plantar milho em Nebraska. — Uma pausa. O polegar dele desenhava um círculo lento no outro antebraço. Então, mais baixo, quase como quem pensa depois: — As pessoas que estão medindo isso precisam dos mesmos links de comunicação que todo mundo está perdendo.</w:t>
+        <w:t xml:space="preserve">Nenhuma ressalva. Nada de rodeios. Um fato atrás do outro, postos na mesa.</w:t>
+      </w:r>
+    </w:p>
+    <w:p>
+      <w:pPr>
+        <w:pStyle w:val="Normal"/>
+        <w:spacing w:line="240" w:lineRule="auto"/>
+        <w:ind w:firstLine="720"/>
+      </w:pPr>
+      <w:r>
+        <w:t xml:space="preserve">— As pessoas ouvem “erupção” e pensam em lava — disse ele. — Aquela coisa vermelha descendo a encosta. Não imaginam a atmosfera mudando em cima da cabeça delas durante dois anos enquanto tentam plantar milho em Nebraska. — Uma pausa. O polegar dele desenhava um círculo lento no outro antebraço. Então, mais baixo, quase como um adendo: — As pessoas que estão medindo isso precisam dos mesmos links de comunicação que todo mundo está perdendo.</w:t>
       </w:r>
     </w:p>
     <w:p>
@@ -5093,7 +5093,7 @@
         <w:ind w:firstLine="720"/>
       </w:pPr>
       <w:r>
-        <w:t xml:space="preserve">Tinha se apaixonado pelo Sol no primeiro ano de faculdade. Amor à primeira vista, ou perto o bastante para que a diferença não importasse. Enfiara-se entre as estantes da biblioteca e periódicos de física com as pontas das páginas dobradas, vivendo de café de máquina e quatro horas de sono, devorando tudo o que encontrava sobre dínamos magnéticos e arcos coronais.</w:t>
+        <w:t xml:space="preserve">Tinha se apaixonado pelo Sol no primeiro ano de faculdade. Amor à primeira vista, ou perto o bastante para que a diferença não importasse. Enfiara-se na biblioteca, entre estantes e revistas de física de páginas dobradas, vivendo de café de máquina e quatro horas de sono, devorando tudo o que encontrava sobre dínamos magnéticos e arcos coronais.</w:t>
       </w:r>
     </w:p>
     <w:p>
@@ -5243,7 +5243,7 @@
         <w:ind w:firstLine="720"/>
       </w:pPr>
       <w:r>
-        <w:t xml:space="preserve">Rodando num PC gamer usado de trezentos dólares embaixo da mesa dela, fazia em quatro horas o que os sistemas federais levavam dias para aproximar.</w:t>
+        <w:t xml:space="preserve">Rodando num PC gamer usado de trezentos dólares embaixo da mesa dela, fazia em quatro horas uma aproximação que os sistemas federais levavam dias para conseguir.</w:t>
       </w:r>
     </w:p>
     <w:p>
@@ -5276,7 +5276,7 @@
         <w:ind w:firstLine="720"/>
       </w:pPr>
       <w:r>
-        <w:t xml:space="preserve">Sophie piscou e voltou para a sala. Balançou a cadeira no sentido horário, anti-horário, e horário de novo.</w:t>
+        <w:t xml:space="preserve">Sophie piscou e voltou à realidade. Balançou a cadeira no sentido horário, anti-horário, e horário de novo.</w:t>
       </w:r>
     </w:p>
     <w:p>
@@ -5326,7 +5326,7 @@
         <w:ind w:firstLine="720"/>
       </w:pPr>
       <w:r>
-        <w:t xml:space="preserve">Em vez disso, abriu os descartes diários da NOAA: as leituras marginais anotadas por analistas cansados com observações cautelosas como </w:t>
+        <w:t xml:space="preserve">Em vez disso, abriu as sobras diárias da NOAA: as leituras marginais anotadas por analistas cansados com observações cautelosas como </w:t>
       </w:r>
       <w:r>
         <w:rPr>
@@ -5564,7 +5564,7 @@
         <w:ind w:firstLine="720"/>
       </w:pPr>
       <w:r>
-        <w:t xml:space="preserve">Sophie se aproximou, o cansaço sumido. O fluxo magnético carregava um tremor irregular, um espasmo persistente demais para ser ruído. Algo além do limbo leste estava puxando por ele.</w:t>
+        <w:t xml:space="preserve">Sophie se aproximou, o cansaço sumido. O fluxo magnético carregava um tremor irregular, um espasmo persistente demais para ser ruído. Algo além do limbo leste estava mexendo com ele.</w:t>
       </w:r>
     </w:p>
     <w:p>
@@ -5730,7 +5730,7 @@
         <w:ind w:firstLine="720"/>
       </w:pPr>
       <w:r>
-        <w:t xml:space="preserve">O dipolo fraco que a NOAA tinha descartado como um tremeluzir era só a borda esgarçada de algo muito maior. Atrás da curva, fora do alcance de todos os telescópios da Terra, um complexo ativo se estendia além dos limites da janela de teste do SOMA.</w:t>
+        <w:t xml:space="preserve">O dipolo fraco que a NOAA tinha descartado como um lampejo sem importância era só a borda esgarçada de algo muito maior. Atrás da curva, fora do alcance de todos os telescópios da Terra, um complexo ativo se estendia além dos limites da janela de teste do SOMA.</w:t>
       </w:r>
     </w:p>
     <w:p>
@@ -6041,27 +6041,27 @@
         <w:ind w:firstLine="720"/>
       </w:pPr>
       <w:r>
-        <w:t xml:space="preserve">Ethan Cole estava sentado na quinta fileira da sala Engineering 142, com o notebook aberto e a cabeça meia sala à frente da aula. Hartley percorria curvas de entropia no projetor — três semanas atrás do ponto em que Ethan já tinha chegado sozinho no livro-texto, devorando-o como uma criança devora um livro encontrado numa casa onde ninguém mais lê. Ele aparecia mesmo assim. Aparecia preparado, sempre. Harrison Cole passara anos dizendo que engenharia não era o caminho dele, que o lugar dele era na sala do conselho, aprendendo a comandar o que a família tinha construído. Ethan decidira outra coisa aos dezessete anos — não de uma vez, mas numa sequência de pequenas recusas que finalmente chegou a um ponto de virada. Preferia fracassar nos próprios termos a ter sucesso nos termos do pai. A prova que devia a si mesmo era mais difícil do que a que devia a Harrison.</w:t>
-      </w:r>
-    </w:p>
-    <w:p>
-      <w:pPr>
-        <w:pStyle w:val="Normal"/>
-        <w:spacing w:line="240" w:lineRule="auto"/>
-        <w:ind w:firstLine="720"/>
-      </w:pPr>
-      <w:r>
-        <w:t xml:space="preserve">Ele sabia disso. Só não gostava de pensar no assunto. Do que gostava de pensar era de termodinâmica. Transferência de calor. Decaimento de sistemas. A deriva constante do universo rumo à desordem, expressa em matemática limpa. Era um trabalho honesto, do tipo que não se importava com quem era o seu pai. Era também o tipo de raciocínio que costumava calar todo o resto. Mas, naquele dia, não estava funcionando. Um tom estranho, agudo e fino, pairava na borda da sua audição desde que se sentara — o mesmo que notara pela primeira vez ao atravessar o gramado central, do tipo que fica depois de um show, só que ele não tinha ido a show nenhum.</w:t>
-      </w:r>
-    </w:p>
-    <w:p>
-      <w:pPr>
-        <w:pStyle w:val="Normal"/>
-        <w:spacing w:line="240" w:lineRule="auto"/>
-        <w:ind w:firstLine="720"/>
-      </w:pPr>
-      <w:r>
-        <w:t xml:space="preserve">Engolira em seco, mexera o maxilar, esperara que passasse. Não tinha passado. Se alguma coisa, tinha se instalado mais fundo, ganhado um leve zumbido que parecia vibrar logo atrás do osso, e a pressão surda atrás dos olhos, que vinha crescendo desde a manhã, avançara mais meio centímetro crânio adentro. A névoa âmbar nas janelas do lado sul também não tinha se dissipado. Pelo contrário, tinha engrossado — e agora, por cima dela, formara-se um anel cor de cobre em volta do sol, justo e bem definido, como se alguém tivesse cravado uma moeda no céu.</w:t>
+        <w:t xml:space="preserve">Ethan Cole estava sentado na quinta fileira da sala Engineering 142, com o notebook aberto e a cabeça bem à frente da aula. Hartley percorria curvas de entropia no projetor — três semanas atrás do ponto em que Ethan já tinha chegado sozinho no livro-texto, devorando-o como uma criança devora um livro encontrado numa casa onde ninguém mais lê. Ele aparecia mesmo assim. Aparecia preparado, sempre. Harrison Cole passara anos dizendo que engenharia não era o caminho dele, que o lugar dele era na sala do conselho, aprendendo a comandar o que a família tinha construído. Ethan decidira outra coisa aos dezessete anos — não de uma vez, mas numa sequência de pequenas recusas que finalmente chegou a um ponto de virada. Preferia fracassar nos próprios termos a ter sucesso nos termos do pai. A prova que devia a si mesmo era mais difícil do que a que devia a Harrison.</w:t>
+      </w:r>
+    </w:p>
+    <w:p>
+      <w:pPr>
+        <w:pStyle w:val="Normal"/>
+        <w:spacing w:line="240" w:lineRule="auto"/>
+        <w:ind w:firstLine="720"/>
+      </w:pPr>
+      <w:r>
+        <w:t xml:space="preserve">Ele sabia disso. Só não gostava de pensar no assunto. Gostava mesmo era de pensar em termodinâmica. Transferência de calor. Decaimento de sistemas. A deriva constante do universo rumo à desordem, expressa em matemática limpa. Era um trabalho honesto, do tipo que não se importava com quem era o seu pai. Era também o tipo de raciocínio que costumava calar todo o resto. Mas, naquele dia, não estava funcionando. Um tom estranho, agudo e fino, pairava na borda da sua audição desde que se sentara — o mesmo que notara pela primeira vez ao atravessar o gramado central, do tipo que fica depois de um show, só que ele não tinha ido a show nenhum.</w:t>
+      </w:r>
+    </w:p>
+    <w:p>
+      <w:pPr>
+        <w:pStyle w:val="Normal"/>
+        <w:spacing w:line="240" w:lineRule="auto"/>
+        <w:ind w:firstLine="720"/>
+      </w:pPr>
+      <w:r>
+        <w:t xml:space="preserve">Engolira em seco, mexera o maxilar, esperara que passasse. Não tinha passado. Pelo contrário, tinha se instalado mais fundo, ganhado um leve zumbido que parecia vibrar logo atrás do osso, e a pressão surda atrás dos olhos, que vinha crescendo desde a manhã, avançara mais meio centímetro crânio adentro. A névoa âmbar nas janelas do lado sul também não tinha se dissipado. Na verdade, tinha engrossado — e agora, por cima dela, formara-se um anel cor de cobre em volta do sol, justo e bem definido, como se alguém tivesse cravado uma moeda no céu.</w:t>
       </w:r>
     </w:p>
     <w:p>
@@ -6231,7 +6231,7 @@
         <w:ind w:firstLine="720"/>
       </w:pPr>
       <w:r>
-        <w:t xml:space="preserve">Ethan abriu a cópia arquivada da caixa de entrada executiva de Harrison. Atas do conselho. Estratégias de redução de impostos fantasiadas de filantropia, como um porco enfeitado para a feira agropecuária. Um convite para golfe do comissário de zoneamento. Os destroços de sempre de um titã corporativo — nada interessante, tudo exatamente o que se esperava de um homem que passara trinta anos garantindo que nada surpreendente jamais aparecesse por escrito.</w:t>
+        <w:t xml:space="preserve">Ethan abriu a cópia arquivada da caixa de entrada executiva de Harrison. Atas do conselho. Estratégias de redução de impostos fantasiadas de filantropia, como um porco enfeitado para a feira agropecuária. Um convite para golfe do comissário de zoneamento. A papelada de sempre de um magnata — nada interessante, tudo exatamente o que se esperava de um homem que passara trinta anos garantindo que nada surpreendente jamais aparecesse por escrito.</w:t>
       </w:r>
     </w:p>
     <w:p>
@@ -6371,7 +6371,7 @@
         <w:ind w:firstLine="720"/>
       </w:pPr>
       <w:r>
-        <w:t xml:space="preserve">O portal contestou a conexão antes de mostrar uma tela de login. Ele reencaminhou a solicitação pelo arquivo da Cole Energy e tentou de novo, procurando um token de sessão em cache, um certificado esquecido, qualquer coisa que o servidor da empresa pudesse ter retido quando Harrison recebeu o aviso.</w:t>
+        <w:t xml:space="preserve">O portal barrou a conexão antes mesmo de mostrar uma tela de login. Ele reencaminhou a solicitação pelo arquivo da Cole Energy e tentou de novo, procurando um token de sessão em cache, um certificado esquecido, qualquer coisa que o servidor da empresa pudesse ter retido quando Harrison recebeu o aviso.</w:t>
       </w:r>
     </w:p>
     <w:p>
@@ -6648,17 +6648,17 @@
         <w:ind w:firstLine="720"/>
       </w:pPr>
       <w:r>
-        <w:t xml:space="preserve">Isso não era novidade. Reservar quase todo um lote disponível com um prazo medido em dias, sim. Ele ficou um momento com aquilo. A implicação queria tomar forma, e ele não deixava. Tinha passado quatro anos procurando alguma coisa contra o pai, e a disciplina era sempre a mesma: não se adiantar às evidências. As evidências diziam trezentas e quarenta unidades, dia dezoito, mitigação de GIC. As evidências não diziam por quê, e o espaço entre o que ele sabia e o que aquilo significava era o lugar onde gente inteligente se fazia de burra.</w:t>
-      </w:r>
-    </w:p>
-    <w:p>
-      <w:pPr>
-        <w:pStyle w:val="Normal"/>
-        <w:spacing w:line="240" w:lineRule="auto"/>
-        <w:ind w:firstLine="720"/>
-      </w:pPr>
-      <w:r>
-        <w:t xml:space="preserve">Algo o atravessou mesmo assim. Não exatamente empolgação. Uma prima dela. Um contato federal, compra emergencial, um rastro documental que ele ainda não conseguia explicar. O tipo de caso que não se resolvia em silêncio. Depois veio o pensamento mais frio, o que importava mais. O pai era o homem mais cuidadoso que ele já tinha conhecido. A discrição era o único traço que Ethan respeitava de verdade nele, mesmo odiando-o por todo o resto. E trezentos e quarenta transformadores não eram nada discretos.</w:t>
+        <w:t xml:space="preserve">Isso não era novidade. Reservar quase todo um lote disponível com um prazo medido em dias, sim. Ele ficou um tempo remoendo aquilo. A implicação queria tomar forma, e ele não deixava. Tinha passado quatro anos procurando alguma coisa contra o pai, e a disciplina era sempre a mesma: não se adiantar às evidências. As evidências diziam trezentas e quarenta unidades, dia dezoito, mitigação de GIC. As evidências não diziam por quê, e o espaço entre o que ele sabia e o que aquilo significava era o lugar onde gente inteligente fazia besteira.</w:t>
+      </w:r>
+    </w:p>
+    <w:p>
+      <w:pPr>
+        <w:pStyle w:val="Normal"/>
+        <w:spacing w:line="240" w:lineRule="auto"/>
+        <w:ind w:firstLine="720"/>
+      </w:pPr>
+      <w:r>
+        <w:t xml:space="preserve">Algo o atravessou mesmo assim. Não exatamente empolgação. Algo parecido. Um contato federal, compra emergencial, um rastro documental que ele ainda não conseguia explicar. O tipo de caso que não se resolvia em silêncio. Depois veio o pensamento mais frio, o que importava mais. O pai era o homem mais cuidadoso que ele já tinha conhecido. A discrição era o único traço que Ethan respeitava de verdade nele, mesmo odiando-o por todo o resto. E trezentos e quarenta transformadores não eram nada discretos.</w:t>
       </w:r>
     </w:p>
     <w:p>
@@ -6678,7 +6678,7 @@
         <w:ind w:firstLine="720"/>
       </w:pPr>
       <w:r>
-        <w:t xml:space="preserve">Ethan mal registrou nada daquilo. Jogou a mochila no ombro e foi para a porta. O tom no ouvido continuava lá, constante agora, baixo o bastante para ele ter deixado de esperar que fosse embora. As janelas do lado sul o pegaram na saída. A névoa âmbar não tinha se rompido. Tinha se adensado, aprofundado, e o anel de cobre em volta do sol continuava lá, como algo que pertencia a uma ilustração de livro didático, e não ao céu de verdade sobre Tampa.</w:t>
+        <w:t xml:space="preserve">Ethan mal registrou nada daquilo. Jogou a mochila no ombro e foi para a porta. O tom no ouvido continuava lá, constante agora, baixo o bastante para ele ter deixado de esperar que fosse embora. Na saída, passou pelas janelas do lado sul. A névoa âmbar não tinha se dissipado. Tinha se adensado, aprofundado, e o anel de cobre em volta do sol continuava lá, como algo que pertencia a uma ilustração de livro didático, e não ao céu de verdade sobre Tampa.</w:t>
       </w:r>
     </w:p>
     <w:p>
@@ -7070,7 +7070,7 @@
         <w:ind w:firstLine="720"/>
       </w:pPr>
       <w:r>
-        <w:t xml:space="preserve">— Depois do intervalo, o trânsito a cada dez minutos e, em seguida, uma atualização da defesa civil do condado. Fique com a gente.</w:t>
+        <w:t xml:space="preserve">— Depois do intervalo, as informações de trânsito e, em seguida, uma atualização da defesa civil do condado. Fique com a gente.</w:t>
       </w:r>
     </w:p>
     <w:p>
@@ -7093,17 +7093,17 @@
         <w:ind w:firstLine="720"/>
       </w:pPr>
       <w:r>
-        <w:t xml:space="preserve">A sala de controle não tinha janelas. Dave Marino nunca se importara com isso. Depois de onze anos monitorando a rede elétrica da baía de Tampa, confiava mais nas telas do que em qualquer vista lá fora: curvas de tensão, traçados de frequência, o pulso constante de uma cidade cuidando do seu dia. Ao meio-dia, aquele pulso estava estável. Um pequeno símbolo âmbar na borda do monitor, não.</w:t>
-      </w:r>
-    </w:p>
-    <w:p>
-      <w:pPr>
-        <w:pStyle w:val="Normal"/>
-        <w:spacing w:line="240" w:lineRule="auto"/>
-        <w:ind w:firstLine="720"/>
-      </w:pPr>
-      <w:r>
-        <w:t xml:space="preserve">Não era um alarme. Três estações meteorológicas ligadas ao modelo de interrupções da Cole Energy tinham registrado a mesma mudança para ventos de nordeste. As velocidades ainda eram moderadas, mas estavam subindo. Tempestades derrubavam linhas, e, se uma estivesse se formando, Dave queria saber antes que a rede começasse a lhe contar do jeito difícil.</w:t>
+        <w:t xml:space="preserve">A sala de controle não tinha janelas. Dave Marino nunca se importara com isso. Depois de onze anos monitorando a rede elétrica da baía de Tampa, confiava mais nas telas do que em qualquer vista lá fora: curvas de tensão, traçados de frequência, o pulso constante de uma cidade cuidando da própria vida. Ao meio-dia, aquele pulso estava estável. Um pequeno símbolo âmbar na borda do monitor, não.</w:t>
+      </w:r>
+    </w:p>
+    <w:p>
+      <w:pPr>
+        <w:pStyle w:val="Normal"/>
+        <w:spacing w:line="240" w:lineRule="auto"/>
+        <w:ind w:firstLine="720"/>
+      </w:pPr>
+      <w:r>
+        <w:t xml:space="preserve">Não era um alarme. Três estações meteorológicas ligadas ao modelo de interrupções da Cole Energy tinham registrado a mesma mudança para ventos de nordeste. As velocidades ainda eram moderadas, mas estavam subindo. Tempestades derrubavam linhas, e, se uma estivesse se formando, Dave queria saber antes que a rede o avisasse do pior jeito.</w:t>
       </w:r>
     </w:p>
     <w:p>
@@ -7323,7 +7323,7 @@
         <w:ind w:firstLine="720"/>
       </w:pPr>
       <w:r>
-        <w:t xml:space="preserve">Dave se virou do radar.</w:t>
+        <w:t xml:space="preserve">Dave desviou os olhos do radar.</w:t>
       </w:r>
     </w:p>
     <w:p>
@@ -7563,7 +7563,7 @@
         <w:ind w:firstLine="720"/>
       </w:pPr>
       <w:r>
-        <w:t xml:space="preserve">Os traçados de tensão começaram a se separar: uns afundando, outros disparando enquanto os controles automáticos tentavam compensar. Dave tirou de operação um banco que estava falhando. O símbolo dele mudou. Na tela seguinte, a carga subiu em equipamentos que já estavam trabalhando quentes. Ele levou a mão de volta ao teclado. O banco seguinte estava chegando ao limite.</w:t>
+        <w:t xml:space="preserve">Os traçados de tensão começaram a se separar: uns afundando, outros disparando enquanto os controles automáticos tentavam compensar. Dave tirou de operação um banco que estava falhando. O símbolo dele mudou. Na tela seguinte, a carga subiu em equipamentos que já trabalhavam superaquecidos. Ele levou a mão de volta ao teclado. O banco seguinte estava chegando ao limite.</w:t>
       </w:r>
     </w:p>
     <w:p>
@@ -7796,7 +7796,7 @@
         <w:ind w:firstLine="720"/>
       </w:pPr>
       <w:r>
-        <w:t xml:space="preserve">Eram dez e pouco depois do meio-dia, e a luz do dia estava escoando da sala. Os ouvidos de Ethan tinham estalado duas vezes no caminho. Ele mexeu o maxilar, mas o tom fino que o acompanhara durante a aula de Hartley continuava lá.</w:t>
+        <w:t xml:space="preserve">Passava um pouco do meio-dia, e a luz do dia estava escoando da sala. Os ouvidos de Ethan tinham estalado duas vezes no caminho. Ele mexeu o maxilar, mas o tom fino que o acompanhara durante a aula de Hartley continuava lá.</w:t>
       </w:r>
     </w:p>
     <w:p>
@@ -8276,7 +8276,7 @@
         <w:ind w:firstLine="720"/>
       </w:pPr>
       <w:r>
-        <w:t xml:space="preserve">— Não. Alguns podem ser deslocados agora. O resto não precisa. Uma vez que ele detém as opções, ninguém mais pode comprar.</w:t>
+        <w:t xml:space="preserve">— Não. Alguns podem ser deslocados agora. O resto não precisa. Com as opções na mão dele, ninguém mais pode comprar.</w:t>
       </w:r>
     </w:p>
     <w:p>
@@ -8306,7 +8306,7 @@
         <w:ind w:firstLine="720"/>
       </w:pPr>
       <w:r>
-        <w:t xml:space="preserve">— Pelo que você me contou do seu pai, isso ainda pode ser um golpe de compras — disse Noah. — Dinheiro federal passando por empresas de fachada.</w:t>
+        <w:t xml:space="preserve">— Pelo que você me contou do seu pai, isso ainda pode ser uma fraude de compras — disse Noah. — Dinheiro federal passando por empresas de fachada.</w:t>
       </w:r>
     </w:p>
     <w:p>
@@ -8466,7 +8466,7 @@
         <w:ind w:firstLine="720"/>
       </w:pPr>
       <w:r>
-        <w:t xml:space="preserve">A luz que entrava pelas janelas tinha ficado cinza-esverdeada, escurecendo rumo ao cor de ferro. As conversas aumentaram em volta deles à medida que as pessoas erguiam a voz acima da chuva. Em algum lugar perto da entrada, uma bandeja bateu no chão. Pela primeira vez, nenhum dos dois olhou.</w:t>
+        <w:t xml:space="preserve">A luz que entrava pelas janelas tinha ficado cinza-esverdeada, escurecendo até ficar cor de ferro. As conversas aumentaram em volta deles à medida que as pessoas erguiam a voz acima da chuva. Em algum lugar perto da entrada, uma bandeja bateu no chão. Pela primeira vez, nenhum dos dois olhou.</w:t>
       </w:r>
     </w:p>
     <w:p>
@@ -8806,7 +8806,7 @@
         <w:ind w:firstLine="720"/>
       </w:pPr>
       <w:r>
-        <w:t xml:space="preserve">— Isso nunca foi motivo para cancelar a noite de cinema. — Ele se recostou. — A gente só troca a atração. Em vez de zumbis, assistimos aos dados do SOMA na tela grande. Mesma vibe, sinceramente.</w:t>
+        <w:t xml:space="preserve">— Isso nunca foi motivo para cancelar a noite de cinema. — Ele se recostou. — A gente só troca a atração. Em vez de zumbis, assistimos aos dados do SOMA na tela grande. Dá na mesma, sinceramente.</w:t>
       </w:r>
     </w:p>
     <w:p>
@@ -9016,7 +9016,7 @@
         <w:ind w:firstLine="720"/>
       </w:pPr>
       <w:r>
-        <w:t xml:space="preserve">Algumas luzes de emergência finalmente acenderam, tingindo de vermelho uma das pontas do corredor. A outra ponta continuou escura. Os estudantes iluminavam o chão com os celulares. Alguns erguiam o alerta que tinha soado minutos antes, esperando que o resto carregasse. Alguém falou em tornado. Outra pessoa disse que um transformador tinha explodido. Ninguém deu uma razão.</w:t>
+        <w:t xml:space="preserve">Algumas luzes de emergência finalmente acenderam, tingindo de vermelho uma das pontas do corredor. A outra ponta continuou escura. Os estudantes iluminavam o chão com os celulares. Alguns olhavam o alerta que tinha soado minutos antes, esperando que o resto carregasse. Alguém falou em tornado. Outra pessoa disse que um transformador tinha explodido. Ninguém sabia dizer por quê.</w:t>
       </w:r>
     </w:p>
     <w:p>
@@ -9036,7 +9036,7 @@
         <w:ind w:firstLine="720"/>
       </w:pPr>
       <w:r>
-        <w:t xml:space="preserve">A porta dava trancos contra a mola. Um funcionário da manutenção agarrou a maçaneta, mas a rajada seguinte a forçou alguns centímetros para fora. Chuva gelada e areia entraram pela fresta. Noah encostou o ombro ao lado do ombro do funcionário, e juntos a arrastaram de volta. Ele a segurou enquanto o homem prendia o trinco.</w:t>
+        <w:t xml:space="preserve">A porta dava trancos contra a mola. Um funcionário da manutenção agarrou a maçaneta, mas a rajada seguinte a forçou alguns centímetros para fora. Chuva gelada e areia entraram pela fresta. Noah apoiou o ombro na porta, ao lado do funcionário, e juntos a empurraram de volta. Ele a segurou enquanto o homem prendia o trinco.</w:t>
       </w:r>
     </w:p>
     <w:p>
@@ -9389,7 +9389,7 @@
         <w:ind w:firstLine="720"/>
       </w:pPr>
       <w:r>
-        <w:t xml:space="preserve">— Não sei se fazem parte da tempestade. E não vou dizer que fazem no ar.</w:t>
+        <w:t xml:space="preserve">— Não sei se fazem parte da tempestade. E não vou dizer no ar que fazem.</w:t>
       </w:r>
     </w:p>
     <w:p>
@@ -9852,7 +9852,7 @@
         <w:ind w:firstLine="720"/>
       </w:pPr>
       <w:r>
-        <w:t xml:space="preserve">Duzentos estudantes no Marshall Student Center, esperando passar. Não paravam de se entreolhar, tentando parecer que não estavam abalados, a chuva horizontal ainda se repetindo atrás dos olhos — aquele céu cor de ferro refletido em cada superfície molhada lá fora. Fazia quase uma hora e meia. Ethan olhou para Sophie. Sophie olhou de volta. Nenhum dos dois quebrou o olhar. Noah quebrou. Estava tirando a areia da camisa — uma poeira fina que o vento tinha cravado no algodão amarrotado e deixado ali como se pertencesse ao tecido.</w:t>
+        <w:t xml:space="preserve">Duzentos estudantes no Marshall Student Center, esperando a tempestade passar. Não paravam de se entreolhar, tentando parecer que não estavam abalados, a chuva horizontal ainda se repetindo atrás dos olhos — aquele céu cor de ferro refletido em cada superfície molhada lá fora. Fazia quase uma hora e meia. Ethan olhou para Sophie. Sophie olhou de volta. Nenhum dos dois rompeu o silêncio. Noah rompeu. Estava tirando a areia da camisa — uma poeira fina que o vento tinha cravado no algodão amarrotado e deixado ali como se pertencesse ao tecido.</w:t>
       </w:r>
     </w:p>
     <w:p>
@@ -9892,7 +9892,7 @@
         <w:ind w:firstLine="720"/>
       </w:pPr>
       <w:r>
-        <w:t xml:space="preserve">Ele se referia aos três, e Sophie sabia. Ela passava noites suficientes dormindo no sofá deles, assaltando a geladeira deles, deixando os sapatos na porta deles para que o convite nem precisasse ser dito. O apartamento de Ethan e Noah no Holly B tinha começado a parecer mais a casa dela do que o próprio quartinho no Beta Hall. E isso normalmente a fazia se sentir sortuda. Mas… ela simplesmente não podia perder nem um minuto se quisesse deixar o trabalho pronto para o professor Santiago.</w:t>
+        <w:t xml:space="preserve">Ele se referia aos três, e Sophie sabia. Ela passava noites suficientes dormindo no sofá deles, assaltando a geladeira deles, deixando os sapatos na porta deles para que o convite nem precisasse ser dito. O apartamento de Ethan e Noah no Holly B tinha começado a parecer mais a casa dela do que o próprio quartinho no Beta Hall. E isso normalmente a fazia se sentir com sorte. Mas… ela simplesmente não podia perder nem um minuto se quisesse deixar o trabalho pronto para o professor Santiago.</w:t>
       </w:r>
     </w:p>
     <w:p>
@@ -10062,17 +10062,17 @@
         <w:ind w:firstLine="720"/>
       </w:pPr>
       <w:r>
-        <w:t xml:space="preserve">Não era uma pergunta. Ele olhava para cima. Por toda parte, estudantes saíam em massa dos outros prédios — a biblioteca, os auditórios, a livraria. Alguns riam alto demais. Alguns choravam em celulares que não lhes devolviam nada. Uma garota de blusa sem mangas se abraçou com os dois braços e perguntou ao ar por que estava frio. Vapor subia do asfalto e o vento o cortava, subia e era cortado de novo, o campus inteiro encharcado tentando expirar e falhando toda vez que tentava.</w:t>
-      </w:r>
-    </w:p>
-    <w:p>
-      <w:pPr>
-        <w:pStyle w:val="Normal"/>
-        <w:spacing w:line="240" w:lineRule="auto"/>
-        <w:ind w:firstLine="720"/>
-      </w:pPr>
-      <w:r>
-        <w:t xml:space="preserve">O apagão continuava. Metade dos prédios pelos quais passavam tinha janelas escuras — não o escuro de cortinas fechadas, mas o escuro específico de interruptor morto de um prédio sem energia no que deveria ter sido uma tarde clara. Uma viatura da polícia do campus estava parada torta junto ao meio-fio, com a porta aberta e a chuva ainda tamborilando no teto. O rádio do painel estava alto demais, e a voz de um despachante chegava em pedaços, mastigada pela estática, mas humana o bastante para ser entendida.</w:t>
+        <w:t xml:space="preserve">Não era uma pergunta. Ele olhava para cima. Por toda parte, estudantes saíam em massa dos outros prédios — a biblioteca, os auditórios, a livraria. Alguns riam alto demais. Alguns choravam em celulares que não lhes devolviam nada. Uma garota de blusa sem mangas se abraçou com os dois braços e perguntou ao ar por que estava frio. Vapor subia do asfalto e o vento o cortava, subia e era cortado de novo, o campus inteiro encharcado tentando soltar o ar e falhando a cada tentativa.</w:t>
+      </w:r>
+    </w:p>
+    <w:p>
+      <w:pPr>
+        <w:pStyle w:val="Normal"/>
+        <w:spacing w:line="240" w:lineRule="auto"/>
+        <w:ind w:firstLine="720"/>
+      </w:pPr>
+      <w:r>
+        <w:t xml:space="preserve">O apagão continuava. Metade dos prédios pelos quais passavam tinha janelas escuras — não o escuro de cortinas fechadas, mas o escuro inconfundível de um prédio sem energia no que deveria ter sido uma tarde clara. Uma viatura da polícia do campus estava parada torta junto ao meio-fio, com a porta aberta e a chuva ainda tamborilando no teto. O rádio do painel estava alto demais, e a voz de um operador da central chegava em pedaços, mastigada pela estática, mas humana o bastante para ser entendida.</w:t>
       </w:r>
     </w:p>
     <w:p>
@@ -10122,7 +10122,7 @@
         <w:ind w:firstLine="720"/>
       </w:pPr>
       <w:r>
-        <w:t xml:space="preserve">Os pais dele estavam na Carolina do Norte. Ele olhou o relógio. Os dois deviam estar trabalhando àquela hora — o pai numa obra, a mãe de pé o dia inteiro, com aquele joelho que ela se recusava a mostrar ao médico. Estava com o celular fora do bolso antes de decidir tirá-lo. Sem sinal. Tentou mesmo assim. A tela de chamada girou e desistiu. Ele franziu a testa, tentou de novo, recebeu o mesmo nada redondo e guardou o aparelho no bolso devagar, com cuidado, como um homem que não confiava em si mesmo para não arremessá-lo.</w:t>
+        <w:t xml:space="preserve">Os pais dele estavam na Carolina do Norte. Ele olhou o relógio. Os dois deviam estar trabalhando àquela hora — o pai numa obra, a mãe de pé o dia inteiro, com aquele joelho que ela se recusava a mostrar ao médico. Estava com o celular fora do bolso antes de decidir tirá-lo. Sem sinal. Tentou mesmo assim. A tela de chamada girou e desistiu. Ele franziu a testa, tentou de novo, recebeu o mesmo nada absoluto e guardou o aparelho no bolso devagar, com cuidado, como um homem que não confiava em si mesmo para não arremessá-lo.</w:t>
       </w:r>
     </w:p>
     <w:p>
@@ -10152,7 +10152,7 @@
         <w:ind w:firstLine="720"/>
       </w:pPr>
       <w:r>
-        <w:t xml:space="preserve">O sol — o que quer que estivesse passando por aquele filtro âmbar-acobreado lá em cima — não projetava nenhuma sombra que parecesse certa. Eram quase duas da tarde, e a luz parecia a de cinco horas numa noite de outubro. Tudo errado. Seguiram em frente por um tempo, os três andando perto o bastante para dividir o calor que tinham, rumo ao prédio de física. Então as mensagens começaram a chegar. Um estouro perto da fonte, outro atrás deles.</w:t>
+        <w:t xml:space="preserve">O sol — o que quer que estivesse passando por aquele filtro âmbar-acobreado lá em cima — não projetava nenhuma sombra que parecesse certa. Eram quase duas da tarde, e a luz parecia a das cinco numa tarde de outubro. Tudo errado. Seguiram em frente por um tempo, os três andando perto o bastante para dividir o calor que tinham, rumo ao prédio de física. Então as mensagens começaram a chegar. Um estouro perto da fonte, outro atrás deles.</w:t>
       </w:r>
     </w:p>
     <w:p>
@@ -10192,7 +10192,7 @@
         <w:ind w:firstLine="720"/>
       </w:pPr>
       <w:r>
-        <w:t xml:space="preserve">Uma garota perto da fonte caiu no choro no instante em que a tela acendeu. Dois caras com camisetas de fraternidade começaram a falar um por cima do outro tão depressa que nenhum dos dois dizia nada. Alguém riu, e a risada tinha uma rachadura atravessando-a — a risada de quem estivera mais perto de algo do que imaginava e só agora tinha se virado e visto quão perto. Os três pararam e pegaram os próprios celulares.</w:t>
+        <w:t xml:space="preserve">Uma garota perto da fonte caiu no choro no instante em que a tela acendeu. Dois caras com camisetas de fraternidade começaram a falar um por cima do outro tão depressa que nenhum dos dois dizia nada. Alguém riu, e havia uma rachadura naquela risada — a risada de quem estivera mais perto de algo do que imaginava e só agora tinha se virado e visto quão perto. Os três pararam e pegaram os próprios celulares.</w:t>
       </w:r>
     </w:p>
     <w:p>
@@ -10282,7 +10282,7 @@
         <w:ind w:firstLine="720"/>
       </w:pPr>
       <w:r>
-        <w:t xml:space="preserve">Estática, e depois a voz do pai, afinada pelos quilômetros e pela linha ruim:</w:t>
+        <w:t xml:space="preserve">Estática, e depois a voz do pai, enfraquecida pela distância e pela linha ruim:</w:t>
       </w:r>
     </w:p>
     <w:p>
@@ -10352,7 +10352,7 @@
         <w:ind w:firstLine="720"/>
       </w:pPr>
       <w:r>
-        <w:t xml:space="preserve">— A tempestade passou feia — disse o pai. — Levou um pedaço da cerca. Um galho grande caiu atravessado na entrada da garagem. O portão da garagem emperrou. Sua mãe está uma fera por causa do revestimento da casa. — Algo que era uma tosse ou talvez uma risada. — Então ela está sendo ela mesma.</w:t>
+        <w:t xml:space="preserve">— A tempestade passou feia — disse o pai. — Levou um pedaço da cerca. Um galho grande caiu atravessado na entrada da garagem. O portão da garagem emperrou. Sua mãe está uma fera por causa do revestimento da casa. — Algo que era uma tosse ou talvez uma risada. — Ou seja, ela está do jeito de sempre.</w:t>
       </w:r>
     </w:p>
     <w:p>
@@ -10392,7 +10392,7 @@
         <w:ind w:firstLine="720"/>
       </w:pPr>
       <w:r>
-        <w:t xml:space="preserve">Cerca. Galho. Garagem. Revestimento. Todo o vocabulário doméstico do estrago — as palavrinhas baratas que representavam serviços caros, uma lista que ficaria seis meses no fundo da cabeça de um trabalhador rendendo juros em preocupação.</w:t>
+        <w:t xml:space="preserve">Cerca. Galho. Garagem. Revestimento. Todo o vocabulário doméstico do estrago — as palavrinhas baratas que representavam serviços caros, uma lista que ficaria seis meses no fundo da cabeça de um trabalhador, acumulando juros de preocupação.</w:t>
       </w:r>
     </w:p>
     <w:p>
@@ -10432,7 +10432,7 @@
         <w:ind w:firstLine="720"/>
       </w:pPr>
       <w:r>
-        <w:t xml:space="preserve">— Então eu levanto do jeito burro.</w:t>
+        <w:t xml:space="preserve">— Então eu levanto do jeito errado mesmo.</w:t>
       </w:r>
     </w:p>
     <w:p>
@@ -10452,7 +10452,7 @@
         <w:ind w:firstLine="720"/>
       </w:pPr>
       <w:r>
-        <w:t xml:space="preserve">— Filho. — A voz do pai ficou baixa. — Me escuta. A gente está bem. Vai garantir que você esteja. Liga para a sua mãe daqui a pouco. Ela vai querer ouvir sua voz e depois te passar dez coisas para se preocupar sobre as quais você não pode fazer absolutamente nada daí.</w:t>
+        <w:t xml:space="preserve">— Filho. — A voz do pai ficou baixa. — Me escuta. A gente está bem. Agora cuida de você. Liga para a sua mãe daqui a pouco. Ela vai querer ouvir sua voz e depois te passar dez coisas para se preocupar sobre as quais você não pode fazer absolutamente nada daí.</w:t>
       </w:r>
     </w:p>
     <w:p>
@@ -10502,17 +10502,17 @@
         <w:ind w:firstLine="720"/>
       </w:pPr>
       <w:r>
-        <w:t xml:space="preserve">A linha caiu. Noah segurou o celular no ouvido um segundo a mais do que havia alguém do outro lado. Depois o baixou. Devagar. O rosto dele tinha ficado imóvel, daquele jeito que significava que o que havia por baixo tinha dentes. Ethan estava a poucos passos, com o próprio celular de volta no bolso, olhando a multidão se mover ao redor sem enxergá-la de fato. Tinha lido a mensagem do pai. Não tinha respondido.</w:t>
-      </w:r>
-    </w:p>
-    <w:p>
-      <w:pPr>
-        <w:pStyle w:val="Normal"/>
-        <w:spacing w:line="240" w:lineRule="auto"/>
-        <w:ind w:firstLine="720"/>
-      </w:pPr>
-      <w:r>
-        <w:t xml:space="preserve">Não sabia o que dizer a um homem que mandava quatro mensagens em quatro minutos e depois mais nada, como se o silêncio depois da quarta fosse em si uma espécie de resposta. Então fez o que sempre fazia quando não sabia o que fazer: guardou aquilo e decidiu lidar com o assunto depois. Sendo que “depois” era um lugar que se mudava toda vez que ele chegava perto.</w:t>
+        <w:t xml:space="preserve">A linha caiu. Noah segurou o celular no ouvido um segundo a mais do que havia alguém do outro lado. Depois o baixou. Devagar. O rosto dele tinha ficado imóvel, daquele jeito que significava que havia algo perigoso por baixo. Ethan estava a poucos passos, com o próprio celular de volta no bolso, olhando a multidão se mover ao redor sem enxergá-la de fato. Tinha lido a mensagem do pai. Não tinha respondido.</w:t>
+      </w:r>
+    </w:p>
+    <w:p>
+      <w:pPr>
+        <w:pStyle w:val="Normal"/>
+        <w:spacing w:line="240" w:lineRule="auto"/>
+        <w:ind w:firstLine="720"/>
+      </w:pPr>
+      <w:r>
+        <w:t xml:space="preserve">Não sabia o que dizer a um homem que mandava quatro mensagens em quatro minutos e depois mais nada, como se o silêncio depois da quarta fosse em si uma espécie de resposta. Então fez o que sempre fazia quando não sabia o que fazer: guardou aquilo e decidiu lidar com o assunto depois. Só que “depois” era um lugar que mudava de endereço toda vez que ele chegava perto.</w:t>
       </w:r>
     </w:p>
     <w:p>
@@ -10592,7 +10592,7 @@
         <w:ind w:firstLine="720"/>
       </w:pPr>
       <w:r>
-        <w:t xml:space="preserve">Como se tivesse sentido os dois olhando, Sophie se virou e lhes fez um sinal, claro como um outdoor: prédio de física, estava indo para lá. Depois apertou o passo. O corpo de Ethan deu um tranco, como se quisesse sair correndo, e o braço de Noah se atravessou na frente dele.</w:t>
+        <w:t xml:space="preserve">Como se tivesse sentido os dois olhando, Sophie se virou e lhes fez um sinal, claro como um outdoor: prédio de física, estava indo para lá. Depois apertou o passo. O corpo de Ethan deu um tranco, como se quisesse sair correndo, e o braço de Noah o barrou.</w:t>
       </w:r>
     </w:p>
     <w:p>
@@ -10655,7 +10655,7 @@
         <w:ind w:firstLine="720"/>
       </w:pPr>
       <w:r>
-        <w:t xml:space="preserve">340 MIL CLIENTES FICAM SEM ENERGIA COM TEMPESTADE E FALHAS NA REDE SIMULTÂNEAS</w:t>
+        <w:t xml:space="preserve">TEMPESTADE E FALHAS NA REDE DEIXAM 340 MIL CLIENTES SEM ENERGIA</w:t>
       </w:r>
     </w:p>
     <w:p>
@@ -10705,7 +10705,7 @@
         <w:ind w:firstLine="720"/>
       </w:pPr>
       <w:r>
-        <w:t xml:space="preserve">Relatos de perturbações elétricas fora da Flórida continuam sob análise. A empresa se recusou a divulgar seus registros detalhados do evento, alegando uma investigação em andamento. Os hospitais estão economizando combustível dos geradores. As autoridades do condado pedem aos moradores que mantenham as vias livres para veículos de emergência e usem mensagens de texto quando as ligações não completarem. Informações locais sobre abrigos e interdições de vias serão transmitidas pelas rádios participantes enquanto os serviços on-line continuarem instáveis. Esta matéria será atualizada à medida que os números de interrupções e as estimativas de restabelecimento forem confirmados.</w:t>
+        <w:t xml:space="preserve">Relatos de perturbações elétricas fora da Flórida continuam sob análise. A empresa se recusou a divulgar seus registros detalhados do evento, alegando uma investigação em andamento. Os hospitais estão economizando combustível dos geradores. As autoridades do condado pedem aos moradores que mantenham as vias livres para veículos de emergência e usem mensagens de texto quando as ligações não completarem. Informações locais sobre abrigos e interdições de vias serão transmitidas pelas rádios parceiras enquanto os serviços on-line continuarem instáveis. Esta matéria será atualizada à medida que os números de interrupções e as estimativas de restabelecimento forem confirmados.</w:t>
       </w:r>
     </w:p>
     <w:p>
@@ -10768,7 +10768,7 @@
         <w:ind w:firstLine="720"/>
       </w:pPr>
       <w:r>
-        <w:t xml:space="preserve">Deu a volta até as portas principais, já sabendo, já sentindo o peso assentar no estômago. Trancadas. Ela baixou a cabeça. Xingar uma porta não ia abri-la. Jonas apareceu na esquina com a bolsa do laboratório de óptica escorregando de um ombro, a alça cortando a palma da mão. Tremia de camiseta, os braços em volta do corpo, com o olhar vazio e oco de um homem cujo dia tinha dado errado vezes demais antes do meio-dia.</w:t>
+        <w:t xml:space="preserve">Deu a volta até as portas principais, já sabendo, já sentindo o peso assentar no estômago. Trancadas. Ela baixou a cabeça. Xingar uma porta não ia abri-la. Jonas apareceu na esquina com a bolsa do laboratório de óptica escorregando de um ombro, a alça cortando a palma da mão. Tremia só de camiseta, os braços em volta do corpo, com o olhar vazio e oco de um homem cujo dia tinha dado errado vezes demais antes do meio-dia.</w:t>
       </w:r>
     </w:p>
     <w:p>
@@ -10818,7 +10818,7 @@
         <w:ind w:firstLine="720"/>
       </w:pPr>
       <w:r>
-        <w:t xml:space="preserve">— Onde você estava, debaixo de uma pedra? — Ele abriu o braço na direção da silhueta morta do campus. — O lugar inteiro está desmoronando. Não é só a tempestade: os caminhos mais baixos estão debaixo d'água e a energia caiu em toda parte. Mas esse nem é o verdadeiro desastre. A manutenção diz que um pico enorme atravessou a rede. O pessoal da infraestrutura está lá dentro agora tentando descobrir quanto do equipamento virou carvão.</w:t>
+        <w:t xml:space="preserve">— Você estava onde, numa caverna? — Ele abriu o braço na direção da silhueta morta do campus. — O lugar inteiro está desmoronando. Não é só a tempestade: os caminhos mais baixos estão debaixo d'água e a energia caiu em toda parte. Mas esse nem é o verdadeiro desastre. A manutenção diz que um pico enorme atravessou a rede. O pessoal da infraestrutura está lá dentro agora tentando descobrir quanto do equipamento virou carvão.</w:t>
       </w:r>
     </w:p>
     <w:p>
@@ -10968,7 +10968,7 @@
         <w:ind w:firstLine="720"/>
       </w:pPr>
       <w:r>
-        <w:t xml:space="preserve">Depois o borrão cinza e lento de um enterro, o ar frio da Geórgia carregado do cheiro de terra úmida e flores, dois caixões lado a lado. Ela balançou a cabeça. Pequeno. Contido. O gesto treinado. Tinha passado anos aprendendo aquele gesto, aprendendo a usá-lo como uma chave — girando a fechadura, mantendo a porta fechada sobre tudo aquilo em volta do qual construíra aquela caixa. Ali, não. Não na frente de Jonas. Não naquele momento. Engoliu em seco e afastou a mão do vidro.</w:t>
+        <w:t xml:space="preserve">Depois o borrão cinza e lento de um enterro, o ar frio da Geórgia carregado do cheiro de terra úmida e flores, dois caixões lado a lado. Ela balançou a cabeça. Um gesto pequeno, contido, treinado. Tinha passado anos aprendendo aquele gesto, aprendendo a usá-lo como uma chave — girando a fechadura, mantendo trancado tudo o que ela havia guardado naquela caixa. Ali, não. Não na frente de Jonas. Não naquele momento. Engoliu em seco e afastou a mão do vidro.</w:t>
       </w:r>
     </w:p>
     <w:p>
@@ -11038,7 +11038,7 @@
         <w:ind w:firstLine="720"/>
       </w:pPr>
       <w:r>
-        <w:t xml:space="preserve">Do outro lado do vidro, a rodada estaria construindo o mapa dela célula por célula. Agora ela só via o reflexo do celular enquanto o erguia. Ethan primeiro. A ligação morreu antes de completar. Depois Noah. Um bipe chapado. ERRO. Ela limpou a chuva da tela com a manga e olhou de novo, embora as letras estivessem perfeitamente legíveis.</w:t>
+        <w:t xml:space="preserve">Do outro lado do vidro, a rodada estaria construindo o mapa dela célula por célula. Agora ela só via o reflexo do celular enquanto o erguia. Ethan primeiro. A ligação morreu antes de completar. Depois Noah. Um bipe seco. ERRO. Ela limpou a chuva da tela com a manga e olhou de novo, embora as letras estivessem perfeitamente legíveis.</w:t>
       </w:r>
     </w:p>
     <w:p>
@@ -11461,7 +11461,7 @@
         <w:ind w:firstLine="720"/>
       </w:pPr>
       <w:r>
-        <w:t xml:space="preserve">Na Kennedy Boulevard, o primeiro semáforo estava apagado. O seguinte também, e o outro depois dele. No segundo cruzamento, uma batidinha tinha se espalhado por quatro carros e bloqueava a maior parte da pista. Ninguém parecia ferido. Um homem de camisa de trabalho estava entre os veículos, fotografando o estrago com o celular, enquanto dois motoristas discutiam ao lado de um porta-malas aberto.</w:t>
+        <w:t xml:space="preserve">Na Kennedy Boulevard, o primeiro semáforo estava apagado. O seguinte também, e o outro depois dele. No segundo cruzamento, uma batida leve tinha envolvido quatro carros e bloqueava a maior parte da pista. Ninguém parecia ferido. Um homem de camisa de trabalho estava entre os veículos, fotografando o estrago com o celular, enquanto dois motoristas discutiam ao lado de um porta-malas aberto.</w:t>
       </w:r>
     </w:p>
     <w:p>
@@ -11541,7 +11541,7 @@
         <w:ind w:firstLine="720"/>
       </w:pPr>
       <w:r>
-        <w:t xml:space="preserve">A estática engoliu o resto. Ela achou outra estação, um âncora de rede nacional falando através de uma fina camada de interferência.</w:t>
+        <w:t xml:space="preserve">A estática engoliu o resto. Ela achou outra estação, um âncora de uma rede nacional falando através de uma fina camada de interferência.</w:t>
       </w:r>
     </w:p>
     <w:p>
@@ -12244,7 +12244,7 @@
         <w:ind w:firstLine="720"/>
       </w:pPr>
       <w:r>
-        <w:t xml:space="preserve">— Sou eu, Soph. Eu me viro. — Os dedos voltaram ao teclado. — Deixa ele descobrir pela contabilidade.</w:t>
+        <w:t xml:space="preserve">— Sou eu, Soph. Eu me viro. Deixa ele descobrir pela contabilidade.</w:t>
       </w:r>
     </w:p>
     <w:p>
@@ -12294,7 +12294,7 @@
         <w:ind w:firstLine="720"/>
       </w:pPr>
       <w:r>
-        <w:t xml:space="preserve">— Mais memória e mais núcleos do que o gabinete do seu laboratório. Depois disso, depende de quão bem o SOMA escala.</w:t>
+        <w:t xml:space="preserve">— Mais memória e mais núcleos do que o PC do seu laboratório. Depois disso, depende de quão bem o SOMA escala.</w:t>
       </w:r>
     </w:p>
     <w:p>
@@ -12354,7 +12354,7 @@
         <w:ind w:firstLine="720"/>
       </w:pPr>
       <w:r>
-        <w:t xml:space="preserve">As luzes se firmaram. O zumbido baixo da geladeira voltou. A barra de progresso subiu mais um pouco. Sophie se recusava a piscar, como se piscar pudesse desequilibrar alguma balança delicada que só ela sentia. Quando chegou a cem por cento, Ethan já estava implantando. Subiu a instância remota, espelhou a arquitetura enquanto Sophie o orientava e começou a puxar os feeds públicos. Os arquivos da rede GONG para os dados heliossísmicos. O Solar Dynamics Observatory da NASA para as imagens magnéticas de alta resolução.</w:t>
+        <w:t xml:space="preserve">As luzes se firmaram. O zumbido baixo da geladeira voltou. A barra de progresso subiu mais um pouco. Sophie se recusava a piscar, como se piscar pudesse desequilibrar alguma balança delicada que só ela sentia. Quando chegou a cem por cento, Ethan já estava configurando o ambiente. Subiu a instância remota, espelhou a arquitetura enquanto Sophie o orientava e começou a puxar os feeds públicos. Os arquivos da rede GONG para os dados heliossísmicos. O Solar Dynamics Observatory da NASA para as imagens magnéticas de alta resolução.</w:t>
       </w:r>
     </w:p>
     <w:p>
@@ -12374,7 +12374,7 @@
         <w:ind w:firstLine="720"/>
       </w:pPr>
       <w:r>
-        <w:t xml:space="preserve">— Então ele ingere os dois fluxos ao mesmo tempo — murmurou ele, mais para si mesmo do que para ela.</w:t>
+        <w:t xml:space="preserve">— Então ele processa os dois fluxos ao mesmo tempo — murmurou ele, mais para si mesmo do que para ela.</w:t>
       </w:r>
     </w:p>
     <w:p>
@@ -12454,17 +12454,17 @@
         <w:ind w:firstLine="720"/>
       </w:pPr>
       <w:r>
-        <w:t xml:space="preserve">— O gabinete do laboratório estimava seis horas para essa varredura.</w:t>
-      </w:r>
-    </w:p>
-    <w:p>
-      <w:pPr>
-        <w:pStyle w:val="Normal"/>
-        <w:spacing w:line="240" w:lineRule="auto"/>
-        <w:ind w:firstLine="720"/>
-      </w:pPr>
-      <w:r>
-        <w:t xml:space="preserve">— O gabinete do laboratório era lixo eletrônico. — Ethan fechou as janelas extras e alongou o pescoço. Acima deles, a luminária do teto tinha desenvolvido um zumbido fraco e irregular. — O processo agora está rodando nos servidores deles. Se este apartamento ficar sem energia, ele continua.</w:t>
+        <w:t xml:space="preserve">— O PC do laboratório estimava seis horas para essa varredura.</w:t>
+      </w:r>
+    </w:p>
+    <w:p>
+      <w:pPr>
+        <w:pStyle w:val="Normal"/>
+        <w:spacing w:line="240" w:lineRule="auto"/>
+        <w:ind w:firstLine="720"/>
+      </w:pPr>
+      <w:r>
+        <w:t xml:space="preserve">— O PC do laboratório era lixo eletrônico. — Ethan fechou as janelas extras e alongou o pescoço. Acima deles, a luminária do teto tinha desenvolvido um zumbido fraco e irregular. — O processo agora está rodando nos servidores deles. Se este apartamento ficar sem energia, ele continua.</w:t>
       </w:r>
     </w:p>
     <w:p>
@@ -12584,7 +12584,7 @@
         <w:ind w:firstLine="720"/>
       </w:pPr>
       <w:r>
-        <w:t xml:space="preserve">— Falhas em cascata na rede elétrica continuaram em vários estados do norte — disse o âncora —, depois dos picos significativos registrados mais cedo em partes do Sul, incluindo a Flórida. As autoridades confirmaram vários incêndios ligados a sobrecarga elétrica, enquanto a infraestrutura absorvia o estresse da perturbação em curso. — Uma pausa breve, das treinadas. — As autoridades pedem aos moradores que se preparem para interrupções prolongadas. Com as temperaturas continuando a cair bem abaixo da média da estação, a perda do aquecimento levanta sérias preocupações com as populações vulneráveis esta noite.</w:t>
+        <w:t xml:space="preserve">— Falhas em cascata na rede elétrica continuaram em vários estados do norte — disse o âncora —, depois dos picos significativos registrados mais cedo em partes do Sul, incluindo a Flórida. As autoridades confirmaram vários incêndios ligados a sobrecarga elétrica, enquanto a infraestrutura absorvia o estresse da perturbação em curso. — Uma pausa breve, ensaiada. — As autoridades pedem aos moradores que se preparem para interrupções prolongadas. Com as temperaturas continuando a cair bem abaixo da média da estação, a perda do aquecimento levanta sérias preocupações com as populações vulneráveis esta noite.</w:t>
       </w:r>
     </w:p>
     <w:p>
@@ -12723,7 +12723,7 @@
         <w:ind w:firstLine="720"/>
       </w:pPr>
       <w:r>
-        <w:t xml:space="preserve">“Não foi nada parecido com isto”, disse ele. “Nada parecido.”</w:t>
+        <w:t xml:space="preserve">“Aquela não chegou nem perto desta”, disse ele. “Nem perto.”</w:t>
       </w:r>
     </w:p>
     <w:p>
@@ -12922,7 +12922,7 @@
         <w:ind w:firstLine="720"/>
       </w:pPr>
       <w:r>
-        <w:t xml:space="preserve">O padre Patrick O'Connor limpou as mãos num pano, examinando as luminárias emprestadas. O padre tinha sessenta e poucos anos, cabelo cinza-aço e mãos curtidas, do tipo que falava de uma vida inteira de trabalho braçal ao lado da oração. Tinha vestido um cardigã por cima da camisa clerical uma hora antes e ainda o mantinha abotoado até o colarinho.</w:t>
+        <w:t xml:space="preserve">O padre Patrick O'Connor limpou as mãos num pano, examinando as luminárias emprestadas. O padre tinha sessenta e poucos anos, cabelo cinza-aço e mãos calejadas de quem passou a vida alternando trabalho braçal e oração. Tinha vestido um cardigã por cima da camisa clerical uma hora antes e ainda o mantinha abotoado até o colarinho.</w:t>
       </w:r>
     </w:p>
     <w:p>
@@ -12962,17 +12962,17 @@
         <w:ind w:firstLine="720"/>
       </w:pPr>
       <w:r>
-        <w:t xml:space="preserve">— O senhor não é o único — disse. — Metade das pessoas com quem falei hoje está com uma dor de cabeça que não passa. Eu estou com um zumbido no ouvido que vai e volta desde de manhã. Não tinha dado muita importância até agora.</w:t>
-      </w:r>
-    </w:p>
-    <w:p>
-      <w:pPr>
-        <w:pStyle w:val="Normal"/>
-        <w:spacing w:line="240" w:lineRule="auto"/>
-        <w:ind w:firstLine="720"/>
-      </w:pPr>
-      <w:r>
-        <w:t xml:space="preserve">A mão do padre Patrick parou no pano. Ele olhou para Noah um instante a mais, depois balançou a cabeça uma vez, como quem tenta soltar alguma coisa, e seguiu em frente.</w:t>
+        <w:t xml:space="preserve">— O senhor não é o único — disse. — Metade das pessoas com quem falei hoje está com uma dor de cabeça que não passa. Eu estou com um zumbido no ouvido que vai e volta desde a manhã. Não tinha dado muita importância até agora.</w:t>
+      </w:r>
+    </w:p>
+    <w:p>
+      <w:pPr>
+        <w:pStyle w:val="Normal"/>
+        <w:spacing w:line="240" w:lineRule="auto"/>
+        <w:ind w:firstLine="720"/>
+      </w:pPr>
+      <w:r>
+        <w:t xml:space="preserve">A mão do padre Patrick parou no pano. Ele olhou para Noah um instante a mais, depois balançou a cabeça uma vez, como quem tenta afastar um pensamento, e seguiu em frente.</w:t>
       </w:r>
     </w:p>
     <w:p>
@@ -13192,7 +13192,7 @@
         <w:ind w:firstLine="720"/>
       </w:pPr>
       <w:r>
-        <w:t xml:space="preserve">— Eu rezo. Todo dia. — O aço por baixo da voz mansa. — Mas você está aqui desde as três e meia, e ainda estou te prendendo para ajudar a arrumar o salão. A diocese tem uma verba de manutenção por um motivo. — Estendeu três notas de vinte. — Sessenta dólares. Menos da metade do que um empreiteiro me cobraria. Seus pais não te mandaram para a faculdade para você manter o salão paroquial funcionando de graça.</w:t>
+        <w:t xml:space="preserve">— Eu rezo. Todo dia. — Havia firmeza por baixo da voz mansa. — Mas você está aqui desde as três e meia, e ainda estou te prendendo para ajudar a arrumar o salão. A diocese tem uma verba de manutenção por um motivo. — Estendeu três notas de vinte. — Sessenta dólares. Menos da metade do que um empreiteiro me cobraria. Seus pais não te mandaram para a faculdade para você manter o salão paroquial funcionando de graça.</w:t>
       </w:r>
     </w:p>
     <w:p>
@@ -13212,7 +13212,7 @@
         <w:ind w:firstLine="720"/>
       </w:pPr>
       <w:r>
-        <w:t xml:space="preserve">— Estou preocupado com eles — disse. — Tudo lá também está no meio disso. Eu sei. Meu pai vive me dizendo que não é nada, que eles estão bem, para eu não me preocupar. Ele faz isso a minha vida inteira, e quanto pior está, mais ele diz que não é nada. Então, quando ele me diz para não me preocupar, é justamente aí que eu me preocupo.</w:t>
+        <w:t xml:space="preserve">— Estou preocupado com eles — disse. — Lá também está tudo um caos. Eu sei. Meu pai vive me dizendo que não é nada, que eles estão bem, para eu não me preocupar. Ele faz isso a minha vida inteira, e quanto pior está, mais ele diz que não é nada. Então, quando ele me diz para não me preocupar, é justamente aí que eu me preocupo.</w:t>
       </w:r>
     </w:p>
     <w:p>
@@ -13395,7 +13395,7 @@
         <w:ind w:firstLine="720"/>
       </w:pPr>
       <w:r>
-        <w:t xml:space="preserve">O rescaldo normal de uma tempestade. O tipo que ela tinha registrado depois de cem linhas de instabilidade. A não ser pelo frio. Num sinal de pare, ela encostou a palma da mão no vidro do passageiro e a manteve ali. O vidro estava frio. Não fresco. Frio, no meio de uma tarde de maio, sob um céu que tinha ficado violeta nas bordas e acobreado no centro, uma luz que nenhum filtro de câmera jamais produzira. Ela entrou no Bloomingdale Residence Complex.</w:t>
+        <w:t xml:space="preserve">O rescaldo normal de uma tempestade. O tipo de cena que ela tinha documentado depois de cem linhas de instabilidade. A não ser pelo frio. Num sinal de pare, ela encostou a palma da mão no vidro do passageiro e a manteve ali. O vidro estava frio. Não fresco. Frio, no meio de uma tarde de maio, sob um céu que tinha ficado violeta nas bordas e acobreado no centro, uma luz que nenhum filtro de câmera jamais produzira. Ela entrou no Bloomingdale Residence Complex.</w:t>
       </w:r>
     </w:p>
     <w:p>
@@ -13645,7 +13645,7 @@
         <w:ind w:firstLine="720"/>
       </w:pPr>
       <w:r>
-        <w:t xml:space="preserve">Melissa assentiu, e então Kate ergueu levemente o queixo. Lá estava de novo. Tênue, entrando do pátio pelas frestas da porta. Plástico queimado e metal quente, o cheiro de fiação que tinha desistido. Ela o sentira no portão, onde a carcaça da caixa de controle estava enegrecida na junta, e dissera a si mesma que era só o portão. Parada na porta quentinha de Melissa, com os braços do filho ainda frouxos em volta da cintura, entendeu que não era só o portão.</w:t>
+        <w:t xml:space="preserve">Melissa assentiu, e então Kate ergueu levemente o queixo. Lá estava de novo. Tênue, entrando do pátio pelas frestas da porta. Plástico queimado e metal quente, o cheiro de fiação que tinha desistido. Ela o sentira no portão, onde a carcaça da caixa de controle estava enegrecida na junta, e dissera a si mesma que era só o portão. Parada no aconchego da porta de Melissa, com os braços do filho ainda frouxos em volta da cintura, entendeu que não era só o portão.</w:t>
       </w:r>
     </w:p>
     <w:p>
@@ -13685,7 +13685,7 @@
         <w:ind w:firstLine="720"/>
       </w:pPr>
       <w:r>
-        <w:t xml:space="preserve">— Desde mais ou menos uma hora. Fechei as janelas. Imaginei que alguma coisa tivesse estourado quando a luz caiu.</w:t>
+        <w:t xml:space="preserve">— Desde mais ou menos uma da tarde. Fechei as janelas. Imaginei que alguma coisa tivesse estourado quando a luz caiu.</w:t>
       </w:r>
     </w:p>
     <w:p>
@@ -13705,7 +13705,7 @@
         <w:ind w:firstLine="720"/>
       </w:pPr>
       <w:r>
-        <w:t xml:space="preserve">Kate manteve a voz uniforme, a voz do ar, a que não provocava pânico. Mas a mão dela encontrou o alto da cabeça de Lucas e ficou ali.</w:t>
+        <w:t xml:space="preserve">Kate manteve a voz firme, a voz de quem está no ar, a que não provocava pânico. Mas a mão dela encontrou o alto da cabeça de Lucas e ficou ali.</w:t>
       </w:r>
     </w:p>
     <w:p>
@@ -13785,7 +13785,7 @@
         <w:ind w:firstLine="720"/>
       </w:pPr>
       <w:r>
-        <w:t xml:space="preserve">Kate começou a dizer não. Era um reflexo, que ela construíra desde Ryan, quando cada oferta de ajuda parecia prova de que ela não dava conta sozinha. Então pensou no próprio apartamento. O quadro de luz original no armário do corredor. O disjuntor que desarmava sempre que ela ligava o micro-ondas e o secador de cabelo ao mesmo tempo. A promessa do proprietário de trocá-lo, renovada a cada contrato. O que quer que tivesse queimado o portão tinha vindo pelos mesmos fios. Aquele quadro velho não teria aguentado. Ela apostaria o emprego nisso.</w:t>
+        <w:t xml:space="preserve">Kate começou a dizer não. Era um reflexo que ela desenvolvera depois da morte de Ryan, quando cada oferta de ajuda parecia prova de que ela não dava conta sozinha. Então pensou no próprio apartamento. O quadro de luz original no armário do corredor. O disjuntor que desarmava sempre que ela ligava o micro-ondas e o secador de cabelo ao mesmo tempo. A promessa do proprietário de trocá-lo, renovada a cada contrato. O que quer que tivesse queimado o portão tinha vindo pelos mesmos fios. Aquele quadro velho não teria aguentado. Ela apostaria o emprego nisso.</w:t>
       </w:r>
     </w:p>
     <w:p>
@@ -13918,7 +13918,7 @@
         <w:ind w:firstLine="720"/>
       </w:pPr>
       <w:r>
-        <w:t xml:space="preserve">A rodada vinha triturando desde as quatro menos dois, a mil e seiscentos quilômetros dali, num rack emprestado. Ainda faltavam horas. Nada a fazer além de ver aquela barra encher e esperar. Ethan estava sentado no sofá atrás dela, os cotovelos nos joelhos, olhando para Reese como se olha para um homem que você já sabe que vai mentir.</w:t>
+        <w:t xml:space="preserve">A rodada vinha processando desde as 15h58, a mil e seiscentos quilômetros dali, num rack emprestado. Ainda faltavam horas. Nada a fazer além de ver aquela barra encher e esperar. Ethan estava sentado no sofá atrás dela, os cotovelos nos joelhos, olhando para Reese como se olha para um homem que você já sabe que vai mentir.</w:t>
       </w:r>
     </w:p>
     <w:p>
@@ -13948,17 +13948,17 @@
         <w:ind w:firstLine="720"/>
       </w:pPr>
       <w:r>
-        <w:t xml:space="preserve">— Deus deu uma mão na fiação — disse Ethan, sem tirar os olhos da tela —, ou foi tudo você de novo?</w:t>
-      </w:r>
-    </w:p>
-    <w:p>
-      <w:pPr>
-        <w:pStyle w:val="Normal"/>
-        <w:spacing w:line="240" w:lineRule="auto"/>
-        <w:ind w:firstLine="720"/>
-      </w:pPr>
-      <w:r>
-        <w:t xml:space="preserve">— Deus está com muita coisa no prato hoje.</w:t>
+        <w:t xml:space="preserve">— Deus deu uma mãozinha na fiação — disse Ethan, sem tirar os olhos da tela —, ou foi tudo você de novo?</w:t>
+      </w:r>
+    </w:p>
+    <w:p>
+      <w:pPr>
+        <w:pStyle w:val="Normal"/>
+        <w:spacing w:line="240" w:lineRule="auto"/>
+        <w:ind w:firstLine="720"/>
+      </w:pPr>
+      <w:r>
+        <w:t xml:space="preserve">— Deus anda muito ocupado hoje.</w:t>
       </w:r>
     </w:p>
     <w:p>
@@ -14697,17 +14697,17 @@
         <w:ind w:firstLine="720"/>
       </w:pPr>
       <w:r>
-        <w:t xml:space="preserve">— Porque não acabou. — Escapou antes que Sophie conseguisse segurar. Ela encarava o celular. — Ninguém trava trezentos e quarenta transformadores por algo que já aconteceu. Faz isso pelo que vem depois.</w:t>
-      </w:r>
-    </w:p>
-    <w:p>
-      <w:pPr>
-        <w:pStyle w:val="Normal"/>
-        <w:spacing w:line="240" w:lineRule="auto"/>
-        <w:ind w:firstLine="720"/>
-      </w:pPr>
-      <w:r>
-        <w:t xml:space="preserve">Ninguém se mexeu. Na televisão, o letreiro ainda dizia POSSÍVEL ATAQUE CIBERNÉTICO, como se dizer aquilo o bastante fosse torná-lo verdade.</w:t>
+        <w:t xml:space="preserve">— Porque não acabou. — Escapou antes que Sophie conseguisse segurar. Ela encarava o celular. — Ninguém trava trezentos e quarenta transformadores por algo que já aconteceu. Isso se faz pelo que vem depois.</w:t>
+      </w:r>
+    </w:p>
+    <w:p>
+      <w:pPr>
+        <w:pStyle w:val="Normal"/>
+        <w:spacing w:line="240" w:lineRule="auto"/>
+        <w:ind w:firstLine="720"/>
+      </w:pPr>
+      <w:r>
+        <w:t xml:space="preserve">Ninguém se mexeu. Na televisão, o letreiro ainda dizia POSSÍVEL ATAQUE CIBERNÉTICO, como se repetir aquilo bastasse para torná-lo verdade.</w:t>
       </w:r>
     </w:p>
     <w:p>
@@ -14827,7 +14827,7 @@
         <w:ind w:firstLine="720"/>
       </w:pPr>
       <w:r>
-        <w:t xml:space="preserve">— Desde as quatro. — Ela manteve os olhos na barra. — Quando terminar, não vou mais rodar para o Santiago. Não para dar nota ao modelo contra um arquivo de dois anos atrás. Vou usar. Enquanto ainda importa. — A voz dela estava firme. As mãos, não. Torciam-se uma na outra no colo. — Se isso se confirmar, podemos dar às pessoas um lugar para onde olhar. Isso pode ganhar tempo. Mas não posso dar um relógio a vocês. Não posso dizer se vai entrar em erupção, nem para onde vai o que for lançado. — Uma pausa. — Não posso jurar que está certo. Nunca pude. Provar isso era o trabalho. — Deixou a frase assentar. — E o trabalho deixou de ser o que importava mais ou menos na hora em que as luzes se apagaram.</w:t>
+        <w:t xml:space="preserve">— Desde as quatro. — Ela manteve os olhos na barra. — Quando terminar, não vou mais rodar para o Santiago. Não para testar o modelo contra um arquivo de dois anos atrás. Vou usar. Enquanto ainda importa. — A voz dela estava firme. As mãos, não. Torciam-se uma na outra no colo. — Se isso se confirmar, podemos dar às pessoas um lugar para onde olhar. Isso pode nos dar tempo. Mas não tenho como dar um prazo. Não posso dizer se vai entrar em erupção, nem para onde vai o que for lançado. — Uma pausa. — Não posso jurar que está certo. Nunca pude. Provar isso era o trabalho. — Deixou a frase assentar. — E o trabalho deixou de ser o que importava mais ou menos na hora em que as luzes se apagaram.</w:t>
       </w:r>
     </w:p>
     <w:p>
@@ -14857,7 +14857,7 @@
         <w:ind w:firstLine="720"/>
       </w:pPr>
       <w:r>
-        <w:t xml:space="preserve">Os três voltaram a olhar para a tela. A linha verde continuava se preenchendo, paciente, indiferente, fazendo exatamente o que ela tinha pedido. A mil e seiscentos quilômetros dali, máquinas que ela nunca veria apontavam a matemática dela contra o lado cego de uma estrela. Lá fora, a luz acobreada continuava escoando rumo a um pôr do sol sem nenhuma pressa de chegar. E em algum lugar atrás da névoa, da cidade escura e do vento fino soprando do lado errado, o Sol pairava onde sempre pairou, com oito minutos de idade quando chegava ao vidro, já tendo terminado o que quer que tivesse decidido fazer em seguida.</w:t>
+        <w:t xml:space="preserve">Os três voltaram a olhar para a tela. A linha verde continuava se preenchendo, paciente, indiferente, fazendo exatamente o que ela tinha pedido. A mil e seiscentos quilômetros dali, máquinas que ela nunca veria apontavam a matemática dela contra o lado cego de uma estrela. Lá fora, a luz acobreada continuava escoando rumo a um pôr do sol sem nenhuma pressa de chegar. E em algum lugar atrás da névoa, da cidade escura e do vento fino soprando do lado errado, o Sol pairava onde sempre pairou, sua luz já com oito minutos de idade ao chegar ao vidro, já tendo terminado o que quer que tivesse decidido fazer em seguida.</w:t>
       </w:r>
     </w:p>
     <w:p>
@@ -14890,7 +14890,7 @@
         <w:ind w:firstLine="720"/>
       </w:pPr>
       <w:r>
-        <w:t xml:space="preserve">Por baixo das piscadas, por baixo da TV murmurando seu loop baixo e nervoso, havia a outra coisa. O silêncio lá fora. Uma noite de maio em Tampa deveria zumbir: aparelhos de ar-condicionado gemendo, insetos serrando, a respiração mecânica e solta de uma cidade que nunca esfriava de verdade. Naquela noite, não havia nada. Nenhum ronco de compressor. Nenhum ruído nas cercas vivas. Só um silêncio tão completo que parecia acolchoado, como se o mundo tivesse sido embrulhado em espuma. O notebook dela estava aberto, na bateria. O Wi-Fi de Melissa ia e vinha com o abajur. Cada vez que o roteador reiniciava, as páginas abertas congelavam nos cabeçalhos, e o apartamento dela lá em cima tinha perdido a conexão horas antes.</w:t>
+        <w:t xml:space="preserve">Por baixo das piscadas, por baixo da TV murmurando seu loop baixo e nervoso, havia a outra coisa. O silêncio lá fora. Uma noite de maio em Tampa deveria zumbir: aparelhos de ar-condicionado gemendo, insetos serrando, a respiração mecânica e constante de uma cidade que nunca esfriava de verdade. Naquela noite, não havia nada. Nenhum ronco de compressor. Nenhum barulho de bicho nas cercas vivas. Só um silêncio tão completo que parecia acolchoado, como se o mundo tivesse sido embrulhado em espuma. O notebook dela estava aberto, na bateria. O Wi-Fi de Melissa ia e vinha com o abajur. Cada vez que o roteador reiniciava, as páginas abertas congelavam nos cabeçalhos, e o apartamento dela lá em cima tinha perdido a conexão horas antes.</w:t>
       </w:r>
     </w:p>
     <w:p>
@@ -14920,7 +14920,7 @@
         <w:ind w:firstLine="720"/>
       </w:pPr>
       <w:r>
-        <w:t xml:space="preserve">Então fez o que sempre fazia. Voltou aos mapas. Entre um reinício e outro do roteador, tinha puxado a análise de superfície da tarde, depois as cartas de altitude, e as posto lado a lado na tela. Um bolsão de ar frio em altitude pairava sobre o norte da Flórida como uma impressão digital, muito mais frio e muito mais ao sul do que a estação permitia. O vento na superfície vinha de norte e de nordeste. No radar, nada. Nenhuma frente descendo pela península, nenhuma linha de tempestades marcando a borda do frio. Só o frio, chegando de lugar nenhum que ela pudesse apontar.</w:t>
+        <w:t xml:space="preserve">Então fez o que sempre fazia. Voltou aos mapas. Entre um reinício e outro do roteador, tinha puxado a análise de superfície da tarde, depois as cartas de altitude, e colocado tudo lado a lado na tela. Um bolsão de ar frio em altitude pairava sobre o norte da Flórida como uma impressão digital, muito mais frio e muito mais ao sul do que a estação permitia. O vento na superfície vinha de norte e de nordeste. No radar, nada. Nenhuma frente descendo pela península, nenhuma linha de tempestades marcando a borda do frio. Só o frio, chegando de lugar nenhum que ela pudesse apontar.</w:t>
       </w:r>
     </w:p>
     <w:p>
@@ -14990,7 +14990,7 @@
         <w:ind w:firstLine="720"/>
       </w:pPr>
       <w:r>
-        <w:t xml:space="preserve">O mais parecido que encontrou foi o Great Blue Norther, 11 de novembro de 1911. Kansas City de vinte e quatro graus para doze negativos em catorze horas. Springfield, no Missouri, uma queda de trinta e sete graus em dez. Independence, no Kansas, vinte e oito graus numa única hora. Gente em mangas de camisa na hora do almoço, congelada nas carroças ao anoitecer. Era a queda de temperatura mais violenta de que ela já tinha lido, e não se parecia em nada com Tampa. Aquela tempestade tinha uma frente que dava para desenhar com régua, uma muralha de nuvens negro-azuladas e um vento uivando atrás. E tinha acontecido nas Grandes Planícies em novembro, não no litoral do Golfo em maio.</w:t>
+        <w:t xml:space="preserve">O mais parecido que encontrou foi o Great Blue Norther, 11 de novembro de 1911. Em Kansas City, de vinte e quatro graus para doze negativos em catorze horas. Springfield, no Missouri, uma queda de trinta e sete graus em dez. Independence, no Kansas, vinte e oito graus numa única hora. Gente em mangas de camisa na hora do almoço, congelada nas carroças ao anoitecer. Era a queda de temperatura mais violenta sobre a qual ela já tinha lido, e não se parecia em nada com Tampa. Aquela tempestade tinha uma frente que dava para desenhar com régua, uma muralha de nuvens negro-azuladas e um vento uivando atrás. E tinha acontecido nas Grandes Planícies em novembro, não no litoral do Golfo em maio.</w:t>
       </w:r>
     </w:p>
     <w:p>
@@ -15059,7 +15059,7 @@
         <w:ind w:firstLine="720"/>
       </w:pPr>
       <w:r>
-        <w:t xml:space="preserve">O primeiro resultado era setembro de 1859. O Evento Carrington. Uma tempestade no Sol tão violenta que auroras iluminaram o céu sobre Cuba, fortes o bastante para se ler um jornal. As linhas de telégrafo da Europa e da América do Norte soltaram faíscas. Os operadores levavam choques pelos manipuladores. Em Boston e em Portland, eles desconectaram as baterias e continuaram enviando mensagens por duas horas com a corrente que o próprio céu empurrava pelos fios.</w:t>
+        <w:t xml:space="preserve">O primeiro resultado era setembro de 1859. O Evento Carrington. Uma tempestade no Sol tão violenta que auroras iluminaram o céu sobre Cuba, fortes o bastante para se ler um jornal. As linhas de telégrafo da Europa e da América do Norte soltaram faíscas. Os operadores levavam choques ao tocar os aparelhos. Em Boston e em Portland, eles desconectaram as baterias e continuaram enviando mensagens por duas horas com a corrente que o próprio céu empurrava pelos fios.</w:t>
       </w:r>
     </w:p>
     <w:p>
@@ -15132,17 +15132,17 @@
         <w:ind w:firstLine="720"/>
       </w:pPr>
       <w:r>
-        <w:t xml:space="preserve">No fim do corredor, as crianças finalmente tinham sossegado. Melissa estava na cozinha, guardando os pratos à mão, devagar e com cuidado, do jeito que as pessoas fazem tarefas domésticas quando as tarefas são a única coisa normal que sobrou. James tinha ido ao Bloco C com uma lanterna porque os vizinhos precisavam de ajuda para descer mantimentos por escadas escuras, e James era o tipo de homem que ia. Ar quente saía da saída do teto em sopros irregulares, trazendo o cheiro de poeira das resistências queimando até ficarem limpas.</w:t>
-      </w:r>
-    </w:p>
-    <w:p>
-      <w:pPr>
-        <w:pStyle w:val="Normal"/>
-        <w:spacing w:line="240" w:lineRule="auto"/>
-        <w:ind w:firstLine="720"/>
-      </w:pPr>
-      <w:r>
-        <w:t xml:space="preserve">Mais cedo, Melissa tinha ficado embaixo dela de braços cruzados, pronta para combater um incêndio. Nenhum incêndio. Só um aquecedor fazendo um trabalho de que ninguém em Tampa deveria precisar em maio. Kate olhou para a mesa e se lembrou de uma manhã diante dela, treze meses antes — depois que dois oficiais de farda de gala bateram à sua porta e partiram sua vida ao meio.</w:t>
+        <w:t xml:space="preserve">No fim do corredor, as crianças finalmente tinham sossegado. Melissa estava na cozinha, guardando os pratos à mão, devagar e com cuidado, do jeito que as pessoas fazem tarefas domésticas quando as tarefas são a única coisa normal que sobrou. James tinha ido ao Bloco C com uma lanterna porque os vizinhos precisavam de ajuda para descer mantimentos por escadas escuras, e James era o tipo de homem que ia. Ar quente saía da grade do teto em sopros irregulares, trazendo o cheiro das resistências queimando a poeira acumulada.</w:t>
+      </w:r>
+    </w:p>
+    <w:p>
+      <w:pPr>
+        <w:pStyle w:val="Normal"/>
+        <w:spacing w:line="240" w:lineRule="auto"/>
+        <w:ind w:firstLine="720"/>
+      </w:pPr>
+      <w:r>
+        <w:t xml:space="preserve">Mais cedo, Melissa tinha ficado embaixo dela de braços cruzados, pronta para combater um incêndio. Nenhum incêndio. Só um aquecedor fazendo um trabalho de que ninguém em Tampa deveria precisar em maio. Kate olhou para a mesa e se lembrou de uma manhã diante dela, treze meses antes — depois que dois oficiais de uniforme de gala bateram à sua porta e partiram sua vida ao meio.</w:t>
       </w:r>
     </w:p>
     <w:p>
@@ -15162,7 +15162,7 @@
         <w:ind w:firstLine="720"/>
       </w:pPr>
       <w:r>
-        <w:t xml:space="preserve">Ela tinha ficado em Tampa por causa de Lucas. Não se tira o pai de uma criança e depois o mundo dela. Aqueles dois tinham sustentado a família dela com as próprias mãos. Então, qualquer que fosse a forma que aquela coisa estivesse tomando, ficaria no caderno até que ela pudesse prová-la.</w:t>
+        <w:t xml:space="preserve">Ela tinha ficado em Tampa por causa de Lucas. Não se tira o pai de uma criança e depois o mundo inteiro dela. Aqueles dois tinham sustentado a família dela com as próprias mãos. Então, qualquer que fosse a forma que aquela coisa estivesse tomando, ficaria no caderno até que ela pudesse prová-la.</w:t>
       </w:r>
     </w:p>
     <w:p>
@@ -15344,7 +15344,7 @@
         <w:ind w:firstLine="720"/>
       </w:pPr>
       <w:r>
-        <w:t xml:space="preserve">Ele soltou uma bufada sem humor e seguiu em frente. Kate pegou o celular de novo.</w:t>
+        <w:t xml:space="preserve">Ele bufou, sem achar graça, e seguiu em frente. Kate pegou o celular de novo.</w:t>
       </w:r>
     </w:p>
     <w:p>
@@ -15626,7 +15626,7 @@
         <w:ind w:firstLine="720"/>
       </w:pPr>
       <w:r>
-        <w:t xml:space="preserve">Algumas eram medições em solo; outras, dados de montante. Antes de comparar os intervalos, ela teria de corrigir essa diferença. Ainda assim, a tempestade não estava diminuindo de forma constante. Isso ela podia afirmar. O que não podia afirmar era se tinha chegado material novo, se o campo magnético tinha mudado de orientação ou se as lacunas no registro estavam transformando uma passagem complicada em eventos separados. Desenhou a escada mesmo assim. Um esboço de trabalho.</w:t>
+        <w:t xml:space="preserve">Algumas eram medições em solo; outras, dados colhidos no espaço, a caminho da Terra. Antes de comparar os intervalos, ela teria de corrigir essa diferença. Ainda assim, a tempestade não estava diminuindo de forma constante. Isso ela podia afirmar. O que não podia afirmar era se tinha chegado material novo, se o campo magnético tinha mudado de orientação ou se as lacunas no registro estavam transformando uma passagem complicada em eventos separados. Desenhou a escada mesmo assim. Um esboço de trabalho.</w:t>
       </w:r>
     </w:p>
     <w:p>
@@ -15646,7 +15646,7 @@
         <w:ind w:firstLine="720"/>
       </w:pPr>
       <w:r>
-        <w:t xml:space="preserve">Ela precisava de alguém que soubesse ler o registro de montante. Acrescentou um ponto de interrogação depois de CHOQUES. Na TV, o loop tinha chegado aos especialistas, e ela aumentou o volume, precisando saber se algum deles tinha visto a escada. Um astrônomo universitário numa webcam congelada, questionado sobre os pores do sol estranhos:</w:t>
+        <w:t xml:space="preserve">Ela precisava de alguém que soubesse ler os registros do espaço. Acrescentou um ponto de interrogação depois de CHOQUES. Na TV, o loop tinha chegado aos especialistas, e ela aumentou o volume, precisando saber se algum deles tinha visto a escada. Um astrônomo universitário numa webcam congelada, questionado sobre os pores do sol estranhos:</w:t>
       </w:r>
     </w:p>
     <w:p>
@@ -15896,7 +15896,7 @@
         <w:ind w:firstLine="720"/>
       </w:pPr>
       <w:r>
-        <w:t xml:space="preserve">Aquilo eram catorze graus. Na direção errada, com o vento errado, na estação errada.</w:t>
+        <w:t xml:space="preserve">Agora eram catorze graus de erro. Na direção errada, com o vento errado, na estação errada.</w:t>
       </w:r>
     </w:p>
     <w:p>
@@ -16086,7 +16086,7 @@
         <w:ind w:firstLine="720"/>
       </w:pPr>
       <w:r>
-        <w:t xml:space="preserve">A verdade chegou até os dentes de Kate. Podia piorar.</w:t>
+        <w:t xml:space="preserve">A verdade chegou à ponta da língua de Kate. Podia piorar.</w:t>
       </w:r>
     </w:p>
     <w:p>
@@ -16162,7 +16162,7 @@
         <w:rPr>
           <w:i/>
         </w:rPr>
-        <w:t xml:space="preserve">Kate: Quando conseguir um feed, puxa o arquivo do vento solar. Tudo o que tiver, com os horários originais. Marca os saltos, mas mantém separadas as observações de montante e as de solo.</w:t>
+        <w:t xml:space="preserve">Kate: Quando conseguir um feed, puxa o arquivo do vento solar. Tudo o que tiver, com os horários originais. Marca os saltos, mas mantém separados os dados do espaço e os de solo.</w:t>
       </w:r>
     </w:p>
     <w:p>
@@ -16284,7 +16284,7 @@
         <w:ind w:firstLine="720"/>
       </w:pPr>
       <w:r>
-        <w:t xml:space="preserve">O véu engrossava enquanto ela olhava. Não era só Orlando. Na tela meteorológica, ele cobria metade da península, de Tampa a Daytona, e cada trecho iluminado da cidade lá embaixo tinha começado a ficar borrado nas bordas, como se alguém tivesse bafejado no vidro.</w:t>
+        <w:t xml:space="preserve">O véu engrossava enquanto ela olhava. Não era só Orlando. Na tela meteorológica, ele cobria metade da península, de Tampa a Daytona, e cada trecho iluminado da cidade lá embaixo tinha começado a ficar borrado nas bordas, como se alguém tivesse soprado no vidro embaçado.</w:t>
       </w:r>
     </w:p>
     <w:p>
@@ -16704,7 +16704,7 @@
         <w:ind w:firstLine="720"/>
       </w:pPr>
       <w:r>
-        <w:t xml:space="preserve">Mas ela nunca tinha feito aquilo num céu da cor errada.</w:t>
+        <w:t xml:space="preserve">Moss já tinha feito aquela aproximação centenas de vezes. Mas nunca num céu da cor errada.</w:t>
       </w:r>
     </w:p>
     <w:p>
@@ -17017,7 +17017,7 @@
         <w:ind w:firstLine="720"/>
       </w:pPr>
       <w:r>
-        <w:t xml:space="preserve">Três baques sob o piso. As luzes verdes do painel se alinharam numa fileira. Lá fora: cinza. Não o cinza de nuvem. Cinza de cinza molhada. Um cinza que parecia áspero contra o vidro, como se os limpadores de para-brisa pudessem empurrá-lo para o lado.</w:t>
+        <w:t xml:space="preserve">Três baques sob o piso. As luzes verdes do painel se alinharam numa fileira. Lá fora: cinza. Não o cinza de nuvem. Cor de cinza molhada. Um cinza que parecia áspero contra o vidro, como se os limpadores de para-brisa pudessem empurrá-lo para o lado.</w:t>
       </w:r>
     </w:p>
     <w:p>
@@ -17037,7 +17037,7 @@
         <w:ind w:firstLine="720"/>
       </w:pPr>
       <w:r>
-        <w:t xml:space="preserve">Ela repassava a aproximação na cabeça. Luzes da pista a duzentos pés. Cabeceira nos mínimos. Tinham o treinamento. Tinham o equipamento. A trajetória. A descida. Uma carta que ela dobrara e desdobrara cinco vezes por semana durante uma década.</w:t>
+        <w:t xml:space="preserve">Ela repassava a aproximação na cabeça. Luzes da pista a duzentos pés. Cabeceira nos mínimos. Tinham o treinamento. Tinham o equipamento. A trajetória. A descida. Uma carta de aproximação que ela dobrara e desdobrara cinco vezes por semana durante uma década.</w:t>
       </w:r>
     </w:p>
     <w:p>
@@ -17200,7 +17200,7 @@
         <w:ind w:firstLine="720"/>
       </w:pPr>
       <w:r>
-        <w:t xml:space="preserve">E então o altímetro fez algo que ela nunca, em onze anos voando aquela rota, tinha ouvido ele fazer.</w:t>
+        <w:t xml:space="preserve">E então o altímetro fez algo que ela nunca, em onze anos voando aquela rota, tinha visto ele fazer.</w:t>
       </w:r>
     </w:p>
     <w:p>
@@ -17695,7 +17695,7 @@
         <w:ind w:firstLine="720"/>
       </w:pPr>
       <w:r>
-        <w:t xml:space="preserve">Tom não disse nada. Nenhuma bola de fogo. Nenhum clarão além do vidro. Mas ele não respirou mais aliviado. Algo nele se recusava a soltar.</w:t>
+        <w:t xml:space="preserve">Tom não disse nada. Nenhuma bola de fogo. Nenhum clarão além do vidro. Mas ele não respirou mais aliviado. Algo nele se recusava a relaxar.</w:t>
       </w:r>
     </w:p>
     <w:p>
@@ -17765,7 +17765,7 @@
         <w:ind w:firstLine="720"/>
       </w:pPr>
       <w:r>
-        <w:t xml:space="preserve">— Torre Orlando. Temos uma aeronave acidentada. Delta dois-oito-quatro-sete, sete-três-sete, última observação a duzentos pés na final para a pista um-oito direita. Acionem a resposta.</w:t>
+        <w:t xml:space="preserve">— Torre Orlando. Temos uma aeronave acidentada. Delta dois-oito-quatro-sete, sete-três-sete, última observação a duzentos pés na final para a pista um-oito direita. Acionem o socorro.</w:t>
       </w:r>
     </w:p>
     <w:p>
@@ -17785,7 +17785,7 @@
         <w:ind w:firstLine="720"/>
       </w:pPr>
       <w:r>
-        <w:t xml:space="preserve">— Tom, não entendo. Eu vetorei ele certinho. — A voz de Jake tinha afinado. — Os ponteiros dele estavam centralizados. Ele estava bem em cima da linha. Na minha tela, ele estava bem em cima da linha.</w:t>
+        <w:t xml:space="preserve">— Tom, não entendo. Eu vetorei ele certinho. — A voz de Jake tinha ficado fina. — Os ponteiros dele estavam centralizados. Ele estava bem em cima da linha. Na minha tela, ele estava bem em cima da linha.</w:t>
       </w:r>
     </w:p>
     <w:p>
@@ -18025,7 +18025,7 @@
         <w:ind w:firstLine="720"/>
       </w:pPr>
       <w:r>
-        <w:t xml:space="preserve">— A tela esteve errada o tempo todo. — Jake ouviu a própria voz subir e odiou quão fina ela soava. — Esse ponto verde. Não é onde o avião está. É onde o avião acha que está. O GPS deu a eles uma posição errada, e eu devolvi para eles. Pus o 2847 numa linha de aproximação em que ele nunca esteve de verdade.</w:t>
+        <w:t xml:space="preserve">— A tela esteve errada o tempo todo. — Jake ouviu a própria voz subir e odiou o quanto ela soava fina. — Esse ponto verde. Não é onde o avião está. É onde o avião acha que está. O GPS deu a eles uma posição errada, e eu devolvi para eles. Pus o 2847 numa linha de aproximação em que ele nunca esteve de verdade.</w:t>
       </w:r>
     </w:p>
     <w:p>
@@ -18371,17 +18371,17 @@
         <w:ind w:firstLine="720"/>
       </w:pPr>
       <w:r>
-        <w:t xml:space="preserve">Aquela ficou suspensa no ar.</w:t>
-      </w:r>
-    </w:p>
-    <w:p>
-      <w:pPr>
-        <w:pStyle w:val="Normal"/>
-        <w:spacing w:line="240" w:lineRule="auto"/>
-        <w:ind w:firstLine="720"/>
-      </w:pPr>
-      <w:r>
-        <w:t xml:space="preserve">Do outro lado da sala, Tom já estava no telefone fixo com o Centro Jacksonville, o fone apertado contra a orelha. A sala continuava trabalhando em volta dele — instruções, cotejamentos, altitudes, proas —, mas Jake captava pedaços mesmo assim. As palavras que atravessavam.</w:t>
+        <w:t xml:space="preserve">A pergunta ficou suspensa no ar.</w:t>
+      </w:r>
+    </w:p>
+    <w:p>
+      <w:pPr>
+        <w:pStyle w:val="Normal"/>
+        <w:spacing w:line="240" w:lineRule="auto"/>
+        <w:ind w:firstLine="720"/>
+      </w:pPr>
+      <w:r>
+        <w:t xml:space="preserve">Do outro lado da sala, Tom já estava no telefone fixo com o Centro Jacksonville, o fone apertado contra a orelha. A sala continuava trabalhando em volta dele — instruções, confirmações, altitudes, proas —, mas Jake captava pedaços mesmo assim. As palavras que atravessavam.</w:t>
       </w:r>
     </w:p>
     <w:p>
@@ -18601,7 +18601,7 @@
         <w:ind w:firstLine="720"/>
       </w:pPr>
       <w:r>
-        <w:t xml:space="preserve">— Tom — disse, e odiou quão jovem soava. — O que a gente faz?</w:t>
+        <w:t xml:space="preserve">— Tom — disse, e odiou o quanto soava jovem. — O que a gente faz?</w:t>
       </w:r>
     </w:p>
     <w:p>
@@ -18691,7 +18691,7 @@
         <w:ind w:firstLine="720"/>
       </w:pPr>
       <w:r>
-        <w:t xml:space="preserve">As pessoas se sentaram. Fones foram ajustados. Frequências foram retomadas. Alguém enxugou o rosto com a manga e voltou ao trabalho antes que qualquer um pudesse fingir que não viu. O medo não foi embora. Só foi dobrado dentro do procedimento.</w:t>
+        <w:t xml:space="preserve">As pessoas se sentaram. Fones foram ajustados. Frequências foram retomadas. Alguém enxugou o rosto com a manga e voltou ao trabalho antes que qualquer um pudesse fingir que não viu. O medo não foi embora. Só foi guardado dentro do procedimento.</w:t>
       </w:r>
     </w:p>
     <w:p>
@@ -19122,7 +19122,7 @@
         <w:ind w:firstLine="720"/>
       </w:pPr>
       <w:r>
-        <w:t xml:space="preserve">— Isso. Do lado que as nossas imagens normais não resolvem. Hoje, temos os arquivos que conseguimos baixar. — Ela inclinou o notebook na direção deles. Oitocentas e quarenta e sete pastas, sobrepostas como as telhas de um telhado. — Cada uma é um trecho do Sol. A borda visível e uma faixa de uns vinte graus atrás dela. Se tem alguma coisa magnética embaixo da superfície, o som volta mais cedo.</w:t>
+        <w:t xml:space="preserve">— Isso. Do lado que as nossas imagens normais não conseguem mostrar. Hoje, temos os arquivos que conseguimos baixar. — Ela inclinou o notebook na direção deles. Oitocentas e quarenta e sete pastas, sobrepostas como as telhas de um telhado. — Cada uma é um trecho do Sol. A borda visível e uma faixa de uns vinte graus atrás dela. Se tem alguma coisa magnética embaixo da superfície, o som volta mais cedo.</w:t>
       </w:r>
     </w:p>
     <w:p>
@@ -19181,7 +19181,7 @@
         <w:ind w:firstLine="720"/>
       </w:pPr>
       <w:r>
-        <w:t xml:space="preserve">— De três a oito, tem um campo. Alguma coisa se mexendo ali embaixo. Normalmente continua pequena e some. Mas estaciona uma do lado da outra, e elas se alimentam. Crescem.</w:t>
+        <w:t xml:space="preserve">— De três a oito, tem um campo. Alguma coisa se mexendo ali embaixo. Normalmente continua pequena e some. Mas, quando uma fica do lado da outra, elas se alimentam. Crescem.</w:t>
       </w:r>
     </w:p>
     <w:p>
@@ -19595,7 +19595,7 @@
         <w:ind w:firstLine="720"/>
       </w:pPr>
       <w:r>
-        <w:t xml:space="preserve">— Os seus dez minutos viram quarenta quando você for depurar. E depois ele pinta qualquer coisa que receber. — Ela apontou para a grade. — Quero olhos em cada número. O Sol não dá saltos. É contínuo. Se uma janela diz trinta e tudo em volta diz dois, isso não é o Sol. É um arquivo corrompido. Um script não percebe. Você percebe.</w:t>
+        <w:t xml:space="preserve">— Os seus dez minutos viram quarenta quando você for depurar. E depois ele pinta qualquer coisa que receber. — Ela apontou para a grade. — Quero alguém olhando cada número. O Sol não dá saltos. É contínuo. Se uma janela diz trinta e tudo em volta diz dois, isso não é o Sol. É um arquivo corrompido. Um script não percebe. Você percebe.</w:t>
       </w:r>
     </w:p>
     <w:p>
@@ -20051,7 +20051,7 @@
         <w:ind w:firstLine="720"/>
       </w:pPr>
       <w:r>
-        <w:t xml:space="preserve">Foi ele quem viu. Deu um passo para trás da parede com um bloco em cada mão. Fazia meia hora que as duas manchas vinham rastejando uma em direção à outra pela pintura. Laranja comendo o azul. Rosa comendo o laranja. X pretos no coração do rosa. Ele colou o post-it seguinte, e o último vão vazio se fechou. As cores se juntaram, atravessando direto a linha onde uma metade da rodada terminava e a outra começava.</w:t>
+        <w:t xml:space="preserve">Foi ele quem viu. Deu um passo para trás, afastando-se da parede, com um bloco em cada mão. Fazia meia hora que as duas manchas vinham rastejando uma em direção à outra pela pintura. Laranja comendo o azul. Rosa comendo o laranja. X pretos no coração do rosa. Ele colou o post-it seguinte, e o último vão vazio se fechou. As cores se juntaram, atravessando direto a linha onde uma metade da rodada terminava e a outra começava.</w:t>
       </w:r>
     </w:p>
     <w:p>
@@ -20251,7 +20251,7 @@
         <w:ind w:firstLine="720"/>
       </w:pPr>
       <w:r>
-        <w:t xml:space="preserve">Não uma mancha. Não um trecho. Uma nódoa. Espalhava-se pela face oculta até ultrapassar a borda da faixa que o SOMA tinha testado, como se o Sol tivesse sido machucado por dentro. Dava para enfileirar uma dúzia de Terras sobre ela e ainda sobraria espaço.</w:t>
+        <w:t xml:space="preserve">Não um ponto. Não um trecho. Uma mancha imensa. Espalhava-se pela face oculta até ultrapassar a borda da faixa que o SOMA tinha testado, como se o Sol tivesse sido machucado por dentro. Dava para enfileirar uma dúzia de Terras sobre ela e ainda sobraria espaço.</w:t>
       </w:r>
     </w:p>
     <w:p>
@@ -20493,7 +20493,7 @@
         <w:ind w:firstLine="720"/>
       </w:pPr>
       <w:r>
-        <w:t xml:space="preserve">Foi esse o detalhe que se enroscou em alguma coisa dentro dela. Orlando tinha névoa. Kansas City tinha estrelas.</w:t>
+        <w:t xml:space="preserve">Foi esse detalhe que ficou martelando nela. Orlando tinha névoa. Kansas City tinha estrelas.</w:t>
       </w:r>
     </w:p>
     <w:p>
@@ -20778,7 +20778,7 @@
         <w:ind w:firstLine="720"/>
       </w:pPr>
       <w:r>
-        <w:t xml:space="preserve">Ela se virou para a tela dividida. À esquerda, Michael Arrendale, ex-vice-diretor de contraterrorismo do FBI, num escritório escuro iluminado por um único abajur. À direita, a dra. Nadia Farouk, cientista atmosférica da Columbia, na sua sala no campus, com uma janela cheia de cidade atrás dela. Metade das janelas da cidade estava apagada.</w:t>
+        <w:t xml:space="preserve">Ela se virou para a tela dividida. À esquerda, Michael Arrendale, ex-vice-diretor de contraterrorismo do FBI, num escritório escuro iluminado por um único abajur. À direita, a dra. Nadia Farouk, cientista atmosférica da Columbia, na sua sala no campus, com a cidade inteira na janela atrás dela. Metade das janelas da cidade estava apagada.</w:t>
       </w:r>
     </w:p>
     <w:p>
@@ -20978,7 +20978,7 @@
         <w:ind w:firstLine="720"/>
       </w:pPr>
       <w:r>
-        <w:t xml:space="preserve">Ela deixou respirar exatamente dois segundos. On-line, ela sabia, a discussão já tinha acontecido dez mil vezes desde o pôr do sol: hackers chineses, hackers russos, o vulcão, o governo mentindo sobre o vulcão, o governo mentindo sobre tudo. Nenhuma daquelas pessoas tinha visto o campo em Kansas City tampouco.</w:t>
+        <w:t xml:space="preserve">Ela deixou respirar exatamente dois segundos. On-line, ela sabia, a discussão já tinha acontecido dez mil vezes desde o pôr do sol: hackers chineses, hackers russos, o vulcão, o governo mentindo sobre o vulcão, o governo mentindo sobre tudo. Nenhuma daquelas pessoas tinha visto o campo em Kansas City.</w:t>
       </w:r>
     </w:p>
     <w:p>
@@ -21018,7 +21018,7 @@
         <w:ind w:firstLine="720"/>
       </w:pPr>
       <w:r>
-        <w:t xml:space="preserve">O monitor se encheu de uma quase escuridão. O rosto de Omar, iluminado de baixo por uma luz a bateria presa à câmera. A respiração dele saía branca. Atrás dele, o horizonte do centro da cidade tinha virado um punhado de janelas acesas espalhadas sobre uma forma negra.</w:t>
+        <w:t xml:space="preserve">O monitor se encheu de uma quase escuridão. O rosto de Omar, iluminado de baixo por uma luz a bateria presa à câmera. A respiração dele saía branca. Atrás dele, a silhueta do centro da cidade tinha virado um punhado de janelas acesas espalhadas sobre uma forma negra.</w:t>
       </w:r>
     </w:p>
     <w:p>
@@ -21128,7 +21128,7 @@
         <w:ind w:firstLine="720"/>
       </w:pPr>
       <w:r>
-        <w:t xml:space="preserve">Rodaram a fita de mais cedo: um pátio de transformadores nos arredores de Toledo, em Ohio, pegando fogo à tarde, com uma coluna de fumaça preta inclinada para o leste no céu. Seis incêndios ligados a sobrecargas elétricas em Ohio, Michigan e Pensilvânia. Em Chicago, os trens elevados tinham parado na hora do rush, e milhares de pessoas voltaram a pé para casa com uns cinco graus, as golas levantadas. O vídeo as mostrava atravessando o rio a pé, um lento rio escuro de gente, ninguém falando.</w:t>
+        <w:t xml:space="preserve">Rodaram as imagens de mais cedo: um pátio de transformadores nos arredores de Toledo, em Ohio, pegando fogo à tarde, com uma coluna de fumaça preta inclinada para o leste no céu. Seis incêndios ligados a sobrecargas elétricas em Ohio, Michigan e Pensilvânia. Em Chicago, os trens elevados tinham parado na hora do rush, e milhares de pessoas voltaram a pé para casa com uns cinco graus, as golas levantadas. O vídeo as mostrava atravessando o rio a pé, um lento rio escuro de gente, ninguém falando.</w:t>
       </w:r>
     </w:p>
     <w:p>
@@ -21148,7 +21148,7 @@
         <w:ind w:firstLine="720"/>
       </w:pPr>
       <w:r>
-        <w:t xml:space="preserve">— De volta à Flórida, onde os acidentes são só parte da história desta noite. Mais de quatro milhões de clientes em todo o estado estão sem energia. Na região da baía de Tampa, a concessionária, a Cole Energy, informa que cerca de sete em cada dez clientes estão no escuro. Maria Delgado está em Tampa, conosco por telefone. Nossa unidade de satélite perdeu energia há uma hora. Maria, você me ouve?</w:t>
+        <w:t xml:space="preserve">— De volta à Flórida, onde os acidentes são só parte da história desta noite. Mais de quatro milhões de clientes em todo o estado estão sem energia. Na região da baía de Tampa, a concessionária, a Cole Energy, informa que cerca de sete em cada dez clientes estão no escuro. Maria Delgado está em Tampa, conosco por telefone. Nosso caminhão de transmissão perdeu energia há uma hora. Maria, você me ouve?</w:t>
       </w:r>
     </w:p>
     <w:p>
@@ -21421,7 +21421,7 @@
         <w:ind w:firstLine="720"/>
       </w:pPr>
       <w:r>
-        <w:t xml:space="preserve">A cadeira da sala de Melissa não tinha sido feita para ficar muito tempo sentada. Kate sabia disso desde as oito, quando a puxara para junto da janela norte e se acomodara, o caderno quente no colo, o celular frio na mão e a certeza nas entranhas de que as próximas horas lhe diriam se ela estava certa ou se sua mente finalmente tinha perdido as amarras. Mais de duas horas depois, a cadeira não tinha melhorado.</w:t>
+        <w:t xml:space="preserve">A cadeira da sala de Melissa não tinha sido feita para quem precisava passar horas sentado. Kate sabia disso desde as oito, quando a puxara para junto da janela norte e se acomodara, o caderno quente no colo, o celular frio na mão e a certeza no fundo do estômago de que as próximas horas lhe diriam se ela estava certa ou se sua mente finalmente tinha perdido as amarras. Mais de duas horas depois, a cadeira não tinha melhorado.</w:t>
       </w:r>
     </w:p>
     <w:p>
@@ -21479,7 +21479,7 @@
         <w:ind w:firstLine="720"/>
       </w:pPr>
       <w:r>
-        <w:t xml:space="preserve">Então ela foi por fora.</w:t>
+        <w:t xml:space="preserve">Então ela buscou outros caminhos.</w:t>
       </w:r>
     </w:p>
     <w:p>
@@ -21590,7 +21590,7 @@
         <w:ind w:firstLine="720"/>
       </w:pPr>
       <w:r>
-        <w:t xml:space="preserve">Nevoeiro. Naquela manhã, ela tinha prometido à baía de Tampa tempo seco a semana inteira. Nenhum modelo tinha mostrado nevoeiro. Nada disso fazia daquilo culpa dela. Também não afrouxava o nó embaixo das costelas.</w:t>
+        <w:t xml:space="preserve">Nevoeiro. Naquela manhã, ela tinha prometido à baía de Tampa tempo seco a semana inteira. Nenhum modelo tinha mostrado nevoeiro. Nada disso tornava aquilo culpa dela. Também não afrouxava o nó embaixo das costelas.</w:t>
       </w:r>
     </w:p>
     <w:p>
@@ -21669,7 +21669,7 @@
         <w:ind w:firstLine="720"/>
       </w:pPr>
       <w:r>
-        <w:t xml:space="preserve">Ela anotou os horários no caderno, em coluna, sob a palavra que tinha escrito a lápis ao lado das anotações sobre 1859 e 1989, às sete horas, e que meio que torcia para nunca mais ter de olhar.</w:t>
+        <w:t xml:space="preserve">Ela anotou os horários no caderno, em coluna, sob a palavra que tinha escrito a lápis ao lado das anotações sobre 1859 e 1989, às sete horas, e que torcia um pouco para nunca mais ter de olhar.</w:t>
       </w:r>
     </w:p>
     <w:p>
@@ -21701,7 +21701,7 @@
         <w:t xml:space="preserve">DRA. EVELYN COCH, ASTROFÍSICA, EX-NASA</w:t>
       </w:r>
       <w:r>
-        <w:t xml:space="preserve">, que alguém numa sala de controle não tivera tempo de soletrar direito.</w:t>
+        <w:t xml:space="preserve">, com um erro de grafia que ninguém na sala de controle tivera tempo de corrigir.</w:t>
       </w:r>
     </w:p>
     <w:p>
@@ -22575,17 +22575,17 @@
         <w:ind w:firstLine="720"/>
       </w:pPr>
       <w:r>
-        <w:t xml:space="preserve">— 91. Filipinas. — Ela falava rápido, como fazia diante de um quadro branco quando uma demonstração finalmente se abria. — Jogou tanto enxofre lá em cima que corroeu a camada de ozônio durante dois anos. E Tonga, o vulcão submarino, em 2022. A onda de choque fez a ionosfera ondular em volta do mundo inteiro. Ondular. Como um lago.</w:t>
-      </w:r>
-    </w:p>
-    <w:p>
-      <w:pPr>
-        <w:pStyle w:val="Normal"/>
-        <w:spacing w:line="240" w:lineRule="auto"/>
-        <w:ind w:firstLine="720"/>
-      </w:pPr>
-      <w:r>
-        <w:t xml:space="preserve">— Soph — disse Noah. — Em português.</w:t>
+        <w:t xml:space="preserve">— 91. Filipinas. — Ela falava rápido, como fazia diante de um quadro branco quando uma demonstração finalmente fazia sentido. — Jogou tanto enxofre lá em cima que corroeu a camada de ozônio durante dois anos. E Tonga, o vulcão submarino, em 2022. A onda de choque fez a ionosfera ondular em volta do mundo inteiro. Ondular. Como um lago.</w:t>
+      </w:r>
+    </w:p>
+    <w:p>
+      <w:pPr>
+        <w:pStyle w:val="Normal"/>
+        <w:spacing w:line="240" w:lineRule="auto"/>
+        <w:ind w:firstLine="720"/>
+      </w:pPr>
+      <w:r>
+        <w:t xml:space="preserve">— Soph — disse Noah. — Traduz.</w:t>
       </w:r>
     </w:p>
     <w:p>
@@ -22777,7 +22777,7 @@
         <w:ind w:firstLine="720"/>
       </w:pPr>
       <w:r>
-        <w:t xml:space="preserve">Os joelhos de Sophie pareceram errados. Ela se sentou no braço do sofá antes que eles decidissem por ela.</w:t>
+        <w:t xml:space="preserve">Os joelhos de Sophie fraquejaram. Ela se sentou no braço do sofá antes que eles decidissem por ela.</w:t>
       </w:r>
     </w:p>
     <w:p>
@@ -22797,7 +22797,7 @@
         <w:ind w:firstLine="720"/>
       </w:pPr>
       <w:r>
-        <w:t xml:space="preserve">Puxou o notebook para os joelhos e abriu tudo o que tinha. O fórum de física solar em que espreitava desde o segundo ano. Os fóruns de clima espacial. Os fóruns de radioamadores. As páginas chegavam devagar, em pedaços, caixas cinza se preenchendo uma a uma.</w:t>
+        <w:t xml:space="preserve">Puxou o notebook para os joelhos e abriu tudo o que tinha. O fórum de física solar que acompanhava desde o segundo ano. Os fóruns de clima espacial. Os fóruns de radioamadores. As páginas chegavam devagar, em pedaços, caixas cinza se preenchendo uma a uma.</w:t>
       </w:r>
     </w:p>
     <w:p>
@@ -22856,7 +22856,7 @@
         <w:rPr>
           <w:i/>
         </w:rPr>
-        <w:t xml:space="preserve">Piloto. O GPS nos pôs quarenta milhas Golfo adentro na descida para ATL hoje. Pousamos com dado bruto. Não me perguntem mais nada.</w:t>
+        <w:t xml:space="preserve">Piloto. O GPS nos pôs quarenta milhas Golfo adentro na descida para ATL hoje. Pousamos só com dados brutos. Não me perguntem mais nada.</w:t>
       </w:r>
     </w:p>
     <w:p>
@@ -22869,7 +22869,7 @@
         <w:rPr>
           <w:i/>
         </w:rPr>
-        <w:t xml:space="preserve">Tambora + tempestade solar é fanfic de apocalíptico. Vai tomar um ar.</w:t>
+        <w:t xml:space="preserve">Tambora + tempestade solar é fanfic de fim do mundo. Vai pegar um ar.</w:t>
       </w:r>
     </w:p>
     <w:p>
@@ -22935,7 +22935,7 @@
         <w:rPr>
           <w:i/>
         </w:rPr>
-        <w:t xml:space="preserve">Ozônio total da coluna ~30% abaixo na faixa da erupção e se espalhando em direção aos polos. Mais rápido que qualquer rodada de modelo que temos. Se alguém está olhando fluxo de partículas hoje, considere isso. O escudo está fino.</w:t>
+        <w:t xml:space="preserve">Coluna total de ozônio ~30% abaixo na faixa da erupção e se espalhando em direção aos polos. Mais rápido que qualquer rodada de modelo que temos. Se alguém está olhando fluxo de partículas hoje, considere isso. O escudo está fino.</w:t>
       </w:r>
     </w:p>
     <w:p>
@@ -23316,7 +23316,7 @@
         <w:ind w:firstLine="720"/>
       </w:pPr>
       <w:r>
-        <w:t xml:space="preserve">Não uma piscada. Não o afundamento marrom das 21h56. Tudo se foi de uma vez: o abajur, a geladeira, os olhos verdes do roteador junto à porta. Um zumbido que ela nem sabia que estava ouvindo parou, e o silêncio entrou tão rápido que os ouvidos dela zumbiram.</w:t>
+        <w:t xml:space="preserve">Não uma piscada. Não a queda para aquela luz marrom das 21h56. Tudo se foi de uma vez: o abajur, a geladeira, os olhos verdes do roteador junto à porta. Um zumbido que ela nem sabia que estava ouvindo parou, e o silêncio entrou tão rápido que os ouvidos dela zumbiram.</w:t>
       </w:r>
     </w:p>
     <w:p>
@@ -23441,7 +23441,7 @@
         <w:ind w:firstLine="720"/>
       </w:pPr>
       <w:r>
-        <w:t xml:space="preserve">Três celulares. Três telas mortas. Em algum lugar lá fora, desconhecidos estavam lendo a postagem dela, fazendo-a em pedaços ou endossando-a, e ela não conseguia ver nada disso.</w:t>
+        <w:t xml:space="preserve">Três celulares. Três telas mortas. Em algum lugar lá fora, desconhecidos estavam lendo a postagem dela, detonando o trabalho dela ou dando razão a ela, e ela não conseguia ver nada disso.</w:t>
       </w:r>
     </w:p>
     <w:p>
@@ -23631,7 +23631,7 @@
         <w:ind w:firstLine="720"/>
       </w:pPr>
       <w:r>
-        <w:t xml:space="preserve">Ela olhou. A Fletcher era um rio negro com alguns faróis rastejando por ele, indo a lugar nenhum evidente. De vez em quando, o facho de uma lanterna varria um estacionamento e sumia. Nenhum poste aceso. Nenhuma janela. O campus era só uma forma mais escura contra o escuro.</w:t>
+        <w:t xml:space="preserve">Ela olhou. A Fletcher era um rio negro com alguns faróis rastejando por ele, sem destino aparente. De vez em quando, o facho de uma lanterna varria um estacionamento e sumia. Nenhum poste aceso. Nenhuma janela. O campus era só uma forma mais escura contra o escuro.</w:t>
       </w:r>
     </w:p>
     <w:p>
@@ -23731,7 +23731,7 @@
         <w:ind w:firstLine="720"/>
       </w:pPr>
       <w:r>
-        <w:t xml:space="preserve">Só o nome dela. Mais nada. Caiu mais pesado do que tinha qualquer direito de cair.</w:t>
+        <w:t xml:space="preserve">Só o nome dela. Mais nada. Pesou mais do que deveria.</w:t>
       </w:r>
     </w:p>
     <w:p>

</xml_diff>

<commit_message>
Update 05h10 Beta Hall/physics lab chapter with revised translation
Co-Authored-By: Claude Opus 5.5 <noreply@anthropic.com>
Claude-Session: https://claude.ai/code/session_0174ZwgJ6hzgJCKLC6cWrHSh
</commit_message>
<xml_diff>
--- a/Os_Ultimos_Dias_de_Tudo_PT-BR.docx
+++ b/Os_Ultimos_Dias_de_Tudo_PT-BR.docx
@@ -845,87 +845,97 @@
         <w:ind w:firstLine="720"/>
       </w:pPr>
       <w:r>
-        <w:t xml:space="preserve">O corredor do Beta Hall se estendia vazio sob as lâmpadas fluorescentes, cuja luz deixava as paredes da cor de dentes velhos. Sophie fechou a porta — o trinco estalou como um osso voltando ao lugar — e jogou a mochila num dos ombros. Em algum ponto do corredor, um despertador zumbia atrás de uma porta fechada: constante, insistente, ignorado. O Beta Hall era o alojamento mais antigo do campus, um bloco atarracado de concreto que cheirava a pó de café e cera de assoalho por mais que os faxineiros passassem pano.</w:t>
-      </w:r>
-    </w:p>
-    <w:p>
-      <w:pPr>
-        <w:pStyle w:val="Normal"/>
-        <w:spacing w:line="240" w:lineRule="auto"/>
-        <w:ind w:firstLine="720"/>
-      </w:pPr>
-      <w:r>
-        <w:t xml:space="preserve">Às cinco da manhã, não parecia uma moradia estudantil. Parecia um lugar prendendo a respiração. Os passos dela não faziam ruído no carpete gasto enquanto passava por porta após porta, todas fechadas, todas em silêncio. Saiu do prédio e olhou para cima. O céu ainda estava escuro. As luzes do campus da USF formavam uma mancha acobreada e opaca sob a névoa. No pôr do sol da véspera, havia estudantes ali tirando fotos; agora, um copo descartado continuava onde alguém o largara.</w:t>
-      </w:r>
-    </w:p>
-    <w:p>
-      <w:pPr>
-        <w:pStyle w:val="Normal"/>
-        <w:spacing w:line="240" w:lineRule="auto"/>
-        <w:ind w:firstLine="720"/>
-      </w:pPr>
-      <w:r>
-        <w:t xml:space="preserve">Tambora, dissera a dra. Vance. Compostos de enxofre, no alto da atmosfera. Não era cinza caindo sobre Tampa, nada que se pudesse tocar. Ela queria acreditar que era só isso. O calor ainda pesava como o calor da Flórida sempre pesava, mas estava um ou dois graus abaixo do que deveria. Agradável, quase. O frescor vinha de trás dela, de cima, e por um segundo a levou de volta às manhãs da Geórgia, ao jeito como o outono chegava lá antes de chegar a qualquer outro lugar, ao cheiro que a cozinha da avó tinha naquela época do ano.</w:t>
-      </w:r>
-    </w:p>
-    <w:p>
-      <w:pPr>
-        <w:pStyle w:val="Normal"/>
-        <w:spacing w:line="240" w:lineRule="auto"/>
-        <w:ind w:firstLine="720"/>
-      </w:pPr>
-      <w:r>
-        <w:t xml:space="preserve">Deixou a lembrança percorrer a pequena distância que ela se dispunha a percorrer e depois a deixou ir embora, como essas coisas sempre iam. Continuou andando. O campus estava deserto: nenhum estudante cortando caminho, nenhum skate estalando nas juntas do concreto, ninguém parando para fotografar o céu estranho. Só o zumbido da cidade em algum lugar ao longe e o farfalhar seco das folhas das palmeiras lá em cima. Passou pela biblioteca, escura atrás das janelas, depois pelo prédio de engenharia, igualmente escuro, onde um guaxinim trabalhava num copo caído sobre o banco da entrada com as mãos pacientes e cuidadosas de um cirurgião.</w:t>
-      </w:r>
-    </w:p>
-    <w:p>
-      <w:pPr>
-        <w:pStyle w:val="Normal"/>
-        <w:spacing w:line="240" w:lineRule="auto"/>
-        <w:ind w:firstLine="720"/>
-      </w:pPr>
-      <w:r>
-        <w:t xml:space="preserve">Perto do prédio da administração, diminuiu o passo. A bandeira no mastro se mexia, o que em si não tinha nada de estranho. Estranha era a direção. Àquela hora, o vento devia estar vindo do mar, de leste-sudeste, a brisa marítima chegando como sempre chegava. Ela não morava na Flórida havia muito tempo, mas isso ela sabia. Em vez disso, a bandeira apontava para oeste-noroeste, rumo ao interior. Rumo a ela. Algo frio deslizou pela sua nuca, liso como uma lâmina saindo da bainha. Por trás. Por cima. Ela não se virou para conferir. Fechou o zíper do moletom e seguiu em frente. O prédio de Física esperava no canto nordeste do núcleo do campus: três andares de concreto armado e vidro simples, dos anos 1980.</w:t>
-      </w:r>
-    </w:p>
-    <w:p>
-      <w:pPr>
-        <w:pStyle w:val="Normal"/>
-        <w:spacing w:line="240" w:lineRule="auto"/>
-        <w:ind w:firstLine="720"/>
-      </w:pPr>
-      <w:r>
-        <w:t xml:space="preserve">Atravessou o saguão, e por um segundo o próprio reflexo surgiu nas portas de vidro: um metro e sessenta, cinquenta e quatro quilos, cabelo escuro preso, olheiras fundas sob os dois olhos. Fácil de passar despercebida. Nos lares adotivos, ela tinha aprendido o quanto isso podia ser útil.</w:t>
-      </w:r>
-    </w:p>
-    <w:p>
-      <w:pPr>
-        <w:pStyle w:val="Normal"/>
-        <w:spacing w:line="240" w:lineRule="auto"/>
-        <w:ind w:firstLine="720"/>
-      </w:pPr>
-      <w:r>
-        <w:t xml:space="preserve">A sala se acomodou ao redor dela: o ruído branco das ventoinhas, o zunido ocasional dos discos buscando dados, o sistema de ventilação zumbindo constante lá em cima. O monitor despertou num clarão azul-esbranquiçado. A USF não tinha observatório. O programa de astronomia tinha perdido a verba anos antes, e o equipamento fora despachado para instituições com mais dinheiro. O departamento construíra outra coisa no lugar: um laboratório de pesquisa com acesso direto aos grandes arquivos solares — o Solar Dynamics Observatory da NASA, o SOHO, redes de telescópios em solo espalhadas por oito fusos horários.</w:t>
-      </w:r>
-    </w:p>
-    <w:p>
-      <w:pPr>
-        <w:pStyle w:val="Normal"/>
-        <w:spacing w:line="240" w:lineRule="auto"/>
-        <w:ind w:firstLine="720"/>
-      </w:pPr>
-      <w:r>
-        <w:t xml:space="preserve">Nada de cúpula. Nada de montagem equatorial. Mais vazão de dados do que qualquer telescópio isolado poderia sonhar em produzir. Para Sophie, vazão sempre tinha sido a métrica certa. Dezoito meses de trabalho cabiam num único diretório: SOMA — o Solar Oscillation and Magnetic-field Analyzer. Tudo tinha começado de uma constatação tão óbvia que parecia bobagem publicar: a maioria das instituições de pesquisa não tinha infraestrutura para monitoramento solar em tempo real, e os produtos públicos existentes não tinham sido feitos para os testes pequenos e configuráveis de que o laboratório dela precisava.</w:t>
-      </w:r>
-    </w:p>
-    <w:p>
-      <w:pPr>
-        <w:pStyle w:val="Normal"/>
-        <w:spacing w:line="240" w:lineRule="auto"/>
-        <w:ind w:firstLine="720"/>
-      </w:pPr>
-      <w:r>
-        <w:t xml:space="preserve">Sophie queria tornar esses testes possíveis num hardware que um estudante pudesse pagar. O problema central era a geometria. A maior parte das observações contínuas disponíveis para ela cobria o hemisfério voltado para a Terra. Outras sondas podiam oferecer ângulos diferentes, mas não um mapa confiável e completo da face oculta. Qualquer estrutura magnética de grande escala que se formasse ali permanecia escondida até que a rotação solar a trouxesse para o campo de visão, processo que podia levar até duas semanas. Saber antes da existência de uma grande região ativa podia melhorar a preparação.</w:t>
+        <w:t xml:space="preserve">O corredor do Beta Hall estava vazio sob as lâmpadas fluorescentes. Sophie puxou a porta do quarto e jogou a mochila num dos ombros. Em algum ponto do corredor, um despertador tocava atrás de uma porta fechada. Ninguém o desligava. O Beta era o alojamento mais antigo do campus, um bloco atarracado de concreto que cheirava a pó de café e cera de assoalho por mais que os faxineiros passassem pano.</w:t>
+      </w:r>
+    </w:p>
+    <w:p>
+      <w:pPr>
+        <w:pStyle w:val="Normal"/>
+        <w:spacing w:line="240" w:lineRule="auto"/>
+        <w:ind w:firstLine="720"/>
+      </w:pPr>
+      <w:r>
+        <w:t xml:space="preserve">Às cinco da manhã, todas as portas estavam fechadas. Ela desceu pela escada e saiu. O céu ainda estava escuro, e as luzes do campus formavam uma mancha acobreada e opaca sob a névoa. No pôr do sol da véspera, havia estudantes naquele mesmo lugar tirando fotos. Tudo o que tinha sobrado era um copo de papel no chão.</w:t>
+      </w:r>
+    </w:p>
+    <w:p>
+      <w:pPr>
+        <w:pStyle w:val="Normal"/>
+        <w:spacing w:line="240" w:lineRule="auto"/>
+        <w:ind w:firstLine="720"/>
+      </w:pPr>
+      <w:r>
+        <w:t xml:space="preserve">Tambora, dissera o dr. Vance. Enxofre no alto da atmosfera, nada que fosse cair sobre Tampa. Ela queria acreditar que era só isso. O ar ainda era o ar da Flórida, pesado e úmido, mas um ou dois graus mais fresco do que deveria. Por um segundo, aquilo a levou de volta à Geórgia no começo do outono, à cozinha da avó. Ela deixou a lembrança ir embora.</w:t>
+      </w:r>
+    </w:p>
+    <w:p>
+      <w:pPr>
+        <w:pStyle w:val="Normal"/>
+        <w:spacing w:line="240" w:lineRule="auto"/>
+        <w:ind w:firstLine="720"/>
+      </w:pPr>
+      <w:r>
+        <w:t xml:space="preserve">O campus estava deserto. Ninguém cortando caminho pelos gramados, nenhum skate. Só o zumbido distante da cidade e as folhas das palmeiras farfalhando lá em cima. Passou pela biblioteca, às escuras. Pelo prédio de engenharia, às escuras. Num banco do lado de fora, um guaxinim remexia um copo caído e nem se deu ao trabalho de fugir.</w:t>
+      </w:r>
+    </w:p>
+    <w:p>
+      <w:pPr>
+        <w:pStyle w:val="Normal"/>
+        <w:spacing w:line="240" w:lineRule="auto"/>
+        <w:ind w:firstLine="720"/>
+      </w:pPr>
+      <w:r>
+        <w:t xml:space="preserve">Perto do prédio da administração, diminuiu o passo. A bandeira se mexia, o que era normal. A direção, não. Àquela hora, a brisa deveria vir do mar, de leste-sudeste. Ela não morava na Flórida havia muito tempo, mas isso ela sabia. Em vez disso, a bandeira apontava para oeste-noroeste, rumo ao interior. Uma corrente de ar frio roçou sua nuca. Ela fechou o zíper do moletom e seguiu em frente.</w:t>
+      </w:r>
+    </w:p>
+    <w:p>
+      <w:pPr>
+        <w:pStyle w:val="Normal"/>
+        <w:spacing w:line="240" w:lineRule="auto"/>
+        <w:ind w:firstLine="720"/>
+      </w:pPr>
+      <w:r>
+        <w:t xml:space="preserve">O prédio de Física ficava no canto nordeste do núcleo do campus: três andares de concreto armado e vidro simples, construído em 1981.</w:t>
+      </w:r>
+    </w:p>
+    <w:p>
+      <w:pPr>
+        <w:pStyle w:val="Normal"/>
+        <w:spacing w:line="240" w:lineRule="auto"/>
+        <w:ind w:firstLine="720"/>
+      </w:pPr>
+      <w:r>
+        <w:t xml:space="preserve">Nas portas de vidro do saguão, viu o próprio reflexo. Um metro e sessenta, cabelo escuro preso, olheiras fundas sob os dois olhos. Fácil de passar despercebida. Nos lares adotivos, ela tinha aprendido o quanto isso podia ser útil.</w:t>
+      </w:r>
+    </w:p>
+    <w:p>
+      <w:pPr>
+        <w:pStyle w:val="Normal"/>
+        <w:spacing w:line="240" w:lineRule="auto"/>
+        <w:ind w:firstLine="720"/>
+      </w:pPr>
+      <w:r>
+        <w:t xml:space="preserve">No andar de cima, o laboratório era só ventoinhas, o zunido dos discos e o zumbido constante da ventilação. Ela se sentou e despertou o monitor. A USF não tinha observatório. O programa de astronomia tinha perdido a verba anos antes, e o equipamento fora despachado para instituições com mais dinheiro. O departamento construíra outra coisa no lugar: um laboratório de pesquisa com acesso direto aos grandes arquivos solares — o Solar Dynamics Observatory da NASA, o SOHO, redes de telescópios em solo espalhadas por oito fusos horários.</w:t>
+      </w:r>
+    </w:p>
+    <w:p>
+      <w:pPr>
+        <w:pStyle w:val="Normal"/>
+        <w:spacing w:line="240" w:lineRule="auto"/>
+        <w:ind w:firstLine="720"/>
+      </w:pPr>
+      <w:r>
+        <w:t xml:space="preserve">Nada de cúpula. Nada de montagem equatorial. Mais volume de dados do que qualquer telescópio isolado poderia sonhar em produzir. Para Sophie, volume de dados sempre tinha sido a métrica certa. Dezoito meses de trabalho cabiam num único diretório: SOMA — o Solar Oscillation and Magnetic-field Analyzer. Tudo tinha começado de uma constatação tão óbvia que parecia bobagem publicar: a maioria das instituições de pesquisa não tinha infraestrutura para monitoramento solar em tempo real, e os produtos públicos existentes não tinham sido feitos para os testes pequenos e configuráveis de que o laboratório dela precisava.</w:t>
+      </w:r>
+    </w:p>
+    <w:p>
+      <w:pPr>
+        <w:pStyle w:val="Normal"/>
+        <w:spacing w:line="240" w:lineRule="auto"/>
+        <w:ind w:firstLine="720"/>
+      </w:pPr>
+      <w:r>
+        <w:t xml:space="preserve">Sophie queria tornar esses testes possíveis num equipamento que um estudante pudesse pagar. O problema central era a geometria. A maior parte das observações contínuas disponíveis para ela cobria o hemisfério voltado para a Terra. Outras sondas podiam oferecer ângulos diferentes, mas não um mapa confiável e completo da face oculta. Qualquer estrutura magnética de grande escala que se formasse ali permanecia escondida até que a rotação solar a trouxesse para o campo de visão, processo que podia levar até duas semanas. Saber antes da existência de uma grande região ativa podia melhorar a preparação.</w:t>
       </w:r>
     </w:p>
     <w:p>
@@ -945,17 +955,17 @@
         <w:ind w:firstLine="720"/>
       </w:pPr>
       <w:r>
-        <w:t xml:space="preserve">A NASA rodava a técnica em sondas dedicadas e numa infraestrutura de supercomputação que valia mais do que o departamento inteiro de Sophie. Ela tinha montado a sua versão num PC gamer recondicionado que encontrara no Craigslist por trezentos dólares. As fitas de LED RGB ainda brilhavam no gabinete. Esquentava. Fazia barulho. O algoritmo dela puxava dados de velocidade da rede GONG: seis telescópios solares em solo distribuídos pelo planeta, medindo desvios Doppler em todo o disco solar em cadência contínua e publicando os arquivos corrigidos.</w:t>
-      </w:r>
-    </w:p>
-    <w:p>
-      <w:pPr>
-        <w:pStyle w:val="Normal"/>
-        <w:spacing w:line="240" w:lineRule="auto"/>
-        <w:ind w:firstLine="720"/>
-      </w:pPr>
-      <w:r>
-        <w:t xml:space="preserve">A saída bruta era numérica: milhões de medições de velocidade da superfície por janela de observação, acompanhando o sobe e desce da fotosfera em cada ponto amostrado. O pipeline de processamento de Sophie traduzia os dados em mapas de ondas subsuperficiais, correlacionava os resíduos de tempo de trânsito com um modelo solar padrão e sinalizava os desvios por profundidade e posição. A resolução do SOMA não era de nível NASA. Nem precisava ser. Era boa o bastante para detectar uma grande região ativa dias antes de ela entrar no campo de visão.</w:t>
+        <w:t xml:space="preserve">A NASA rodava a técnica em sondas dedicadas e numa infraestrutura de supercomputação que valia mais do que o departamento inteiro de Sophie. Ela tinha montado a sua versão num PC gamer recondicionado que encontrara na internet por trezentos dólares. As fitas de LED coloridas ainda brilhavam no gabinete. Esquentava. Fazia barulho. O algoritmo dela puxava dados de velocidade da rede GONG: seis telescópios solares em solo distribuídos pelo planeta, medindo desvios Doppler em todo o disco solar sem interrupção e publicando os arquivos corrigidos.</w:t>
+      </w:r>
+    </w:p>
+    <w:p>
+      <w:pPr>
+        <w:pStyle w:val="Normal"/>
+        <w:spacing w:line="240" w:lineRule="auto"/>
+        <w:ind w:firstLine="720"/>
+      </w:pPr>
+      <w:r>
+        <w:t xml:space="preserve">A saída bruta era numérica: milhões de medições de velocidade da superfície por janela de observação, acompanhando o sobe e desce da fotosfera em cada ponto amostrado. O processamento de Sophie traduzia os dados em mapas de ondas abaixo da superfície, comparava os desvios de tempo de trânsito com um modelo solar padrão e sinalizava as anomalias por profundidade e posição. A resolução do SOMA não era de nível NASA. Nem precisava ser. Era boa o bastante para detectar uma grande região ativa dias antes de ela entrar no campo de visão.</w:t>
       </w:r>
     </w:p>
     <w:p>
@@ -1085,7 +1095,7 @@
         <w:ind w:firstLine="720"/>
       </w:pPr>
       <w:r>
-        <w:t xml:space="preserve">— Os testes nas regiões do limbo estão se sustentando. Os falsos positivos caíram depois que ajustei o filtro de ruído acústico. O modelo está captando estrutura subsuperficial onde a NOAA fica em cima do muro.</w:t>
+        <w:t xml:space="preserve">— Os testes nas regiões do limbo estão se sustentando. Os falsos positivos caíram depois que ajustei o filtro de ruído acústico. O modelo está captando estrutura abaixo da superfície onde a NOAA fica em cima do muro.</w:t>
       </w:r>
     </w:p>
     <w:p>
@@ -1135,7 +1145,7 @@
         <w:ind w:firstLine="720"/>
       </w:pPr>
       <w:r>
-        <w:t xml:space="preserve">— Ainda não testei todos os cenários. — Ela manteve os olhos na tela. — Regiões ativas, regiões calmas, campos de polaridade mista, manchas de evolução rápida… só validei uma parte. Existem configurações em que a inversão acústica pode desmoronar. Ainda não me aventurei nelas.</w:t>
+        <w:t xml:space="preserve">— Ainda não testei todos os cenários. — Ela manteve os olhos na tela. — Regiões ativas, regiões calmas, campos de polaridade mista, manchas de evolução rápida… só validei uma parte. Existem configurações em que a inversão acústica pode desmoronar. Ainda não me arrisquei nelas.</w:t>
       </w:r>
     </w:p>
     <w:p>
@@ -1205,7 +1215,7 @@
         <w:ind w:firstLine="720"/>
       </w:pPr>
       <w:r>
-        <w:t xml:space="preserve">— Não quebrou no que você testou. — Ele começou a limpar os óculos na barra da camisa. — Setenta a setenta e cinco por cento dos casos.</w:t>
+        <w:t xml:space="preserve">— Não falhou no que você testou. — Ele começou a limpar os óculos na barra da camisa. — Setenta a setenta e cinco por cento dos casos.</w:t>
       </w:r>
     </w:p>
     <w:p>
@@ -1275,7 +1285,7 @@
         <w:ind w:firstLine="720"/>
       </w:pPr>
       <w:r>
-        <w:t xml:space="preserve">— Professor, não. Ainda estou processando casos relevantes. Nem toquei na variação entre o limbo e o centro do disco. Preciso de um pacote de validação completo. Ainda pode quebrar nos casos que não rodei.</w:t>
+        <w:t xml:space="preserve">— Professor, não. Ainda estou processando casos relevantes. Nem toquei na variação entre o limbo e o centro do disco. Preciso de um pacote de validação completo. Ainda pode falhar nos casos que não rodei.</w:t>
       </w:r>
     </w:p>
     <w:p>
@@ -1405,7 +1415,7 @@
         <w:ind w:firstLine="720"/>
       </w:pPr>
       <w:r>
-        <w:t xml:space="preserve">— O SOMA não serve só para concordar com a NOAA depois que tudo já aconteceu. Serve para tornar a análise solar subsuperficial mais barata, mais acessível, mais útil. Uma ferramenta capaz de ver o que acontece na face oculta do Sol, ou em regiões que mal conseguimos enxergar, sem os instrumentos mais caros do mundo. Se funcionar, pode dar alertas com mais antecedência sobre grandes erupções e ejeções de massa coronal.</w:t>
+        <w:t xml:space="preserve">— O SOMA não serve só para concordar com a NOAA depois que tudo já aconteceu. Serve para tornar a análise solar abaixo da superfície mais barata, mais acessível, mais útil. Uma ferramenta capaz de ver o que acontece na face oculta do Sol, ou em regiões que mal conseguimos enxergar, sem os instrumentos mais caros do mundo. Se funcionar, pode dar alertas com mais antecedência sobre grandes erupções e ejeções de massa coronal.</w:t>
       </w:r>
     </w:p>
     <w:p>
@@ -1425,7 +1435,7 @@
         <w:ind w:firstLine="720"/>
       </w:pPr>
       <w:r>
-        <w:t xml:space="preserve">— Exato. Validar contra as classificações arquivadas da NOAA é um bom primeiro passo. Mas continua sendo retrospectivo. Seguro. — Ele fez uma pausa. — O Santiago quer saber se essa coisa consegue fazer mais do que concordar com as pessoas depois que a resposta já ficou visível.</w:t>
+        <w:t xml:space="preserve">— Exato. Validar contra as classificações arquivadas da NOAA é um bom primeiro passo. Mas continua sendo olhar para trás. Seguro. — Ele fez uma pausa. — O Santiago quer saber se essa coisa consegue fazer mais do que concordar com as pessoas depois que a resposta já ficou visível.</w:t>
       </w:r>
     </w:p>
     <w:p>
@@ -1445,27 +1455,27 @@
         <w:ind w:firstLine="720"/>
       </w:pPr>
       <w:r>
-        <w:t xml:space="preserve">— O senhor quer um teste prospectivo.</w:t>
-      </w:r>
-    </w:p>
-    <w:p>
-      <w:pPr>
-        <w:pStyle w:val="Normal"/>
-        <w:spacing w:line="240" w:lineRule="auto"/>
-        <w:ind w:firstLine="720"/>
-      </w:pPr>
-      <w:r>
-        <w:t xml:space="preserve">— Quero. — Vance recostou-se. — Use dois dos três dias que restam para observar regiões perto do limbo. Concentre-se em lugares onde a NOAA já está sinalizando algum tipo de instabilidade, onde os dados ópticos ainda são escassos, onde a confiança da NOAA é baixa. Acompanhe as que forem girando para uma visão mais clara nas próximas quarenta e oito horas.</w:t>
-      </w:r>
-    </w:p>
-    <w:p>
-      <w:pPr>
-        <w:pStyle w:val="Normal"/>
-        <w:spacing w:line="240" w:lineRule="auto"/>
-        <w:ind w:firstLine="720"/>
-      </w:pPr>
-      <w:r>
-        <w:t xml:space="preserve">A mente dela entrou em foco na hora. Ela podia seguir a complexidade magnética subsuperficial enquanto o Sol girava e depois compará-la com o que finalmente ficasse visível. Era elegante. E arriscado.</w:t>
+        <w:t xml:space="preserve">— O senhor quer um teste de previsão.</w:t>
+      </w:r>
+    </w:p>
+    <w:p>
+      <w:pPr>
+        <w:pStyle w:val="Normal"/>
+        <w:spacing w:line="240" w:lineRule="auto"/>
+        <w:ind w:firstLine="720"/>
+      </w:pPr>
+      <w:r>
+        <w:t xml:space="preserve">— Quero. — Vance se recostou. — Use dois dos três dias que restam para observar regiões perto do limbo. Concentre-se em lugares onde a NOAA já está sinalizando algum tipo de instabilidade, onde os dados ópticos ainda são escassos, onde a confiança da NOAA é baixa. Acompanhe as que forem girando para uma visão mais clara nas próximas quarenta e oito horas.</w:t>
+      </w:r>
+    </w:p>
+    <w:p>
+      <w:pPr>
+        <w:pStyle w:val="Normal"/>
+        <w:spacing w:line="240" w:lineRule="auto"/>
+        <w:ind w:firstLine="720"/>
+      </w:pPr>
+      <w:r>
+        <w:t xml:space="preserve">A mente dela entrou em foco na hora. Ela podia seguir a complexidade magnética abaixo da superfície enquanto o Sol girava e depois compará-la com o que finalmente ficasse visível. Era elegante. E arriscado.</w:t>
       </w:r>
     </w:p>
     <w:p>
@@ -1525,7 +1535,7 @@
         <w:ind w:firstLine="720"/>
       </w:pPr>
       <w:r>
-        <w:t xml:space="preserve">— Justo. — Depois ficou sério. — A ciência gosta de fingir que é tudo controle e disciplina. Quase tudo é. Mas o momento importa. Ser a pessoa certa, olhando para a coisa certa, no instante exato em que ela importa, isso importa também. Registre a previsão antes que os dados visíveis cheguem. Senão, vamos passar a sexta-feira explicando por que somos tão bons em prever o dia de ontem.</w:t>
+        <w:t xml:space="preserve">— Justo. — Depois ficou sério. — A ciência gosta de fingir que é tudo controle e disciplina. Quase tudo é. Mas o momento importa. Ser a pessoa certa, olhando para a coisa certa, no instante exato em que ela importa, isso também conta. Registre a previsão antes que os dados visíveis cheguem. Senão, vamos passar a sexta-feira explicando por que somos tão bons em prever o dia de ontem.</w:t>
       </w:r>
     </w:p>
     <w:p>
@@ -1545,7 +1555,7 @@
         <w:ind w:firstLine="720"/>
       </w:pPr>
       <w:r>
-        <w:t xml:space="preserve">— Tudo bem — disse ela. — Se o Sol nos der algo útil, dá para defender o argumento.</w:t>
+        <w:t xml:space="preserve">— Tudo bem — disse ela. — Se o Sol nos der algo útil, dá para defender a tese.</w:t>
       </w:r>
     </w:p>
     <w:p>
@@ -1605,17 +1615,17 @@
         <w:ind w:firstLine="720"/>
       </w:pPr>
       <w:r>
-        <w:t xml:space="preserve">Nunca tinha chegado a uma conclusão. Balançou a cabeça. Seguiu em frente mesmo assim. Sempre seguia em frente mesmo assim. Abriu uma aba no navegador. Depois outra. Não eram feeds de dados. Era algo que fazia antes de o trabalho de verdade começar, do jeito que algumas pessoas checam a previsão do tempo. r/heliophysics. Doze mil membros, a maioria alunos de pós e cientistas de instrumentação, de vez em quando um pesquisador-chefe postando sob pseudônimo. Ela acompanhava o fórum desde o primeiro ano da faculdade. Nunca tinha postado. Só lia. O tópico mais votado tinha a etiqueta Evento Tambora.</w:t>
-      </w:r>
-    </w:p>
-    <w:p>
-      <w:pPr>
-        <w:pStyle w:val="Normal"/>
-        <w:spacing w:line="240" w:lineRule="auto"/>
-        <w:ind w:firstLine="720"/>
-      </w:pPr>
-      <w:r>
-        <w:t xml:space="preserve">Megatópico. Quarenta e sete comentários em três horas. Ela rolou a página. u/avolkov_lebedev (Moscou): Procuro verificações independentes dos mapas mais recentes do limbo. Por favor, incluam instrumento e horário de aquisição, não só a imagem processada. u/liuwei_bao (Pequim): Arquivos de Learmonth baixados. Cópia disponível se o servidor principal continuar dando timeout. u/siobhan_dias (Dublin): Vários serviços discordam sobre o horário do evento. Confiram os timestamps antes de falar em censura. Sophie ficou olhando para o último. Então clicou na estrela. Três posts.</w:t>
+        <w:t xml:space="preserve">Nunca tinha chegado a uma conclusão. Balançou a cabeça. Seguiu em frente mesmo assim. Sempre seguia em frente mesmo assim. Abriu uma aba no navegador. Depois outra. Não eram feeds de dados. Era algo que fazia antes de o trabalho de verdade começar, do jeito que algumas pessoas checam a previsão do tempo. r/heliophysics. Doze mil membros, a maioria alunos de pós-graduação e cientistas de instrumentação, de vez em quando um pesquisador-chefe postando sob pseudônimo. Ela acompanhava o fórum desde o primeiro ano da faculdade. Nunca tinha postado. Só lia. O tópico mais votado tinha a etiqueta Evento Tambora.</w:t>
+      </w:r>
+    </w:p>
+    <w:p>
+      <w:pPr>
+        <w:pStyle w:val="Normal"/>
+        <w:spacing w:line="240" w:lineRule="auto"/>
+        <w:ind w:firstLine="720"/>
+      </w:pPr>
+      <w:r>
+        <w:t xml:space="preserve">Megatópico. Quarenta e sete comentários em três horas. Ela rolou a página. u/avolkov_lebedev (Moscou): Procuro verificações independentes dos mapas mais recentes do limbo. Por favor, incluam instrumento e horário de aquisição, não só a imagem processada. u/liuwei_bao (Pequim): Arquivos de Learmonth baixados. Cópia disponível se o servidor principal continuar fora do ar. u/siobhan_dias (Dublin): Vários serviços discordam sobre o horário do evento. Confiram os horários antes de falar em censura. Sophie ficou olhando para o último. Então clicou na estrela. Três posts.</w:t>
       </w:r>
     </w:p>
     <w:p>

</xml_diff>

<commit_message>
Revise PT-BR vocabulary: replace unusual words and literal idioms
Co-Authored-By: Claude Opus 5.5 <noreply@anthropic.com>
Claude-Session: https://claude.ai/code/session_0174ZwgJ6hzgJCKLC6cWrHSh
</commit_message>
<xml_diff>
--- a/Os_Ultimos_Dias_de_Tudo_PT-BR.docx
+++ b/Os_Ultimos_Dias_de_Tudo_PT-BR.docx
@@ -97,7 +97,7 @@
         <w:ind w:firstLine="720"/>
       </w:pPr>
       <w:r>
-        <w:t xml:space="preserve">Doze anos de talk show noturno tinham ensinado Tom Maya a ler uma plateia nos últimos segundos antes de entrar no ar. Naquela noite, a leitura deu errado, e ele não saberia dizer por quê. A plateia se acomodou na deixa. A banda tocou a vinheta de entrada. Mas o homem que esperava na coxia não tinha guardado o celular, e em doze anos ninguém jamais havia pisado no palco de Tom ainda com um na mão.</w:t>
+        <w:t xml:space="preserve">Doze anos de talk show noturno tinham ensinado Tom Maya a ler uma plateia nos últimos segundos antes de entrar no ar. Naquela noite, a leitura deu errado, e ele não saberia dizer por quê. A plateia se acomodou na hora certa. A banda tocou a vinheta de entrada. Mas o homem que esperava nos bastidores não tinha guardado o celular, e em doze anos ninguém jamais havia pisado no palco de Tom ainda com um na mão.</w:t>
       </w:r>
     </w:p>
     <w:p>
@@ -126,7 +126,7 @@
         <w:ind w:firstLine="720"/>
       </w:pPr>
       <w:r>
-        <w:t xml:space="preserve">Os aplausos foram educados, com algo mais cauteloso por baixo. Richter saiu da coxia. Cinquenta e tantos anos, cabelo grisalho bem curto, o físico de um homem que tinha passado a carreira subindo ladeira. Blazer azul-marinho, suéter cinza, sem gravata. Apertou a mão de Tom, sentou-se e guardou o celular no bolso do paletó, com a tela para baixo.</w:t>
+        <w:t xml:space="preserve">Os aplausos foram educados, com algo mais cauteloso por baixo. Richter saiu dos bastidores. Cinquenta e tantos anos, cabelo grisalho bem curto, o físico de um homem que tinha passado a carreira subindo ladeira. Blazer azul-marinho, suéter cinza, sem gravata. Apertou a mão de Tom, sentou-se e guardou o celular no bolso do paletó, com a tela para baixo.</w:t>
       </w:r>
     </w:p>
     <w:p>
@@ -496,7 +496,7 @@
         <w:ind w:firstLine="720"/>
       </w:pPr>
       <w:r>
-        <w:t xml:space="preserve">— Mas me faz a vontade. — Ele não tinha planejado dizer aquilo. — Se acontecesse. Existe um plano?</w:t>
+        <w:t xml:space="preserve">— Mas vamos imaginar. — Ele não tinha planejado dizer aquilo. — Se acontecesse. Existe um plano?</w:t>
       </w:r>
     </w:p>
     <w:p>
@@ -1115,7 +1115,7 @@
         <w:ind w:firstLine="720"/>
       </w:pPr>
       <w:r>
-        <w:t xml:space="preserve">Sophie tentou sorrir, mas o gesto não vingou e morreu antes de chegar aos olhos.</w:t>
+        <w:t xml:space="preserve">Sophie tentou sorrir, mas o sorriso não se firmou e morreu antes de chegar aos olhos.</w:t>
       </w:r>
     </w:p>
     <w:p>
@@ -1545,7 +1545,7 @@
         <w:ind w:firstLine="720"/>
       </w:pPr>
       <w:r>
-        <w:t xml:space="preserve">O olhar de Sophie voltou para a tela. Regiões do limbo. Assinaturas acústicas. Instabilidade crescente. Confirmação óptica à medida que o Sol girasse. Se funcionasse, não mostraria só que o SOMA era preciso. Mostraria que ele tinha poder de fogo.</w:t>
+        <w:t xml:space="preserve">O olhar de Sophie voltou para a tela. Regiões do limbo. Assinaturas acústicas. Instabilidade crescente. Confirmação óptica à medida que o Sol girasse. Se funcionasse, não mostraria só que o SOMA era preciso. Mostraria que ele tinha força de verdade.</w:t>
       </w:r>
     </w:p>
     <w:p>
@@ -1658,7 +1658,7 @@
         <w:ind w:firstLine="720"/>
       </w:pPr>
       <w:r>
-        <w:t xml:space="preserve">O Brew era aquele tipo de cafeteria universitária que se esforçava para parecer que ninguém tinha decorado nada — o que significava que tinha sido decorada com muito cuidado. Cada superfície parecia estar esperando para virar outra coisa. Os tampos de laminado das mesas tinham aquele brilho gasto específico de dez mil cotovelos e quinhentos lattes derramados. O ar cheirava a expresso queimado, muffin de micro-ondas e ao leve toque químico do que quer que usassem para passar pano no chão nas noites de domingo.</w:t>
+        <w:t xml:space="preserve">O Brew era aquele tipo de cafeteria universitária que se esforçava para parecer que ninguém tinha decorado nada — o que significava que tinha sido decorada com muito cuidado. Cada superfície parecia estar esperando para virar outra coisa. Os tampos de fórmica das mesas tinham aquele brilho gasto específico de dez mil cotovelos e quinhentos lattes derramados. O ar cheirava a expresso queimado, muffin de micro-ondas e ao leve toque químico do que quer que usassem para passar pano no chão nas noites de domingo.</w:t>
       </w:r>
     </w:p>
     <w:p>
@@ -1708,7 +1708,7 @@
         <w:ind w:firstLine="720"/>
       </w:pPr>
       <w:r>
-        <w:t xml:space="preserve">Ethan conhecia aquela cara. Vinha vendo aquilo desde que Victoria terminara com ele. Noah carregava a dor de cotovelo como carregava todo o resto: em silêncio, com teimosia, como um componente que não conseguia diagnosticar nem consertar direito.</w:t>
+        <w:t xml:space="preserve">Ethan conhecia aquela cara. Vinha vendo aquilo desde que Victoria terminara com ele. Noah carregava o coração partido como carregava todo o resto: em silêncio, com teimosia, como um componente que não conseguia diagnosticar nem consertar direito.</w:t>
       </w:r>
     </w:p>
     <w:p>
@@ -1728,7 +1728,7 @@
         <w:ind w:firstLine="720"/>
       </w:pPr>
       <w:r>
-        <w:t xml:space="preserve">Nenhuma predefinição captava a profundidade daquela cor.</w:t>
+        <w:t xml:space="preserve">Nenhum filtro captava a profundidade daquela cor.</w:t>
       </w:r>
     </w:p>
     <w:p>
@@ -1868,7 +1868,7 @@
         <w:ind w:firstLine="720"/>
       </w:pPr>
       <w:r>
-        <w:t xml:space="preserve">Ethan olhou por cima do ombro dele, para a janela. Lá fora, mais gente tinha parado na calçada, celulares erguidos. Um skatista passava a câmera pelo horizonte em arcos lentos e reverentes. A luz que atravessava o vidro chegava âmbar e ligeiramente errada, estendendo-se sobre os tampos de laminado numa cor que não pertencia a uma manhã de Tampa: densa demais, dourada demais, como se estivesse sendo filtrada por algo que não deveria estar ali.</w:t>
+        <w:t xml:space="preserve">Ethan olhou por cima do ombro dele, para a janela. Lá fora, mais gente tinha parado na calçada, celulares erguidos. Um skatista passava a câmera pelo horizonte em arcos lentos e reverentes. A luz que atravessava o vidro chegava âmbar e ligeiramente errada, estendendo-se sobre os tampos de fórmica numa cor que não pertencia a uma manhã de Tampa: densa demais, dourada demais, como se estivesse sendo filtrada por algo que não deveria estar ali.</w:t>
       </w:r>
     </w:p>
     <w:p>
@@ -4147,7 +4147,7 @@
         <w:ind w:firstLine="720"/>
       </w:pPr>
       <w:r>
-        <w:t xml:space="preserve">Os olhos dele desceram pelas barbelas. Ela viu a expressão dele mudar — não alarme, ainda não, mas a quietude específica de uma mente treinada reconhecendo um padrão que não deveria existir, como um cachorro que congela quando sente no mato um cheiro que não é de mato.</w:t>
+        <w:t xml:space="preserve">Os olhos dele desceram pelos símbolos de vento. Ela viu a expressão dele mudar — não alarme, ainda não, mas a quietude específica de uma mente treinada reconhecendo um padrão que não deveria existir, como um cachorro que congela quando sente no mato um cheiro que não é de mato.</w:t>
       </w:r>
     </w:p>
     <w:p>
@@ -5103,7 +5103,7 @@
         <w:ind w:firstLine="720"/>
       </w:pPr>
       <w:r>
-        <w:t xml:space="preserve">Tinha se apaixonado pelo Sol no primeiro ano de faculdade. Amor à primeira vista, ou perto o bastante para que a diferença não importasse. Enfiara-se na biblioteca, entre estantes e revistas de física de páginas dobradas, vivendo de café de máquina e quatro horas de sono, devorando tudo o que encontrava sobre dínamos magnéticos e arcos coronais.</w:t>
+        <w:t xml:space="preserve">Tinha se apaixonado pelo Sol no primeiro ano de faculdade. Amor à primeira vista, ou perto o bastante para que a diferença não importasse. Mergulhara na biblioteca, entre estantes e revistas de física de páginas dobradas, vivendo de café de máquina e quatro horas de sono, devorando tudo o que encontrava sobre dínamos magnéticos e arcos coronais.</w:t>
       </w:r>
     </w:p>
     <w:p>
@@ -5336,7 +5336,7 @@
         <w:ind w:firstLine="720"/>
       </w:pPr>
       <w:r>
-        <w:t xml:space="preserve">Em vez disso, abriu as sobras diárias da NOAA: as leituras marginais anotadas por analistas cansados com observações cautelosas como </w:t>
+        <w:t xml:space="preserve">Em vez disso, abriu as listas diárias da NOAA: as leituras marginais anotadas por analistas cansados com observações cautelosas como </w:t>
       </w:r>
       <w:r>
         <w:rPr>
@@ -6688,7 +6688,7 @@
         <w:ind w:firstLine="720"/>
       </w:pPr>
       <w:r>
-        <w:t xml:space="preserve">Ethan mal registrou nada daquilo. Jogou a mochila no ombro e foi para a porta. O tom no ouvido continuava lá, constante agora, baixo o bastante para ele ter deixado de esperar que fosse embora. Na saída, passou pelas janelas do lado sul. A névoa âmbar não tinha se dissipado. Tinha se adensado, aprofundado, e o anel de cobre em volta do sol continuava lá, como algo que pertencia a uma ilustração de livro didático, e não ao céu de verdade sobre Tampa.</w:t>
+        <w:t xml:space="preserve">Ethan mal registrou tudo aquilo. Jogou a mochila no ombro e foi para a porta. O tom no ouvido continuava lá, constante agora, baixo o bastante para ele ter deixado de esperar que fosse embora. Na saída, passou pelas janelas do lado sul. A névoa âmbar não tinha se dissipado. Tinha se adensado, aprofundado, e o anel de cobre em volta do sol continuava lá, como algo que pertencia a uma ilustração de livro didático, e não ao céu de verdade sobre Tampa.</w:t>
       </w:r>
     </w:p>
     <w:p>
@@ -7543,7 +7543,7 @@
         <w:ind w:firstLine="720"/>
       </w:pPr>
       <w:r>
-        <w:t xml:space="preserve">Um segundo relé desarmou às 12h17. Brandon. Um terceiro às 12h19, em South Tampa. Angela ia lendo em voz alta as leituras à medida que chegavam. Correntes de neutro altas. Demanda reativa subindo. Suporte de tensão desaparecendo em várias subestações. O alarme mudou. Não era mais o aviso de tom único, e sim a sirene dura, de duas notas, que significava que a rede tinha passado de sobrecarregada para perigosa. A que transformava uma sala de controle em outro tipo de sala. O mapa regional se acendeu em vermelho.</w:t>
+        <w:t xml:space="preserve">Um segundo relé desarmou às 12h17. Brandon. Um terceiro às 12h19, em South Tampa. Angela ia dizendo em voz alta as leituras à medida que chegavam. Correntes de neutro altas. Demanda reativa subindo. Suporte de tensão desaparecendo em várias subestações. O alarme mudou. Não era mais o aviso de tom único, e sim a sirene dura, de duas notas, que significava que a rede tinha passado de sobrecarregada para perigosa. A que transformava uma sala de controle em outro tipo de sala. O mapa regional se acendeu em vermelho.</w:t>
       </w:r>
     </w:p>
     <w:p>
@@ -7763,7 +7763,7 @@
         <w:ind w:firstLine="720"/>
       </w:pPr>
       <w:r>
-        <w:t xml:space="preserve">Onze anos de turnos compartilhados, café compartilhado, silêncio compartilhado. Dave ergueu os olhos para ela. Nenhum dos dois jamais tinha precisado deixar o mapa daquele jeito para manter vivo o resto.</w:t>
+        <w:t xml:space="preserve">Onze anos de turnos compartilhados, café compartilhado, silêncio compartilhado. Dave ergueu os olhos para ela. Nenhum dos dois jamais tinha precisado apagar partes do mapa daquele jeito para manter vivo o resto.</w:t>
       </w:r>
     </w:p>
     <w:p>
@@ -9972,7 +9972,7 @@
         <w:ind w:firstLine="720"/>
       </w:pPr>
       <w:r>
-        <w:t xml:space="preserve">— Olha em volta. Lá fora não está exatamente um passeio no parque.</w:t>
+        <w:t xml:space="preserve">— Olha em volta. Lá fora não está exatamente uma moleza.</w:t>
       </w:r>
     </w:p>
     <w:p>
@@ -10022,7 +10022,7 @@
         <w:ind w:firstLine="720"/>
       </w:pPr>
       <w:r>
-        <w:t xml:space="preserve">E, sob a chuva, o frio. E, montado no frio, o vento.</w:t>
+        <w:t xml:space="preserve">E, sob a chuva, o frio. E, junto com o frio, o vento.</w:t>
       </w:r>
     </w:p>
     <w:p>
@@ -11804,7 +11804,7 @@
         <w:ind w:firstLine="720"/>
       </w:pPr>
       <w:r>
-        <w:t xml:space="preserve">Sophie tirou a camisa e a calça molhadas, se secou depressa e vestiu roupas secas. Do fundo do armário, puxou o moletom verde-escuro que tinha ganhado num congresso de física em Denver. Era um brinde pesado de congresso, quente demais para a Flórida, e tinha passado a maior parte do ano enterrado atrás das roupas que ela de fato usava. Naquela tarde, o fleece grosso levou vários segundos para parar de parecer frio contra a pele.</w:t>
+        <w:t xml:space="preserve">Sophie tirou a camisa e a calça molhadas, se secou depressa e vestiu roupas secas. Do fundo do armário, puxou o moletom verde-escuro que tinha ganhado num congresso de física em Denver. Era um brinde pesado de congresso, quente demais para a Flórida, e tinha passado a maior parte do ano enterrado atrás das roupas que ela de fato usava. Naquela tarde, o tecido grosso levou vários segundos para parar de parecer frio contra a pele.</w:t>
       </w:r>
     </w:p>
     <w:p>
@@ -12912,7 +12912,7 @@
         <w:ind w:firstLine="720"/>
       </w:pPr>
       <w:r>
-        <w:t xml:space="preserve">Noah pressionou o último pedaço de fita sobre a extensão ao longo da parede do salão paroquial e passou o polegar pela borda. Fora do caminho. Bom o bastante. Uma corrente de ar entrou pela porta escorada, fria o suficiente para ser notada, e sumiu antes que ele conseguisse identificá-la. As mãos ainda guardavam o cheiro do quadro de disjuntores — cobre quente e algo chamuscado por baixo que não tinha saído na lavagem desde que ele rastreara o arco atrás dos contatos derretidos e desligara o quadro antes que piorasse. Um circuito. Era isso que ele tinha conseguido salvar em quase uma hora, com o que quer que a paróquia tivesse por ali. As luminárias portáteis funcionavam com ele agora. Todo o resto do quadro estava morto atrás de uma faixa de fita de advertência, com uma cadeira dobrável encaixada na frente para impedir que as caixas empilhadas chegassem perto demais. Metade do condado estava no escuro. A St. Luke tinha corrente suficiente para iluminar um cômodo.</w:t>
+        <w:t xml:space="preserve">Noah pressionou o último pedaço de fita sobre a extensão ao longo da parede do salão paroquial e passou o polegar pela borda. Fora do caminho. Bom o bastante. Uma corrente de ar entrou pela porta escorada, fria o suficiente para ser notada, e sumiu antes que ele conseguisse identificá-la. As mãos ainda guardavam o cheiro do quadro de disjuntores — cobre quente e algo chamuscado por baixo que não tinha saído na lavagem desde que ele localizara o arco elétrico atrás dos contatos derretidos e desligara o quadro antes que piorasse. Um circuito. Era isso que ele tinha conseguido salvar em quase uma hora, com o que quer que a paróquia tivesse por ali. As luminárias portáteis funcionavam com ele agora. Todo o resto do quadro estava morto atrás de uma faixa de fita de advertência, com uma cadeira dobrável encaixada na frente para impedir que as caixas empilhadas chegassem perto demais. Metade do condado estava no escuro. A St. Luke tinha corrente suficiente para iluminar um cômodo.</w:t>
       </w:r>
     </w:p>
     <w:p>
@@ -13405,7 +13405,7 @@
         <w:ind w:firstLine="720"/>
       </w:pPr>
       <w:r>
-        <w:t xml:space="preserve">O rescaldo normal de uma tempestade. O tipo de cena que ela tinha documentado depois de cem linhas de instabilidade. A não ser pelo frio. Num sinal de pare, ela encostou a palma da mão no vidro do passageiro e a manteve ali. O vidro estava frio. Não fresco. Frio, no meio de uma tarde de maio, sob um céu que tinha ficado violeta nas bordas e acobreado no centro, uma luz que nenhum filtro de câmera jamais produzira. Ela entrou no Bloomingdale Residence Complex.</w:t>
+        <w:t xml:space="preserve">O saldo normal de uma tempestade. O tipo de cena que ela tinha documentado depois de cem linhas de instabilidade. A não ser pelo frio. Num sinal de pare, ela encostou a palma da mão no vidro do passageiro e a manteve ali. O vidro estava frio. Não fresco. Frio, no meio de uma tarde de maio, sob um céu que tinha ficado violeta nas bordas e acobreado no centro, uma luz que nenhum filtro de câmera jamais produzira. Ela entrou no Bloomingdale Residence Complex.</w:t>
       </w:r>
     </w:p>
     <w:p>
@@ -13655,7 +13655,7 @@
         <w:ind w:firstLine="720"/>
       </w:pPr>
       <w:r>
-        <w:t xml:space="preserve">Melissa assentiu, e então Kate ergueu levemente o queixo. Lá estava de novo. Tênue, entrando do pátio pelas frestas da porta. Plástico queimado e metal quente, o cheiro de fiação que tinha desistido. Ela o sentira no portão, onde a carcaça da caixa de controle estava enegrecida na junta, e dissera a si mesma que era só o portão. Parada no aconchego da porta de Melissa, com os braços do filho ainda frouxos em volta da cintura, entendeu que não era só o portão.</w:t>
+        <w:t xml:space="preserve">Melissa assentiu, e então Kate ergueu levemente o queixo. Lá estava de novo. Tênue, entrando do pátio pelas frestas da porta. Plástico queimado e metal quente, o cheiro de fiação que tinha desistido. Ela o sentira no portão, onde a carcaça da caixa de controle estava enegrecida na junta, e dissera a si mesma que era só o portão. Parada na porta aconchegante de Melissa, com os braços do filho ainda frouxos em volta da cintura, entendeu que não era só o portão.</w:t>
       </w:r>
     </w:p>
     <w:p>
@@ -13938,7 +13938,7 @@
         <w:ind w:firstLine="720"/>
       </w:pPr>
       <w:r>
-        <w:t xml:space="preserve">A fechadura chacoalhou. Noah entrou com a bolsa de lona de ferramentas num ombro e o frio na flanela, e fechou a porta com o quadril.</w:t>
+        <w:t xml:space="preserve">A fechadura chacoalhou. Noah entrou com a bolsa de lona de ferramentas num ombro e o frio preso na flanela, e fechou a porta com o quadril.</w:t>
       </w:r>
     </w:p>
     <w:p>
@@ -14198,7 +14198,7 @@
         <w:ind w:firstLine="720"/>
       </w:pPr>
       <w:r>
-        <w:t xml:space="preserve">A sala explodiu. Blaine já estava indo embora, Reese um passo atrás, os olhos no chão.</w:t>
+        <w:t xml:space="preserve">A sala explodiu em perguntas. Blaine já estava indo embora, Reese um passo atrás, os olhos no chão.</w:t>
       </w:r>
     </w:p>
     <w:p>
@@ -14637,7 +14637,7 @@
         <w:ind w:firstLine="720"/>
       </w:pPr>
       <w:r>
-        <w:t xml:space="preserve">— Porque é para a Cole Energy que eles ligam. — Ethan disse aquilo sem emoção, como quem recita uma frase de um folheto que odeia. — Contratos de preparação da rede. Peças de reserva de emergência. Metade dos simulados que a FEMA faz no Sudeste, o pessoal do meu pai ajuda a escrever. Se Washington acha que a rede está prestes a quebrar, ele está na lista curta dos homens que eles querem prontos para montá-la de novo.</w:t>
+        <w:t xml:space="preserve">— Porque é para a Cole Energy que eles ligam. — Ethan disse aquilo sem emoção, como quem recita uma frase de um folheto que odeia. — Contratos de preparação da rede. Peças de reserva de emergência. Metade dos simulados que a FEMA faz no Sudeste, o pessoal do meu pai ajuda a escrever. Se Washington acha que a rede está prestes a quebrar, ele está entre os poucos homens que eles querem prontos para montá-la de novo.</w:t>
       </w:r>
     </w:p>
     <w:p>
@@ -14900,7 +14900,7 @@
         <w:ind w:firstLine="720"/>
       </w:pPr>
       <w:r>
-        <w:t xml:space="preserve">Por baixo das piscadas, por baixo da TV murmurando seu loop baixo e nervoso, havia a outra coisa. O silêncio lá fora. Uma noite de maio em Tampa deveria zumbir: aparelhos de ar-condicionado gemendo, insetos serrando, a respiração mecânica e constante de uma cidade que nunca esfriava de verdade. Naquela noite, não havia nada. Nenhum ronco de compressor. Nenhum barulho de bicho nas cercas vivas. Só um silêncio tão completo que parecia acolchoado, como se o mundo tivesse sido embrulhado em espuma. O notebook dela estava aberto, na bateria. O Wi-Fi de Melissa ia e vinha com o abajur. Cada vez que o roteador reiniciava, as páginas abertas congelavam nos cabeçalhos, e o apartamento dela lá em cima tinha perdido a conexão horas antes.</w:t>
+        <w:t xml:space="preserve">Por baixo das piscadas, por baixo da TV murmurando seu loop baixo e nervoso, havia a outra coisa. O silêncio lá fora. Uma noite de maio em Tampa deveria zumbir: aparelhos de ar-condicionado gemendo, insetos cantando, a respiração mecânica e constante de uma cidade que nunca esfriava de verdade. Naquela noite, não havia nada. Nenhum ronco de compressor. Nenhum barulho de bicho nas cercas vivas. Só um silêncio tão completo que parecia acolchoado, como se o mundo tivesse sido embrulhado em espuma. O notebook dela estava aberto, na bateria. O Wi-Fi de Melissa ia e vinha com o abajur. Cada vez que o roteador reiniciava, as páginas abertas congelavam nos cabeçalhos, e o apartamento dela lá em cima tinha perdido a conexão horas antes.</w:t>
       </w:r>
     </w:p>
     <w:p>
@@ -15235,7 +15235,7 @@
         <w:rPr>
           <w:i/>
         </w:rPr>
-        <w:t xml:space="preserve">Marcus: Boa notícia. O Marty conseguiu pôr um gerador alugado no Estúdio B. Uma câmera, um switcher, sem gráficos. O Hargrave disse que o jornal das 5h vai ao ar nem que a gente tenha que iluminar com lanterna.</w:t>
+        <w:t xml:space="preserve">Marcus: Boa notícia. O Marty conseguiu pôr um gerador alugado no Estúdio B. Uma câmera, uma mesa de corte, sem gráficos. O Hargrave disse que o jornal das 5h vai ao ar nem que a gente tenha que iluminar com lanterna.</w:t>
       </w:r>
     </w:p>
     <w:p>
@@ -15403,7 +15403,7 @@
         <w:rPr>
           <w:i/>
         </w:rPr>
-        <w:t xml:space="preserve">Kate: Talvez. Só um palpite. Me faz a vontade.</w:t>
+        <w:t xml:space="preserve">Kate: Talvez. Só um palpite. Faz isso por mim.</w:t>
       </w:r>
     </w:p>
     <w:p>
@@ -16504,7 +16504,7 @@
         <w:ind w:firstLine="720"/>
       </w:pPr>
       <w:r>
-        <w:t xml:space="preserve">Ela tinha voado através de cinzas vulcânicas uma vez, perto de Anchorage. Aquilo não era cinza. Mas era parente.</w:t>
+        <w:t xml:space="preserve">Ela tinha voado através de cinzas vulcânicas uma vez, perto de Anchorage. Aquilo não era cinza. Mas era algo parecido.</w:t>
       </w:r>
     </w:p>
     <w:p>
@@ -17260,7 +17260,7 @@
         <w:ind w:firstLine="720"/>
       </w:pPr>
       <w:r>
-        <w:t xml:space="preserve">Marshall já estava se movendo. Ela já estava fazendo. Manetes à frente até o batente — os motores começaram sua aceleração lenta e enorme, o som subindo pelo piso de um murmúrio para algo que enchia a cabine —, nariz para cima a quinze graus, flapes recolhidos para a posição de subida. O avião estava pesado. Relutante. Puxava-se para cima com o momento paciente de algo que pesava sessenta e três toneladas e não estava particularmente preocupado com a urgência de ninguém.</w:t>
+        <w:t xml:space="preserve">Marshall já estava se movendo. Ela já estava fazendo. Manetes à frente até o batente — os motores começaram sua aceleração lenta e enorme, o som subindo pelo piso de um murmúrio para algo que enchia a cabine —, nariz para cima a quinze graus, flapes recolhidos para a posição de subida. O avião estava pesado. Relutante. Puxava-se para cima com a inércia paciente de algo que pesava sessenta e três toneladas e não estava particularmente preocupado com a urgência de ninguém.</w:t>
       </w:r>
     </w:p>
     <w:p>
@@ -17795,7 +17795,7 @@
         <w:ind w:firstLine="720"/>
       </w:pPr>
       <w:r>
-        <w:t xml:space="preserve">— Tom, não entendo. Eu vetorei ele certinho. — A voz de Jake tinha ficado fina. — Os ponteiros dele estavam centralizados. Ele estava bem em cima da linha. Na minha tela, ele estava bem em cima da linha.</w:t>
+        <w:t xml:space="preserve">— Tom, não entendo. Eu guiei ele certinho. — A voz de Jake tinha ficado fina. — Os ponteiros dele estavam centralizados. Ele estava bem em cima da linha. Na minha tela, ele estava bem em cima da linha.</w:t>
       </w:r>
     </w:p>
     <w:p>
@@ -18982,7 +18982,7 @@
         <w:ind w:firstLine="720"/>
       </w:pPr>
       <w:r>
-        <w:t xml:space="preserve">Na mesa de centro estava o que sobrara do jantar: arroz frio num pote de plástico, meio frango de padaria de dois dias antes, um saco de minicenouras, o que quer que a geladeira tivesse a oferecer. A pizza nunca aconteceu. Todos os aplicativos de entrega mostravam a mesma faixa cinza desde a tarde, e ninguém quis rodar por uma cidade escura procurando um forno aberto. Ninguém tinha tocado muito no resto também.</w:t>
+        <w:t xml:space="preserve">Na mesa de centro estava o que sobrara do jantar: arroz frio num pote de plástico, meio frango de padaria de dois dias antes, um saco de minicenouras, o que quer que a geladeira tivesse a oferecer. A pizza acabou não vindo. Todos os aplicativos de entrega mostravam a mesma faixa cinza desde a tarde, e ninguém quis rodar por uma cidade escura procurando um forno aberto. Ninguém tinha tocado muito no resto também.</w:t>
       </w:r>
     </w:p>
     <w:p>
@@ -20011,7 +20011,7 @@
         <w:ind w:firstLine="720"/>
       </w:pPr>
       <w:r>
-        <w:t xml:space="preserve">Plaft. Plaft. Plaft. Noah trabalhava a parede em fileiras, rápido, os blocos soltando as folhas com um rasguinho seco. Sophie lia do outro notebook quando Ethan parava para respirar. Em cinco minutos, tudo o que a TV tinha mostrado estava de volta, um quadradinho de papel de cada vez, e os números novos começaram a ir direto para a parede.</w:t>
+        <w:t xml:space="preserve">Plaft. Plaft. Plaft. Noah ia cobrindo a parede em fileiras, rápido, os blocos soltando as folhas com um rasguinho seco. Sophie lia do outro notebook quando Ethan parava para respirar. Em cinco minutos, tudo o que a TV tinha mostrado estava de volta, um quadradinho de papel de cada vez, e os números novos começaram a ir direto para a parede.</w:t>
       </w:r>
     </w:p>
     <w:p>
@@ -20281,7 +20281,7 @@
         <w:ind w:firstLine="720"/>
       </w:pPr>
       <w:r>
-        <w:t xml:space="preserve">Noah teve de limpar a garganta.</w:t>
+        <w:t xml:space="preserve">Noah teve de pigarrear.</w:t>
       </w:r>
     </w:p>
     <w:p>
@@ -20344,7 +20344,7 @@
         <w:ind w:firstLine="720"/>
       </w:pPr>
       <w:r>
-        <w:t xml:space="preserve">CNN SPECIAL COVERAGE, dizia o grafismo atrás de Dana Whitfield, em letras vermelhas mais altas do que ela, e pela primeira vez em seus dezenove anos na emissora as letras estavam piscando.</w:t>
+        <w:t xml:space="preserve">CNN SPECIAL COVERAGE, dizia o letreiro atrás de Dana Whitfield, em letras vermelhas mais altas do que ela, e pela primeira vez em seus dezenove anos na emissora as letras estavam piscando.</w:t>
       </w:r>
     </w:p>
     <w:p>
@@ -20978,17 +20978,17 @@
         <w:ind w:firstLine="720"/>
       </w:pPr>
       <w:r>
-        <w:t xml:space="preserve">— Ótimo. Deixa respirar.</w:t>
-      </w:r>
-    </w:p>
-    <w:p>
-      <w:pPr>
-        <w:pStyle w:val="Normal"/>
-        <w:spacing w:line="240" w:lineRule="auto"/>
-        <w:ind w:firstLine="720"/>
-      </w:pPr>
-      <w:r>
-        <w:t xml:space="preserve">Ela deixou respirar exatamente dois segundos. On-line, ela sabia, a discussão já tinha acontecido dez mil vezes desde o pôr do sol: hackers chineses, hackers russos, o vulcão, o governo mentindo sobre o vulcão, o governo mentindo sobre tudo. Nenhuma daquelas pessoas tinha visto o campo em Kansas City.</w:t>
+        <w:t xml:space="preserve">— Ótimo. Dá um tempo para isso assentar.</w:t>
+      </w:r>
+    </w:p>
+    <w:p>
+      <w:pPr>
+        <w:pStyle w:val="Normal"/>
+        <w:spacing w:line="240" w:lineRule="auto"/>
+        <w:ind w:firstLine="720"/>
+      </w:pPr>
+      <w:r>
+        <w:t xml:space="preserve">Ela deu exatamente dois segundos. On-line, ela sabia, a discussão já tinha acontecido dez mil vezes desde o pôr do sol: hackers chineses, hackers russos, o vulcão, o governo mentindo sobre o vulcão, o governo mentindo sobre tudo. Nenhuma daquelas pessoas tinha visto o campo em Kansas City.</w:t>
       </w:r>
     </w:p>
     <w:p>
@@ -21431,7 +21431,7 @@
         <w:ind w:firstLine="720"/>
       </w:pPr>
       <w:r>
-        <w:t xml:space="preserve">A cadeira da sala de Melissa não tinha sido feita para quem precisava passar horas sentado. Kate sabia disso desde as oito, quando a puxara para junto da janela norte e se acomodara, o caderno quente no colo, o celular frio na mão e a certeza no fundo do estômago de que as próximas horas lhe diriam se ela estava certa ou se sua mente finalmente tinha perdido as amarras. Mais de duas horas depois, a cadeira não tinha melhorado.</w:t>
+        <w:t xml:space="preserve">A cadeira da sala de Melissa não tinha sido feita para quem precisava passar horas sentado. Kate sabia disso desde as oito, quando a puxara para junto da janela norte e se acomodara, o caderno quente no colo, o celular frio na mão e a certeza no fundo do estômago de que as próximas horas lhe diriam se ela estava certa ou se finalmente tinha perdido o juízo. Mais de duas horas depois, a cadeira não tinha melhorado.</w:t>
       </w:r>
     </w:p>
     <w:p>
@@ -22142,7 +22142,7 @@
         <w:ind w:firstLine="720"/>
       </w:pPr>
       <w:r>
-        <w:t xml:space="preserve">A sala guardou o abajur, o aquecedor estalando, o rádio lendo nomes.</w:t>
+        <w:t xml:space="preserve">Na sala ficaram o abajur, o aquecedor estalando, o rádio lendo nomes.</w:t>
       </w:r>
     </w:p>
     <w:p>
@@ -22879,7 +22879,7 @@
         <w:rPr>
           <w:i/>
         </w:rPr>
-        <w:t xml:space="preserve">Tambora + tempestade solar é fanfic de fim do mundo. Vai pegar um ar.</w:t>
+        <w:t xml:space="preserve">Tambora + tempestade solar é fanfic de fim do mundo. Vai tomar um ar.</w:t>
       </w:r>
     </w:p>
     <w:p>

</xml_diff>